<commit_message>
Added analyses around individual sites
</commit_message>
<xml_diff>
--- a/Annual Report Manuscript Outline.docx
+++ b/Annual Report Manuscript Outline.docx
@@ -253,6 +253,174 @@
       <w:pPr>
         <w:pStyle w:val="ListParagraph"/>
         <w:numPr>
+          <w:ilvl w:val="1"/>
+          <w:numId w:val="6"/>
+        </w:numPr>
+      </w:pPr>
+      <w:r>
+        <w:t>LME</w:t>
+      </w:r>
+      <w:r>
+        <w:t>:</w:t>
+      </w:r>
+      <w:r>
+        <w:t xml:space="preserve"> </w:t>
+      </w:r>
+      <w:r>
+        <w:t>r</w:t>
+      </w:r>
+      <w:r>
+        <w:t>etention</w:t>
+      </w:r>
+      <w:r>
+        <w:t xml:space="preserve"> ~ site + month + </w:t>
+      </w:r>
+      <w:r>
+        <w:t>concentration + volume</w:t>
+      </w:r>
+    </w:p>
+    <w:p>
+      <w:pPr>
+        <w:pStyle w:val="ListParagraph"/>
+        <w:numPr>
+          <w:ilvl w:val="2"/>
+          <w:numId w:val="6"/>
+        </w:numPr>
+        <w:rPr>
+          <w:highlight w:val="yellow"/>
+        </w:rPr>
+      </w:pPr>
+      <w:r>
+        <w:rPr>
+          <w:highlight w:val="yellow"/>
+        </w:rPr>
+        <w:t>LOO analysis</w:t>
+      </w:r>
+    </w:p>
+    <w:p>
+      <w:pPr>
+        <w:pStyle w:val="ListParagraph"/>
+        <w:numPr>
+          <w:ilvl w:val="3"/>
+          <w:numId w:val="6"/>
+        </w:numPr>
+        <w:rPr>
+          <w:highlight w:val="yellow"/>
+        </w:rPr>
+      </w:pPr>
+      <w:r>
+        <w:rPr>
+          <w:highlight w:val="yellow"/>
+        </w:rPr>
+        <w:t xml:space="preserve">Is a single site driving this pattern? Is this pattern usable for data not within the </w:t>
+      </w:r>
+      <w:r>
+        <w:rPr>
+          <w:highlight w:val="yellow"/>
+        </w:rPr>
+        <w:t>dataset?</w:t>
+      </w:r>
+    </w:p>
+    <w:p>
+      <w:pPr>
+        <w:pStyle w:val="ListParagraph"/>
+        <w:numPr>
+          <w:ilvl w:val="2"/>
+          <w:numId w:val="6"/>
+        </w:numPr>
+        <w:rPr>
+          <w:highlight w:val="yellow"/>
+        </w:rPr>
+      </w:pPr>
+      <w:r>
+        <w:rPr>
+          <w:highlight w:val="yellow"/>
+        </w:rPr>
+        <w:t xml:space="preserve">Site specific analysis </w:t>
+      </w:r>
+    </w:p>
+    <w:p>
+      <w:pPr>
+        <w:pStyle w:val="ListParagraph"/>
+        <w:numPr>
+          <w:ilvl w:val="3"/>
+          <w:numId w:val="6"/>
+        </w:numPr>
+        <w:rPr>
+          <w:highlight w:val="yellow"/>
+        </w:rPr>
+      </w:pPr>
+      <w:r>
+        <w:rPr>
+          <w:highlight w:val="yellow"/>
+        </w:rPr>
+        <w:t xml:space="preserve">Are different variables important </w:t>
+      </w:r>
+      <w:r>
+        <w:rPr>
+          <w:highlight w:val="yellow"/>
+        </w:rPr>
+        <w:t xml:space="preserve">for within site data, as compared to between site data? </w:t>
+      </w:r>
+    </w:p>
+    <w:p>
+      <w:pPr>
+        <w:pStyle w:val="ListParagraph"/>
+        <w:numPr>
+          <w:ilvl w:val="3"/>
+          <w:numId w:val="6"/>
+        </w:numPr>
+        <w:rPr>
+          <w:highlight w:val="yellow"/>
+        </w:rPr>
+      </w:pPr>
+      <w:r>
+        <w:rPr>
+          <w:highlight w:val="yellow"/>
+        </w:rPr>
+        <w:t xml:space="preserve">Run a model of EACH site to compare </w:t>
+      </w:r>
+      <w:r>
+        <w:rPr>
+          <w:highlight w:val="yellow"/>
+        </w:rPr>
+        <w:t>what variables</w:t>
+      </w:r>
+      <w:r>
+        <w:rPr>
+          <w:highlight w:val="yellow"/>
+        </w:rPr>
+        <w:t xml:space="preserve"> (volume, concentration, month)</w:t>
+      </w:r>
+      <w:r>
+        <w:rPr>
+          <w:highlight w:val="yellow"/>
+        </w:rPr>
+        <w:t xml:space="preserve"> are most important.</w:t>
+      </w:r>
+    </w:p>
+    <w:p>
+      <w:pPr>
+        <w:pStyle w:val="ListParagraph"/>
+        <w:numPr>
+          <w:ilvl w:val="3"/>
+          <w:numId w:val="6"/>
+        </w:numPr>
+        <w:rPr>
+          <w:highlight w:val="yellow"/>
+        </w:rPr>
+      </w:pPr>
+      <w:r>
+        <w:rPr>
+          <w:highlight w:val="yellow"/>
+        </w:rPr>
+        <w:t>FIND OUT A WAY TO MAKE A FIGURE OF THIS</w:t>
+      </w:r>
+    </w:p>
+    <w:p>
+      <w:pPr>
+        <w:pStyle w:val="ListParagraph"/>
+        <w:numPr>
           <w:ilvl w:val="0"/>
           <w:numId w:val="6"/>
         </w:numPr>
@@ -265,6 +433,18 @@
       <w:pPr>
         <w:pStyle w:val="ListParagraph"/>
         <w:numPr>
+          <w:ilvl w:val="1"/>
+          <w:numId w:val="6"/>
+        </w:numPr>
+      </w:pPr>
+      <w:r>
+        <w:t xml:space="preserve">What other variables matter? Specifically variables we don’t have data for on the monthly time scale. </w:t>
+      </w:r>
+    </w:p>
+    <w:p>
+      <w:pPr>
+        <w:pStyle w:val="ListParagraph"/>
+        <w:numPr>
           <w:ilvl w:val="0"/>
           <w:numId w:val="6"/>
         </w:numPr>
@@ -306,6 +486,7 @@
         </w:numPr>
       </w:pPr>
       <w:r>
+        <w:lastRenderedPageBreak/>
         <w:t xml:space="preserve">How different are </w:t>
       </w:r>
       <w:r>
@@ -327,25 +508,23 @@
         </w:numPr>
       </w:pPr>
       <w:r>
-        <w:t xml:space="preserve">Concentration </w:t>
-      </w:r>
-      <w:proofErr w:type="spellStart"/>
-      <w:r>
-        <w:t>affects</w:t>
-      </w:r>
-      <w:proofErr w:type="spellEnd"/>
-      <w:r>
-        <w:t xml:space="preserve"> on nutrient retention</w:t>
-      </w:r>
-    </w:p>
-    <w:p>
-      <w:pPr>
-        <w:pStyle w:val="ListParagraph"/>
-        <w:numPr>
-          <w:ilvl w:val="0"/>
+        <w:t>Concentration affects on nutrient retention</w:t>
+      </w:r>
+    </w:p>
+    <w:p>
+      <w:pPr>
+        <w:pStyle w:val="ListParagraph"/>
+        <w:numPr>
+          <w:ilvl w:val="1"/>
           <w:numId w:val="6"/>
         </w:numPr>
       </w:pPr>
+      <w:r>
+        <w:t xml:space="preserve">Iterative models for each site </w:t>
+      </w:r>
+      <w:r>
+        <w:t>ALONE comparing concentration vs. volume on retention</w:t>
+      </w:r>
     </w:p>
     <w:p>
       <w:r>
@@ -422,6 +601,18 @@
       <w:pPr>
         <w:pStyle w:val="ListParagraph"/>
         <w:numPr>
+          <w:ilvl w:val="1"/>
+          <w:numId w:val="4"/>
+        </w:numPr>
+      </w:pPr>
+      <w:r>
+        <w:t>Maybe do a PCA to try and get at this? See if there’s any clustering with the available data?</w:t>
+      </w:r>
+    </w:p>
+    <w:p>
+      <w:pPr>
+        <w:pStyle w:val="ListParagraph"/>
+        <w:numPr>
           <w:ilvl w:val="0"/>
           <w:numId w:val="4"/>
         </w:numPr>
@@ -448,7 +639,6 @@
     <w:p/>
     <w:p>
       <w:r>
-        <w:lastRenderedPageBreak/>
         <w:t xml:space="preserve">Tables: </w:t>
       </w:r>
     </w:p>
@@ -740,318 +930,296 @@
         </w:rPr>
         <w:t>Site Description</w:t>
       </w:r>
-    </w:p>
-    <w:p>
-      <w:r>
-        <w:tab/>
-        <w:t xml:space="preserve">We analyzed data from 24 wetland projects built by the H2Ohio </w:t>
-      </w:r>
-      <w:r>
-        <w:t>Initiativ</w:t>
-      </w:r>
-      <w:r>
-        <w:t xml:space="preserve">e: a water quality program administered by the Ohio Department of Natural Resources </w:t>
-      </w:r>
-      <w:r>
-        <w:t>that has to date created 498 wetland projects throughout the state of Ohio</w:t>
-      </w:r>
-      <w:r>
-        <w:t xml:space="preserve">, with many of those projects focused </w:t>
-      </w:r>
-      <w:r>
-        <w:t>on</w:t>
-      </w:r>
-      <w:r>
-        <w:t xml:space="preserve"> the Maumee River Drainage Basin</w:t>
-      </w:r>
-      <w:r>
-        <w:t xml:space="preserve"> of Northeast Ohio</w:t>
-      </w:r>
-      <w:r>
-        <w:t xml:space="preserve"> (Figure 1</w:t>
-      </w:r>
-      <w:r>
-        <w:t>; INSERT MAP HERE</w:t>
-      </w:r>
-      <w:r>
-        <w:t>)</w:t>
-      </w:r>
-      <w:r>
-        <w:t>.</w:t>
-      </w:r>
-      <w:r>
-        <w:t xml:space="preserve"> </w:t>
-      </w:r>
-      <w:r>
-        <w:t>The goal of the H2Ohio program is to mitigate harmful algal blooms in Lake Erie</w:t>
-      </w:r>
-      <w:r>
-        <w:t xml:space="preserve"> through a variety of methods including the construction of wetlands </w:t>
-      </w:r>
-      <w:r>
-        <w:fldChar w:fldCharType="begin"/>
-      </w:r>
-      <w:r>
-        <w:instrText xml:space="preserve"> ADDIN ZOTERO_ITEM CSL_CITATION {"citationID":"fGGYYxwT","properties":{"unsorted":false,"formattedCitation":"(International Joint Commission 2014)","plainCitation":"(International Joint Commission 2014)","noteIndex":0},"citationItems":[{"id":1746,"uris":["http://zotero.org/users/5222684/items/VPWL2YSB"],"itemData":{"id":1746,"type":"article-journal","container-title":"International Joint Commission","source":"Google Scholar","title":"A Balanced Diet for Lake Erie","author":[{"family":"International Joint Commission","given":""}],"issued":{"date-parts":[["2014"]]}}}],"schema":"https://github.com/citation-style-language/schema/raw/master/csl-citation.json"} </w:instrText>
-      </w:r>
-      <w:r>
-        <w:fldChar w:fldCharType="separate"/>
-      </w:r>
-      <w:r>
-        <w:rPr>
-          <w:rFonts w:ascii="Aptos" w:hAnsi="Aptos"/>
-        </w:rPr>
-        <w:t>(International Joint Commission 2014)</w:t>
-      </w:r>
-      <w:r>
-        <w:fldChar w:fldCharType="end"/>
-      </w:r>
-      <w:r>
-        <w:t xml:space="preserve">. </w:t>
-      </w:r>
-      <w:r>
-        <w:t>Harmful algal blooms in Lake Erie are primarily driven by agricultural runoff</w:t>
-      </w:r>
-      <w:r>
-        <w:t xml:space="preserve">, where the entire state of Ohio is over 50% agricultural land, and the Maumee River Drainage basin is </w:t>
-      </w:r>
-      <w:r>
-        <w:t>approximately 80% agricultural land</w:t>
-      </w:r>
-      <w:r>
-        <w:t xml:space="preserve"> [CITE SOMETHING HERE]</w:t>
-      </w:r>
-      <w:r>
-        <w:t xml:space="preserve">. </w:t>
-      </w:r>
-      <w:r>
-        <w:t xml:space="preserve"> </w:t>
-      </w:r>
-      <w:r>
-        <w:t xml:space="preserve">Wetland restoration in Northeastern Ohio is especially relevant because </w:t>
-      </w:r>
-      <w:r>
-        <w:t xml:space="preserve">the landscape was radically altered starting in the early 1900s when the Great Black Swamp, a wetland that covered </w:t>
-      </w:r>
-      <w:r>
-        <w:t>1 million acres of Northeastern Ohio was drained to make room for agriculture</w:t>
-      </w:r>
-      <w:r>
-        <w:t xml:space="preserve"> </w:t>
-      </w:r>
-      <w:r>
-        <w:fldChar w:fldCharType="begin"/>
-      </w:r>
-      <w:r>
-        <w:instrText xml:space="preserve"> ADDIN ZOTERO_ITEM CSL_CITATION {"citationID":"WG5LwzRh","properties":{"unsorted":false,"formattedCitation":"(Mitsch 2017)","plainCitation":"(Mitsch 2017)","noteIndex":0},"citationItems":[{"id":6218,"uris":["http://zotero.org/users/5222684/items/UF9G5DEI"],"itemData":{"id":6218,"type":"article-journal","abstract":"Harmful algal blooms are now a common occurrence around the world in these Anthropocene times because of fertilization of phosphorus and nitrogen for crop and animal production. One of the most dramatic cases in North America is the recent accelerated eutrophication of Lake Erie in the Laurentian Great Lakes. Also, we have lost, by some estimates, 50% of the world’s wetlands in the 20th century and 90% of the wetlands in Ohio USA over the 19th and 20th centuries. We are proposing a serious analysis of an ecological engineering opportunity to restore parts of the former 400,000ha (1 million acre) Great Black Swamp that was immediately southwest of Lake Erie in Ohio and is now one of the major sources of agricultural phosphorus to western Lake Erie through the Maumee River. Restoring and creating 20,000–40,000ha (50,000–100,000 acres) or 5–10% of the original wetlands in the Black Swamp to optimize nutrient reduction could reduce phosphorus loading by 480–960 metric tons/year or 18–37% percent of the annual phosphorus loading by the Maumee River to Lake Erie. A thorough investigation of this idea will first require physical (multi-year mesocosm experiments), mathematical, and business models to explore biogeochemical, hydrologic and economic feasibility and reliability. If this presents reasonable results, it would be followed by the creation of a small 400–1000ha (1000–2500 acre) demonstration treatment wetland in the Black Swamp region to see if wetland performance will scale up as predicted with the mesocosm and mathematical models. Only after a decade of studies at these smaller scale models and a demonstration levels would the full-scale nutrient retention wetlands be implemented in the former Black Swamp. When completed, these treatment wetlands would cover about 10% of the Great Black Swamp region and could remove, with proper ecological engineering design, 40% or more of the phosphorus load from the Maumee River Basin now going into Lake Erie.","collection-title":"Ecological Engineering of Sustainable Landscapes","container-title":"Ecological Engineering","DOI":"10.1016/j.ecoleng.2017.08.040","ISSN":"0925-8574","journalAbbreviation":"Ecological Engineering","page":"406-413","source":"ScienceDirect","title":"Solving Lake Erie’s harmful algal blooms by restoring the Great Black Swamp in Ohio","volume":"108","author":[{"family":"Mitsch","given":"William J."}],"issued":{"date-parts":[["2017",11,1]]}}}],"schema":"https://github.com/citation-style-language/schema/raw/master/csl-citation.json"} </w:instrText>
-      </w:r>
-      <w:r>
-        <w:fldChar w:fldCharType="separate"/>
-      </w:r>
-      <w:r>
-        <w:rPr>
-          <w:rFonts w:ascii="Aptos" w:hAnsi="Aptos"/>
-        </w:rPr>
-        <w:t>(Mitsch 2017)</w:t>
-      </w:r>
-      <w:r>
-        <w:fldChar w:fldCharType="end"/>
-      </w:r>
-      <w:r>
-        <w:t xml:space="preserve">. </w:t>
-      </w:r>
-      <w:r>
-        <w:t>Wetland restoration projects</w:t>
-      </w:r>
-      <w:r>
-        <w:t xml:space="preserve"> in the region have been sporadic</w:t>
-      </w:r>
-      <w:r>
-        <w:t xml:space="preserve"> </w:t>
-      </w:r>
-      <w:r>
-        <w:t>until</w:t>
-      </w:r>
-      <w:r>
-        <w:t xml:space="preserve"> the early 2000s </w:t>
-      </w:r>
-      <w:r>
-        <w:t>when</w:t>
-      </w:r>
-      <w:r>
-        <w:t xml:space="preserve"> the Toledo Water Crisis spurred interested in restoration in the region </w:t>
-      </w:r>
-      <w:r>
-        <w:fldChar w:fldCharType="begin"/>
-      </w:r>
-      <w:r>
-        <w:instrText xml:space="preserve"> ADDIN ZOTERO_ITEM CSL_CITATION {"citationID":"tO2Ax6ku","properties":{"unsorted":false,"formattedCitation":"(Michalak et al. 2013, Bingham et al. 2015)","plainCitation":"(Michalak et al. 2013, Bingham et al. 2015)","noteIndex":0},"citationItems":[{"id":6220,"uris":["http://zotero.org/users/5222684/items/S82KMXT9"],"itemData":{"id":6220,"type":"article-journal","abstract":"In 2011, Lake Erie experienced the largest harmful algal bloom in its recorded history, with a peak intensity over three times greater than any previously observed bloom. Here we show that long-term trends in agricultural practices are consistent with increasing phosphorus loading to the western basin of the lake, and that these trends, coupled with meteorological conditions in spring 2011, produced record-breaking nutrient loads. An extended period of weak lake circulation then led to abnormally long residence times that incubated the bloom, and warm and quiescent conditions after bloom onset allowed algae to remain near the top of the water column and prevented flushing of nutrients from the system. We further find that all of these factors are consistent with expected future conditions. If a scientifically guided management plan to mitigate these impacts is not implemented, we can therefore expect this bloom to be a harbinger of future blooms in Lake Erie.","container-title":"Proceedings of the National Academy of Sciences","DOI":"10.1073/pnas.1216006110","issue":"16","page":"6448-6452","publisher":"Proceedings of the National Academy of Sciences","source":"pnas.org (Atypon)","title":"Record-setting algal bloom in Lake Erie caused by agricultural and meteorological trends consistent with expected future conditions","volume":"110","author":[{"family":"Michalak","given":"Anna M."},{"family":"Anderson","given":"Eric J."},{"family":"Beletsky","given":"Dmitry"},{"family":"Boland","given":"Steven"},{"family":"Bosch","given":"Nathan S."},{"family":"Bridgeman","given":"Thomas B."},{"family":"Chaffin","given":"Justin D."},{"family":"Cho","given":"Kyunghwa"},{"family":"Confesor","given":"Rem"},{"family":"Daloğlu","given":"Irem"},{"family":"DePinto","given":"Joseph V."},{"family":"Evans","given":"Mary Anne"},{"family":"Fahnenstiel","given":"Gary L."},{"family":"He","given":"Lingli"},{"family":"Ho","given":"Jeff C."},{"family":"Jenkins","given":"Liza"},{"family":"Johengen","given":"Thomas H."},{"family":"Kuo","given":"Kevin C."},{"family":"LaPorte","given":"Elizabeth"},{"family":"Liu","given":"Xiaojian"},{"family":"McWilliams","given":"Michael R."},{"family":"Moore","given":"Michael R."},{"family":"Posselt","given":"Derek J."},{"family":"Richards","given":"R. Peter"},{"family":"Scavia","given":"Donald"},{"family":"Steiner","given":"Allison L."},{"family":"Verhamme","given":"Ed"},{"family":"Wright","given":"David M."},{"family":"Zagorski","given":"Melissa A."}],"issued":{"date-parts":[["2013",4,16]]}}},{"id":1747,"uris":["http://zotero.org/users/5222684/items/9P3HBE96"],"itemData":{"id":1747,"type":"article-journal","container-title":"Environmental Consulting &amp; Technology, Inc., Report","source":"Google Scholar","title":"Economic benefits of reducing harmful algal blooms in Lake Erie","volume":"66","author":[{"family":"Bingham","given":"M."},{"family":"Sinha","given":"S. K."},{"family":"Lupi","given":"F."}],"issued":{"date-parts":[["2015"]]}}}],"schema":"https://github.com/citation-style-language/schema/raw/master/csl-citation.json"} </w:instrText>
-      </w:r>
-      <w:r>
-        <w:fldChar w:fldCharType="separate"/>
-      </w:r>
-      <w:r>
-        <w:rPr>
-          <w:rFonts w:ascii="Aptos" w:hAnsi="Aptos"/>
-        </w:rPr>
-        <w:t>(Michalak et al. 2013, Bingham et al. 2015)</w:t>
-      </w:r>
-      <w:r>
-        <w:fldChar w:fldCharType="end"/>
-      </w:r>
-      <w:r>
-        <w:t xml:space="preserve">, however the H2Ohio Initiative represents a major investment in wetland restoration across the state. </w:t>
-      </w:r>
-    </w:p>
-    <w:p>
-      <w:r>
-        <w:tab/>
-        <w:t xml:space="preserve">The H2Ohio Wetland Monitoring program </w:t>
-      </w:r>
-      <w:r>
-        <w:t xml:space="preserve">collects data across </w:t>
-      </w:r>
-      <w:r>
-        <w:t xml:space="preserve">51 </w:t>
-      </w:r>
-      <w:r>
-        <w:t xml:space="preserve">total </w:t>
-      </w:r>
-      <w:r>
-        <w:t xml:space="preserve">wetland projects, </w:t>
-      </w:r>
-      <w:r>
-        <w:t xml:space="preserve">but this analysis focuses on the 24 projects where there was sufficient data to construct </w:t>
-      </w:r>
-      <w:r>
-        <w:t xml:space="preserve">a nutrient </w:t>
-      </w:r>
-      <w:r>
-        <w:t xml:space="preserve">mass balanced </w:t>
-      </w:r>
-      <w:r>
-        <w:t xml:space="preserve">budget </w:t>
-      </w:r>
-      <w:r>
-        <w:fldChar w:fldCharType="begin"/>
-      </w:r>
-      <w:r>
-        <w:instrText xml:space="preserve"> ADDIN ZOTERO_ITEM CSL_CITATION {"citationID":"yOyXQaAa","properties":{"unsorted":false,"formattedCitation":"(Kinsman-Costello et al. 2024)","plainCitation":"(Kinsman-Costello et al. 2024)","noteIndex":0},"citationItems":[{"id":5169,"uris":["http://zotero.org/users/5222684/items/ID4V44ZU"],"itemData":{"id":5169,"type":"book","publisher-place":"Columbus, OH, USA","title":"H2Ohio Wetland Monitoring Program:Monitoring Framework.","author":[{"family":"Kinsman-Costello","given":"Lauren E."},{"family":"Fussel","given":"Kristen"},{"family":"Winslow","given":"Chris"},{"family":"Kerns","given":"Janice"},{"family":"Schloegel","given":"Olivia"},{"family":"Mendonça","given":"Raissa"},{"family":"Becker","given":"Richard"},{"family":"Bridgeman","given":"Thomas B."},{"family":"Doro","given":"Kennedy"},{"family":"Jacquemin","given":"Stephen J."},{"family":"Johnson","given":"Laura"},{"family":"Liu","given":"Ganming"},{"family":"McCluney","given":"Kevin"},{"family":"Michaels","given":"Helen"},{"family":"Midden","given":"W. Robert"},{"family":"Newell","given":"Silvia E."},{"family":"Back","given":"Michael"},{"family":"Brown","given":"Lauren"},{"family":"Rahman","given":"Ishfaq"},{"family":"Swan","given":"Zach"}],"issued":{"date-parts":[["2024"]]}}}],"schema":"https://github.com/citation-style-language/schema/raw/master/csl-citation.json"} </w:instrText>
-      </w:r>
-      <w:r>
-        <w:fldChar w:fldCharType="separate"/>
-      </w:r>
-      <w:r>
-        <w:rPr>
-          <w:rFonts w:ascii="Aptos" w:hAnsi="Aptos"/>
-        </w:rPr>
-        <w:t>(Kinsman-Costello et al. 2024)</w:t>
-      </w:r>
-      <w:r>
-        <w:fldChar w:fldCharType="end"/>
-      </w:r>
-      <w:r>
-        <w:t xml:space="preserve">. </w:t>
-      </w:r>
-      <w:r>
-        <w:t>Twenty</w:t>
-      </w:r>
-      <w:r>
-        <w:t xml:space="preserve"> of the 24 projects were </w:t>
-      </w:r>
-      <w:r>
-        <w:t>from</w:t>
-      </w:r>
-      <w:r>
-        <w:t xml:space="preserve"> drainage areas with &gt;60% agricultural </w:t>
-      </w:r>
-      <w:r>
-        <w:t>land us</w:t>
-      </w:r>
-      <w:r>
-        <w:t xml:space="preserve">e, and the </w:t>
-      </w:r>
-      <w:r>
-        <w:t>3 of the 4</w:t>
-      </w:r>
-      <w:r>
-        <w:t xml:space="preserve"> remaining were</w:t>
-      </w:r>
-      <w:r>
-        <w:t xml:space="preserve"> from drainage areas with</w:t>
-      </w:r>
-      <w:r>
-        <w:t xml:space="preserve"> </w:t>
-      </w:r>
-      <w:r>
-        <w:t>&gt;70% urban land use</w:t>
-      </w:r>
-      <w:r>
-        <w:t xml:space="preserve">, while one was from a drainage area evenly split between </w:t>
-      </w:r>
-      <w:r>
-        <w:t>forest and agriculture.</w:t>
-      </w:r>
-      <w:r>
-        <w:t xml:space="preserve"> </w:t>
-      </w:r>
-      <w:r>
-        <w:t xml:space="preserve">Wetland structure varied between projects </w:t>
-      </w:r>
-    </w:p>
-    <w:p>
-      <w:r>
-        <w:t>[Wetland structure summary stats]</w:t>
-      </w:r>
-    </w:p>
-    <w:p>
-      <w:pPr>
-        <w:pStyle w:val="ListParagraph"/>
-        <w:numPr>
-          <w:ilvl w:val="0"/>
-          <w:numId w:val="9"/>
-        </w:numPr>
-      </w:pPr>
-      <w:r>
-        <w:t xml:space="preserve">Use the </w:t>
-      </w:r>
-      <w:r>
-        <w:t>hydrology column in the LOI file</w:t>
-      </w:r>
-      <w:r>
-        <w:t xml:space="preserve">. Sort out by the multiple wetland types. </w:t>
-      </w:r>
-    </w:p>
-    <w:p>
-      <w:pPr>
-        <w:pStyle w:val="ListParagraph"/>
-        <w:numPr>
-          <w:ilvl w:val="0"/>
-          <w:numId w:val="9"/>
-        </w:numPr>
-      </w:pPr>
-      <w:r>
-        <w:t>Water sources summary stats</w:t>
-      </w:r>
-    </w:p>
-    <w:p>
-      <w:r>
-        <w:tab/>
-      </w:r>
-    </w:p>
-    <w:p>
-      <w:r>
-        <w:t>[SUMMARY STATS ON WETLANDS]</w:t>
-      </w:r>
-    </w:p>
-    <w:p>
-      <w:pPr>
+      <w:r>
         <w:rPr>
           <w:b/>
           <w:bCs/>
           <w:u w:val="single"/>
         </w:rPr>
-      </w:pPr>
+        <w:t>s</w:t>
+      </w:r>
+    </w:p>
+    <w:p>
+      <w:r>
+        <w:tab/>
+        <w:t xml:space="preserve">We analyzed data from 24 wetland projects built by the H2Ohio </w:t>
+      </w:r>
+      <w:r>
+        <w:t>Initiativ</w:t>
+      </w:r>
+      <w:r>
+        <w:t xml:space="preserve">e: a water quality program administered by the Ohio Department of Natural Resources </w:t>
+      </w:r>
+      <w:r>
+        <w:t>that has to date created 498 wetland projects throughout the state of Ohio</w:t>
+      </w:r>
+      <w:r>
+        <w:t xml:space="preserve">, with many of those projects focused </w:t>
+      </w:r>
+      <w:r>
+        <w:t>on</w:t>
+      </w:r>
+      <w:r>
+        <w:t xml:space="preserve"> the Maumee River Drainage Basin</w:t>
+      </w:r>
+      <w:r>
+        <w:t xml:space="preserve"> of Northeast Ohio</w:t>
+      </w:r>
+      <w:r>
+        <w:t xml:space="preserve"> (Figure 1</w:t>
+      </w:r>
+      <w:r>
+        <w:t>; INSERT MAP HERE</w:t>
+      </w:r>
+      <w:r>
+        <w:t>)</w:t>
+      </w:r>
+      <w:r>
+        <w:t>.</w:t>
+      </w:r>
+      <w:r>
+        <w:t xml:space="preserve"> </w:t>
+      </w:r>
+      <w:r>
+        <w:t>The goal of the H2Ohio program is to mitigate harmful algal blooms in Lake Erie</w:t>
+      </w:r>
+      <w:r>
+        <w:t xml:space="preserve"> through a variety of methods including the construction of wetlands </w:t>
+      </w:r>
+      <w:r>
+        <w:fldChar w:fldCharType="begin"/>
+      </w:r>
+      <w:r>
+        <w:instrText xml:space="preserve"> ADDIN ZOTERO_ITEM CSL_CITATION {"citationID":"fGGYYxwT","properties":{"unsorted":false,"formattedCitation":"(International Joint Commission 2014)","plainCitation":"(International Joint Commission 2014)","noteIndex":0},"citationItems":[{"id":1746,"uris":["http://zotero.org/users/5222684/items/VPWL2YSB"],"itemData":{"id":1746,"type":"article-journal","container-title":"International Joint Commission","source":"Google Scholar","title":"A Balanced Diet for Lake Erie","author":[{"family":"International Joint Commission","given":""}],"issued":{"date-parts":[["2014"]]}}}],"schema":"https://github.com/citation-style-language/schema/raw/master/csl-citation.json"} </w:instrText>
+      </w:r>
+      <w:r>
+        <w:fldChar w:fldCharType="separate"/>
+      </w:r>
+      <w:r>
+        <w:rPr>
+          <w:rFonts w:ascii="Aptos" w:hAnsi="Aptos"/>
+        </w:rPr>
+        <w:t>(International Joint Commission 2014)</w:t>
+      </w:r>
+      <w:r>
+        <w:fldChar w:fldCharType="end"/>
+      </w:r>
+      <w:r>
+        <w:t xml:space="preserve">. </w:t>
+      </w:r>
+      <w:r>
+        <w:t>Harmful algal blooms in Lake Erie are primarily driven by agricultural runoff</w:t>
+      </w:r>
+      <w:r>
+        <w:t xml:space="preserve">, where the entire state of Ohio is over 50% agricultural land, and the Maumee River Drainage basin is </w:t>
+      </w:r>
+      <w:r>
+        <w:t>approximately 80% agricultural land</w:t>
+      </w:r>
+      <w:r>
+        <w:t xml:space="preserve"> [CITE SOMETHING HERE]</w:t>
+      </w:r>
+      <w:r>
+        <w:t xml:space="preserve">. </w:t>
+      </w:r>
+      <w:r>
+        <w:t xml:space="preserve"> </w:t>
+      </w:r>
+      <w:r>
+        <w:t xml:space="preserve">Wetland restoration in Northeastern Ohio is especially relevant because </w:t>
+      </w:r>
+      <w:r>
+        <w:t xml:space="preserve">the landscape was radically altered starting in the early 1900s when the Great Black Swamp, a wetland that covered </w:t>
+      </w:r>
+      <w:r>
+        <w:t>1 million acres of Northeastern Ohio was drained to make room for agriculture</w:t>
+      </w:r>
+      <w:r>
+        <w:t xml:space="preserve"> </w:t>
+      </w:r>
+      <w:r>
+        <w:fldChar w:fldCharType="begin"/>
+      </w:r>
+      <w:r>
+        <w:instrText xml:space="preserve"> ADDIN ZOTERO_ITEM CSL_CITATION {"citationID":"WG5LwzRh","properties":{"unsorted":false,"formattedCitation":"(Mitsch 2017)","plainCitation":"(Mitsch 2017)","noteIndex":0},"citationItems":[{"id":6218,"uris":["http://zotero.org/users/5222684/items/UF9G5DEI"],"itemData":{"id":6218,"type":"article-journal","abstract":"Harmful algal blooms are now a common occurrence around the world in these Anthropocene times because of fertilization of phosphorus and nitrogen for crop and animal production. One of the most dramatic cases in North America is the recent accelerated eutrophication of Lake Erie in the Laurentian Great Lakes. Also, we have lost, by some estimates, 50% of the world’s wetlands in the 20th century and 90% of the wetlands in Ohio USA over the 19th and 20th centuries. We are proposing a serious analysis of an ecological engineering opportunity to restore parts of the former 400,000ha (1 million acre) Great Black Swamp that was immediately southwest of Lake Erie in Ohio and is now one of the major sources of agricultural phosphorus to western Lake Erie through the Maumee River. Restoring and creating 20,000–40,000ha (50,000–100,000 acres) or 5–10% of the original wetlands in the Black Swamp to optimize nutrient reduction could reduce phosphorus loading by 480–960 metric tons/year or 18–37% percent of the annual phosphorus loading by the Maumee River to Lake Erie. A thorough investigation of this idea will first require physical (multi-year mesocosm experiments), mathematical, and business models to explore biogeochemical, hydrologic and economic feasibility and reliability. If this presents reasonable results, it would be followed by the creation of a small 400–1000ha (1000–2500 acre) demonstration treatment wetland in the Black Swamp region to see if wetland performance will scale up as predicted with the mesocosm and mathematical models. Only after a decade of studies at these smaller scale models and a demonstration levels would the full-scale nutrient retention wetlands be implemented in the former Black Swamp. When completed, these treatment wetlands would cover about 10% of the Great Black Swamp region and could remove, with proper ecological engineering design, 40% or more of the phosphorus load from the Maumee River Basin now going into Lake Erie.","collection-title":"Ecological Engineering of Sustainable Landscapes","container-title":"Ecological Engineering","DOI":"10.1016/j.ecoleng.2017.08.040","ISSN":"0925-8574","journalAbbreviation":"Ecological Engineering","page":"406-413","source":"ScienceDirect","title":"Solving Lake Erie’s harmful algal blooms by restoring the Great Black Swamp in Ohio","volume":"108","author":[{"family":"Mitsch","given":"William J."}],"issued":{"date-parts":[["2017",11,1]]}}}],"schema":"https://github.com/citation-style-language/schema/raw/master/csl-citation.json"} </w:instrText>
+      </w:r>
+      <w:r>
+        <w:fldChar w:fldCharType="separate"/>
+      </w:r>
+      <w:r>
+        <w:rPr>
+          <w:rFonts w:ascii="Aptos" w:hAnsi="Aptos"/>
+        </w:rPr>
+        <w:t>(Mitsch 2017)</w:t>
+      </w:r>
+      <w:r>
+        <w:fldChar w:fldCharType="end"/>
+      </w:r>
+      <w:r>
+        <w:t xml:space="preserve">. </w:t>
+      </w:r>
+      <w:r>
+        <w:t>Wetland restoration projects</w:t>
+      </w:r>
+      <w:r>
+        <w:t xml:space="preserve"> in the region have been sporadic</w:t>
+      </w:r>
+      <w:r>
+        <w:t xml:space="preserve"> </w:t>
+      </w:r>
+      <w:r>
+        <w:t>until</w:t>
+      </w:r>
+      <w:r>
+        <w:t xml:space="preserve"> the early 2000s </w:t>
+      </w:r>
+      <w:r>
+        <w:t>when</w:t>
+      </w:r>
+      <w:r>
+        <w:t xml:space="preserve"> the Toledo Water Crisis spurred interested in restoration in the region </w:t>
+      </w:r>
+      <w:r>
+        <w:fldChar w:fldCharType="begin"/>
+      </w:r>
+      <w:r>
+        <w:instrText xml:space="preserve"> ADDIN ZOTERO_ITEM CSL_CITATION {"citationID":"tO2Ax6ku","properties":{"unsorted":false,"formattedCitation":"(Michalak et al. 2013, Bingham et al. 2015)","plainCitation":"(Michalak et al. 2013, Bingham et al. 2015)","noteIndex":0},"citationItems":[{"id":6220,"uris":["http://zotero.org/users/5222684/items/S82KMXT9"],"itemData":{"id":6220,"type":"article-journal","abstract":"In 2011, Lake Erie experienced the largest harmful algal bloom in its recorded history, with a peak intensity over three times greater than any previously observed bloom. Here we show that long-term trends in agricultural practices are consistent with increasing phosphorus loading to the western basin of the lake, and that these trends, coupled with meteorological conditions in spring 2011, produced record-breaking nutrient loads. An extended period of weak lake circulation then led to abnormally long residence times that incubated the bloom, and warm and quiescent conditions after bloom onset allowed algae to remain near the top of the water column and prevented flushing of nutrients from the system. We further find that all of these factors are consistent with expected future conditions. If a scientifically guided management plan to mitigate these impacts is not implemented, we can therefore expect this bloom to be a harbinger of future blooms in Lake Erie.","container-title":"Proceedings of the National Academy of Sciences","DOI":"10.1073/pnas.1216006110","issue":"16","page":"6448-6452","publisher":"Proceedings of the National Academy of Sciences","source":"pnas.org (Atypon)","title":"Record-setting algal bloom in Lake Erie caused by agricultural and meteorological trends consistent with expected future conditions","volume":"110","author":[{"family":"Michalak","given":"Anna M."},{"family":"Anderson","given":"Eric J."},{"family":"Beletsky","given":"Dmitry"},{"family":"Boland","given":"Steven"},{"family":"Bosch","given":"Nathan S."},{"family":"Bridgeman","given":"Thomas B."},{"family":"Chaffin","given":"Justin D."},{"family":"Cho","given":"Kyunghwa"},{"family":"Confesor","given":"Rem"},{"family":"Daloğlu","given":"Irem"},{"family":"DePinto","given":"Joseph V."},{"family":"Evans","given":"Mary Anne"},{"family":"Fahnenstiel","given":"Gary L."},{"family":"He","given":"Lingli"},{"family":"Ho","given":"Jeff C."},{"family":"Jenkins","given":"Liza"},{"family":"Johengen","given":"Thomas H."},{"family":"Kuo","given":"Kevin C."},{"family":"LaPorte","given":"Elizabeth"},{"family":"Liu","given":"Xiaojian"},{"family":"McWilliams","given":"Michael R."},{"family":"Moore","given":"Michael R."},{"family":"Posselt","given":"Derek J."},{"family":"Richards","given":"R. Peter"},{"family":"Scavia","given":"Donald"},{"family":"Steiner","given":"Allison L."},{"family":"Verhamme","given":"Ed"},{"family":"Wright","given":"David M."},{"family":"Zagorski","given":"Melissa A."}],"issued":{"date-parts":[["2013",4,16]]}}},{"id":1747,"uris":["http://zotero.org/users/5222684/items/9P3HBE96"],"itemData":{"id":1747,"type":"article-journal","container-title":"Environmental Consulting &amp; Technology, Inc., Report","source":"Google Scholar","title":"Economic benefits of reducing harmful algal blooms in Lake Erie","volume":"66","author":[{"family":"Bingham","given":"M."},{"family":"Sinha","given":"S. K."},{"family":"Lupi","given":"F."}],"issued":{"date-parts":[["2015"]]}}}],"schema":"https://github.com/citation-style-language/schema/raw/master/csl-citation.json"} </w:instrText>
+      </w:r>
+      <w:r>
+        <w:fldChar w:fldCharType="separate"/>
+      </w:r>
+      <w:r>
+        <w:rPr>
+          <w:rFonts w:ascii="Aptos" w:hAnsi="Aptos"/>
+        </w:rPr>
+        <w:t>(Michalak et al. 2013, Bingham et al. 2015)</w:t>
+      </w:r>
+      <w:r>
+        <w:fldChar w:fldCharType="end"/>
+      </w:r>
+      <w:r>
+        <w:t xml:space="preserve">, however the H2Ohio Initiative represents a major investment in wetland restoration across the state. </w:t>
+      </w:r>
+    </w:p>
+    <w:p>
+      <w:r>
+        <w:tab/>
+        <w:t xml:space="preserve">The H2Ohio Wetland Monitoring program </w:t>
+      </w:r>
+      <w:r>
+        <w:t xml:space="preserve">collects data across </w:t>
+      </w:r>
+      <w:r>
+        <w:t xml:space="preserve">51 </w:t>
+      </w:r>
+      <w:r>
+        <w:t xml:space="preserve">total </w:t>
+      </w:r>
+      <w:r>
+        <w:t xml:space="preserve">wetland projects, </w:t>
+      </w:r>
+      <w:r>
+        <w:t xml:space="preserve">but this analysis focuses on the 24 projects where there was sufficient data to construct </w:t>
+      </w:r>
+      <w:r>
+        <w:t xml:space="preserve">a nutrient </w:t>
+      </w:r>
+      <w:r>
+        <w:t xml:space="preserve">mass balanced </w:t>
+      </w:r>
+      <w:r>
+        <w:t xml:space="preserve">budget </w:t>
+      </w:r>
+      <w:r>
+        <w:fldChar w:fldCharType="begin"/>
+      </w:r>
+      <w:r>
+        <w:instrText xml:space="preserve"> ADDIN ZOTERO_ITEM CSL_CITATION {"citationID":"yOyXQaAa","properties":{"unsorted":false,"formattedCitation":"(Kinsman-Costello et al. 2024)","plainCitation":"(Kinsman-Costello et al. 2024)","noteIndex":0},"citationItems":[{"id":5169,"uris":["http://zotero.org/users/5222684/items/ID4V44ZU"],"itemData":{"id":5169,"type":"book","publisher-place":"Columbus, OH, USA","title":"H2Ohio Wetland Monitoring Program:Monitoring Framework.","author":[{"family":"Kinsman-Costello","given":"Lauren E."},{"family":"Fussel","given":"Kristen"},{"family":"Winslow","given":"Chris"},{"family":"Kerns","given":"Janice"},{"family":"Schloegel","given":"Olivia"},{"family":"Mendonça","given":"Raissa"},{"family":"Becker","given":"Richard"},{"family":"Bridgeman","given":"Thomas B."},{"family":"Doro","given":"Kennedy"},{"family":"Jacquemin","given":"Stephen J."},{"family":"Johnson","given":"Laura"},{"family":"Liu","given":"Ganming"},{"family":"McCluney","given":"Kevin"},{"family":"Michaels","given":"Helen"},{"family":"Midden","given":"W. Robert"},{"family":"Newell","given":"Silvia E."},{"family":"Back","given":"Michael"},{"family":"Brown","given":"Lauren"},{"family":"Rahman","given":"Ishfaq"},{"family":"Swan","given":"Zach"}],"issued":{"date-parts":[["2024"]]}}}],"schema":"https://github.com/citation-style-language/schema/raw/master/csl-citation.json"} </w:instrText>
+      </w:r>
+      <w:r>
+        <w:fldChar w:fldCharType="separate"/>
+      </w:r>
+      <w:r>
+        <w:rPr>
+          <w:rFonts w:ascii="Aptos" w:hAnsi="Aptos"/>
+        </w:rPr>
+        <w:t>(Kinsman-Costello et al. 2024)</w:t>
+      </w:r>
+      <w:r>
+        <w:fldChar w:fldCharType="end"/>
+      </w:r>
+      <w:r>
+        <w:t xml:space="preserve">. </w:t>
+      </w:r>
+      <w:r>
+        <w:t>Twenty</w:t>
+      </w:r>
+      <w:r>
+        <w:t xml:space="preserve"> of the 24 projects were </w:t>
+      </w:r>
+      <w:r>
+        <w:t>from</w:t>
+      </w:r>
+      <w:r>
+        <w:t xml:space="preserve"> drainage areas with &gt;60% agricultural </w:t>
+      </w:r>
+      <w:r>
+        <w:t>land us</w:t>
+      </w:r>
+      <w:r>
+        <w:t xml:space="preserve">e, and the </w:t>
+      </w:r>
+      <w:r>
+        <w:t>3 of the 4</w:t>
+      </w:r>
+      <w:r>
+        <w:t xml:space="preserve"> remaining were</w:t>
+      </w:r>
+      <w:r>
+        <w:t xml:space="preserve"> from drainage areas with</w:t>
+      </w:r>
+      <w:r>
+        <w:t xml:space="preserve"> </w:t>
+      </w:r>
+      <w:r>
+        <w:t>&gt;70% urban land use</w:t>
+      </w:r>
+      <w:r>
+        <w:t xml:space="preserve">, while one was from a drainage area evenly split between </w:t>
+      </w:r>
+      <w:r>
+        <w:t>forest and agriculture.</w:t>
+      </w:r>
+      <w:r>
+        <w:t xml:space="preserve"> </w:t>
+      </w:r>
+      <w:r>
+        <w:t>Wetland structure varied between projects</w:t>
+      </w:r>
+      <w:r>
+        <w:t>; 1</w:t>
+      </w:r>
+      <w:r>
+        <w:t>7</w:t>
+      </w:r>
+      <w:r>
+        <w:t xml:space="preserve"> of the 24 projects </w:t>
+      </w:r>
+      <w:r>
+        <w:t>received inflow from</w:t>
+      </w:r>
+      <w:r>
+        <w:t xml:space="preserve"> rivers, </w:t>
+      </w:r>
+      <w:r>
+        <w:t xml:space="preserve">3 had direct coastal connections with lakes, </w:t>
+      </w:r>
+      <w:r>
+        <w:t xml:space="preserve">and </w:t>
+      </w:r>
+      <w:r>
+        <w:t xml:space="preserve">6 had direct tile drain inflows. </w:t>
+      </w:r>
     </w:p>
     <w:p>
       <w:pPr>
@@ -1061,12 +1229,21 @@
           <w:u w:val="single"/>
         </w:rPr>
       </w:pPr>
-      <w:r>
+    </w:p>
+    <w:p>
+      <w:pPr>
         <w:rPr>
           <w:b/>
           <w:bCs/>
           <w:u w:val="single"/>
         </w:rPr>
+      </w:pPr>
+      <w:r>
+        <w:rPr>
+          <w:b/>
+          <w:bCs/>
+          <w:u w:val="single"/>
+        </w:rPr>
         <w:t>2.3 Nutrient Budgets</w:t>
       </w:r>
     </w:p>
@@ -1180,105 +1357,102 @@
         <w:t xml:space="preserve">direct measurement </w:t>
       </w:r>
       <w:r>
-        <w:t xml:space="preserve">of inflows, stage </w:t>
-      </w:r>
+        <w:t>of inflows, stage storage models, or</w:t>
+      </w:r>
+      <w:r>
+        <w:t xml:space="preserve"> estimation</w:t>
+      </w:r>
+      <w:r>
+        <w:t xml:space="preserve"> of flow based on runoff and drainage area of the wetland parcel</w:t>
+      </w:r>
+      <w:r>
+        <w:t xml:space="preserve"> </w:t>
+      </w:r>
+      <w:r>
+        <w:fldChar w:fldCharType="begin"/>
+      </w:r>
+      <w:r>
+        <w:instrText xml:space="preserve"> ADDIN ZOTERO_ITEM CSL_CITATION {"citationID":"PontaeXm","properties":{"unsorted":false,"formattedCitation":"(USDA-NRCS 2004)","plainCitation":"(USDA-NRCS 2004)","noteIndex":0},"citationItems":[{"id":5079,"uris":["http://zotero.org/users/5222684/items/H7GZIS4Z"],"itemData":{"id":5079,"type":"chapter","container-title":"National Engineering Handbook, Title 210 Engineering","publisher":"United States Department of Agriculture Natural Resources Conservation Service","title":"Estimation of Direct Runoff from Storm Rainfall","author":[{"family":"USDA-NRCS","given":""}],"issued":{"date-parts":[["2004"]]}}}],"schema":"https://github.com/citation-style-language/schema/raw/master/csl-citation.json"} </w:instrText>
+      </w:r>
+      <w:r>
+        <w:fldChar w:fldCharType="separate"/>
+      </w:r>
+      <w:r>
+        <w:rPr>
+          <w:rFonts w:ascii="Aptos" w:hAnsi="Aptos"/>
+        </w:rPr>
+        <w:t>(USDA-NRCS 2004)</w:t>
+      </w:r>
+      <w:r>
+        <w:fldChar w:fldCharType="end"/>
+      </w:r>
+      <w:r>
+        <w:t xml:space="preserve">. </w:t>
+      </w:r>
+      <w:r>
+        <w:t xml:space="preserve">For all </w:t>
+      </w:r>
+      <w:r>
+        <w:t xml:space="preserve">24 wetland </w:t>
+      </w:r>
+      <w:r>
+        <w:t xml:space="preserve">projects inflow </w:t>
+      </w:r>
+      <w:r>
+        <w:t>and/</w:t>
+      </w:r>
+      <w:r>
+        <w:t xml:space="preserve">or outflow </w:t>
+      </w:r>
+      <w:r>
+        <w:t xml:space="preserve">volume </w:t>
+      </w:r>
+      <w:r>
+        <w:t xml:space="preserve">was measured </w:t>
+      </w:r>
+      <w:r>
+        <w:t xml:space="preserve">using one of </w:t>
+      </w:r>
+      <w:r>
+        <w:t>five</w:t>
+      </w:r>
+      <w:r>
+        <w:t xml:space="preserve"> methods: pumping rates (3 projects), </w:t>
+      </w:r>
+      <w:r>
+        <w:t xml:space="preserve">stage-storage models (13 projects), </w:t>
+      </w:r>
+      <w:r>
+        <w:t xml:space="preserve">watershed weighting using USGS discharge (1 project), or </w:t>
+      </w:r>
+      <w:r>
+        <w:t>water depth and</w:t>
+      </w:r>
+      <w:r>
+        <w:t xml:space="preserve"> weir equations (</w:t>
+      </w:r>
+      <w:r>
+        <w:t>7 projects).</w:t>
+      </w:r>
+      <w:r>
+        <w:t xml:space="preserve"> </w:t>
+      </w:r>
+      <w:r>
+        <w:t>For all projects either inflow or outflow was directly measured, but f</w:t>
+      </w:r>
+      <w:r>
+        <w:t>or 16 of the 24 total projects evapotranspiration was used to</w:t>
+      </w:r>
+      <w:r>
+        <w:t xml:space="preserve"> estimate the unmeasured value. </w:t>
+      </w:r>
+    </w:p>
+    <w:p>
+      <w:pPr>
+        <w:ind w:firstLine="720"/>
+      </w:pPr>
       <w:r>
         <w:lastRenderedPageBreak/>
-        <w:t>storage models, or</w:t>
-      </w:r>
-      <w:r>
-        <w:t xml:space="preserve"> estimation</w:t>
-      </w:r>
-      <w:r>
-        <w:t xml:space="preserve"> of flow based on runoff and drainage area of the wetland parcel</w:t>
-      </w:r>
-      <w:r>
-        <w:t xml:space="preserve"> </w:t>
-      </w:r>
-      <w:r>
-        <w:fldChar w:fldCharType="begin"/>
-      </w:r>
-      <w:r>
-        <w:instrText xml:space="preserve"> ADDIN ZOTERO_ITEM CSL_CITATION {"citationID":"PontaeXm","properties":{"unsorted":false,"formattedCitation":"(USDA-NRCS 2004)","plainCitation":"(USDA-NRCS 2004)","noteIndex":0},"citationItems":[{"id":5079,"uris":["http://zotero.org/users/5222684/items/H7GZIS4Z"],"itemData":{"id":5079,"type":"chapter","container-title":"National Engineering Handbook, Title 210 Engineering","publisher":"United States Department of Agriculture Natural Resources Conservation Service","title":"Estimation of Direct Runoff from Storm Rainfall","author":[{"family":"USDA-NRCS","given":""}],"issued":{"date-parts":[["2004"]]}}}],"schema":"https://github.com/citation-style-language/schema/raw/master/csl-citation.json"} </w:instrText>
-      </w:r>
-      <w:r>
-        <w:fldChar w:fldCharType="separate"/>
-      </w:r>
-      <w:r>
-        <w:rPr>
-          <w:rFonts w:ascii="Aptos" w:hAnsi="Aptos"/>
-        </w:rPr>
-        <w:t>(USDA-NRCS 2004)</w:t>
-      </w:r>
-      <w:r>
-        <w:fldChar w:fldCharType="end"/>
-      </w:r>
-      <w:r>
-        <w:t xml:space="preserve">. </w:t>
-      </w:r>
-      <w:r>
-        <w:t xml:space="preserve">For all </w:t>
-      </w:r>
-      <w:r>
-        <w:t xml:space="preserve">24 wetland </w:t>
-      </w:r>
-      <w:r>
-        <w:t xml:space="preserve">projects inflow </w:t>
-      </w:r>
-      <w:r>
-        <w:t>and/</w:t>
-      </w:r>
-      <w:r>
-        <w:t xml:space="preserve">or outflow </w:t>
-      </w:r>
-      <w:r>
-        <w:t xml:space="preserve">volume </w:t>
-      </w:r>
-      <w:r>
-        <w:t xml:space="preserve">was measured </w:t>
-      </w:r>
-      <w:r>
-        <w:t xml:space="preserve">using one of </w:t>
-      </w:r>
-      <w:r>
-        <w:t>five</w:t>
-      </w:r>
-      <w:r>
-        <w:t xml:space="preserve"> methods: pumping rates (3 projects), </w:t>
-      </w:r>
-      <w:r>
-        <w:t xml:space="preserve">stage-storage models (13 projects), </w:t>
-      </w:r>
-      <w:r>
-        <w:t xml:space="preserve">watershed weighting using USGS discharge (1 project), or </w:t>
-      </w:r>
-      <w:r>
-        <w:t>water depth and</w:t>
-      </w:r>
-      <w:r>
-        <w:t xml:space="preserve"> weir equations (</w:t>
-      </w:r>
-      <w:r>
-        <w:t>7 projects).</w:t>
-      </w:r>
-      <w:r>
-        <w:t xml:space="preserve"> </w:t>
-      </w:r>
-      <w:r>
-        <w:t>For all projects either inflow or outflow was directly measured, but f</w:t>
-      </w:r>
-      <w:r>
-        <w:t>or 16 of the 24 total projects evapotranspiration was used to</w:t>
-      </w:r>
-      <w:r>
-        <w:t xml:space="preserve"> estimate the unmeasured value. </w:t>
-      </w:r>
-    </w:p>
-    <w:p>
-      <w:pPr>
-        <w:ind w:firstLine="720"/>
-      </w:pPr>
-      <w:r>
         <w:t>Reference evapotranspiration (ET</w:t>
       </w:r>
       <w:r>
@@ -1300,15 +1474,7 @@
         <w:t>)</w:t>
       </w:r>
       <w:r>
-        <w:t xml:space="preserve">. Daily meteorological inputs, including minimum and maximum air temperature, minimum and maximum relative humidity, and wind speed at 2 meters, were obtained from the nearest Ohio station of the Automated Surface Observing System (ASOS) network via the Iowa Environmental </w:t>
-      </w:r>
-      <w:proofErr w:type="spellStart"/>
-      <w:r>
-        <w:t>Mesonet</w:t>
-      </w:r>
-      <w:proofErr w:type="spellEnd"/>
-      <w:r>
-        <w:t xml:space="preserve"> (IEM). Where wind speed was only available at 10 meters, it was adjusted to the 2-meter reference height using the logarithmic wind profile equation</w:t>
+        <w:t>. Daily meteorological inputs, including minimum and maximum air temperature, minimum and maximum relative humidity, and wind speed at 2 meters, were obtained from the nearest Ohio station of the Automated Surface Observing System (ASOS) network via the Iowa Environmental Mesonet (IEM). Where wind speed was only available at 10 meters, it was adjusted to the 2-meter reference height using the logarithmic wind profile equation</w:t>
       </w:r>
       <w:r>
         <w:t xml:space="preserve"> </w:t>
@@ -1675,7 +1841,7 @@
       <w:r>
         <w:t>Daily solar radiation (MJ/m²/day) was sourced from the National Aeronautics and Space Administration (NASA) Langley Research Center's Prediction Of Worldwide Energy Resources (</w:t>
       </w:r>
-      <w:hyperlink r:id="rId5">
+      <w:hyperlink r:id="rId7">
         <w:r>
           <w:rPr>
             <w:rStyle w:val="Hyperlink"/>
@@ -1686,14 +1852,12 @@
       <w:r>
         <w:t xml:space="preserve">) database using the wetland project coordinates and the </w:t>
       </w:r>
-      <w:proofErr w:type="spellStart"/>
       <w:r>
         <w:rPr>
           <w:rFonts w:ascii="Courier New" w:hAnsi="Courier New" w:cs="Courier New"/>
         </w:rPr>
         <w:t>nasapower</w:t>
       </w:r>
-      <w:proofErr w:type="spellEnd"/>
       <w:r>
         <w:t xml:space="preserve"> R package</w:t>
       </w:r>
@@ -1738,7 +1902,6 @@
       <w:r>
         <w:t xml:space="preserve"> was computed following the Penman-Monteith FAO-56 equation, which combines a radiation term (</w:t>
       </w:r>
-      <w:proofErr w:type="spellStart"/>
       <w:r>
         <w:rPr>
           <w:i/>
@@ -1754,11 +1917,9 @@
         </w:rPr>
         <w:t>s</w:t>
       </w:r>
-      <w:proofErr w:type="spellEnd"/>
       <w:r>
         <w:t>) and an aerodynamic term (</w:t>
       </w:r>
-      <w:proofErr w:type="spellStart"/>
       <w:r>
         <w:rPr>
           <w:i/>
@@ -1774,7 +1935,6 @@
         </w:rPr>
         <w:t>a</w:t>
       </w:r>
-      <w:proofErr w:type="spellEnd"/>
       <w:r>
         <w:t>) to estimate the evaporative demand of the atmosphere over a hypothetical reference crop (Allen et al., 1998). Key intermediate variables (e.g., slope of the saturation vapor pressure curve, the psychrometric constant, mean saturation and actual vapor pressure) were calculated from the daily meteorological inputs and project-specific parameters (latitude, elevation). Soil heat flux density (</w:t>
       </w:r>
@@ -1912,7 +2072,6 @@
           <w:i/>
           <w:iCs/>
         </w:rPr>
-        <w:lastRenderedPageBreak/>
         <w:t>2.3.3 Runoff Prevention</w:t>
       </w:r>
     </w:p>
@@ -1946,7 +2105,11 @@
         <w:t xml:space="preserve">and runoff, we </w:t>
       </w:r>
       <w:r>
-        <w:t xml:space="preserve">assume that wetlands are no longer being fertilized and store water that would previously have runoff the landscape due to the disruption of tile drains. </w:t>
+        <w:t xml:space="preserve">assume that wetlands are no longer being fertilized and </w:t>
+      </w:r>
+      <w:r>
+        <w:lastRenderedPageBreak/>
+        <w:t xml:space="preserve">store water that would previously have runoff the landscape due to the disruption of tile drains. </w:t>
       </w:r>
       <w:r>
         <w:t xml:space="preserve">We do not have pre-construction data on runoff for agricultural fields that were converted to wetlands so we use </w:t>
@@ -1979,6 +2142,83 @@
         <w:t xml:space="preserve">. </w:t>
       </w:r>
     </w:p>
+    <w:p>
+      <w:pPr>
+        <w:rPr>
+          <w:b/>
+          <w:bCs/>
+          <w:u w:val="single"/>
+        </w:rPr>
+      </w:pPr>
+      <w:r>
+        <w:rPr>
+          <w:b/>
+          <w:bCs/>
+          <w:u w:val="single"/>
+        </w:rPr>
+        <w:t>2.4 Statistical Analysis</w:t>
+      </w:r>
+    </w:p>
+    <w:p/>
+    <w:p/>
+    <w:p/>
+    <w:p>
+      <w:pPr>
+        <w:rPr>
+          <w:b/>
+          <w:bCs/>
+        </w:rPr>
+      </w:pPr>
+      <w:r>
+        <w:rPr>
+          <w:b/>
+          <w:bCs/>
+        </w:rPr>
+        <w:t>3</w:t>
+      </w:r>
+      <w:r>
+        <w:rPr>
+          <w:b/>
+          <w:bCs/>
+        </w:rPr>
+        <w:t xml:space="preserve">. </w:t>
+      </w:r>
+      <w:r>
+        <w:rPr>
+          <w:b/>
+          <w:bCs/>
+        </w:rPr>
+        <w:t>Results</w:t>
+      </w:r>
+      <w:r>
+        <w:rPr>
+          <w:b/>
+          <w:bCs/>
+        </w:rPr>
+        <w:t xml:space="preserve">: </w:t>
+      </w:r>
+    </w:p>
+    <w:p>
+      <w:r>
+        <w:t>Researchers observed net nutrient filtration by a vast majority of Projects, but there was a large range in the total and per-area mass of nutrients filtered both between Projects and across years. In the 23 Projects with sufficient data to measure nutrient filtration, researchers only observed net annual Total P release in two Projects and net annual Total N release in three Projects across all years monitored (Table 5). The filtration of P by H2Ohio wetlands ranged from –11 lbs./year to 1732 lbs./year, with a mean (± standard deviation) of 113 lbs./year (±280), and a median of 25</w:t>
+      </w:r>
+    </w:p>
+    <w:p>
+      <w:r>
+        <w:t>lbs./year. The filtration of N by H2Ohio wetlands ranged from -549 lbs./year to 7345 lbs./year, with a mean (± standard deviation) of 1416 lbs./year (±1812) and a median of 711 lbs./year</w:t>
+      </w:r>
+    </w:p>
+    <w:p>
+      <w:r>
+        <w:t>On an annual basis, most Projects were net sinks for nutrients, even if they experienced nutrient release in some months. Of the 528 Project-months (unique combinations of project and month) with nutrient budgets, 60% (313 Project-months) indicated net filtration of P, 13% (72 Project-months) indicated net release of P, and 27% (143 Project-months) indicated no net release or filtration of P. Within that same dataset, 64% (336 Project-months) indicated net retention of N, 9% (49 Project-months) indicated net release of N, and 27% (143 Project-months) indicated no net release or filtration of N. For the vast majority of Projects, filtration outweighed release in terms of both total mass and number of months. Multiple factors may drive transient nutrient release events including soil conditions (particularly oxygen availability and redox status), as well as the timing and volume of connections to downstream systems (see Winter Dynamics, Soil Chemistry, and Hydrologic Management sections). Cumulative filtration in lbs. of both TP and TN, across all projects, occurred primarily during spring (March through May) and summer (June through August), with 38% of TP and 45% of</w:t>
+      </w:r>
+    </w:p>
+    <w:p>
+      <w:r>
+        <w:t>TN filtered in the spring and 38% of TP and 36% of TN filtered in the summer. This pattern likely exists because the greatest nutrient loads are delivered during spring rain events. The same pattern is true for dissolved nutrients. Of the total annual filtration of dissolved nutrients, 34% of DRP is processed in the spring and 39% in the summer, 44% of nitrite+nitrate is processed in the spring and 38% in the summer, and 18% of total ammonium nitrogen (NH4) is processed in the spring and 58% in the summer.</w:t>
+      </w:r>
+    </w:p>
+    <w:p/>
     <w:sectPr>
       <w:pgSz w:w="12240" w:h="15840"/>
       <w:pgMar w:top="1440" w:right="1440" w:bottom="1440" w:left="1440" w:header="720" w:footer="720" w:gutter="0"/>
@@ -1989,6 +2229,56 @@
 </w:document>
 </file>
 
+<file path=word/endnotes.xml><?xml version="1.0" encoding="utf-8"?>
+<w:endnotes xmlns:wpc="http://schemas.microsoft.com/office/word/2010/wordprocessingCanvas" xmlns:cx="http://schemas.microsoft.com/office/drawing/2014/chartex" xmlns:cx1="http://schemas.microsoft.com/office/drawing/2015/9/8/chartex" xmlns:cx2="http://schemas.microsoft.com/office/drawing/2015/10/21/chartex" xmlns:cx3="http://schemas.microsoft.com/office/drawing/2016/5/9/chartex" xmlns:cx4="http://schemas.microsoft.com/office/drawing/2016/5/10/chartex" xmlns:cx5="http://schemas.microsoft.com/office/drawing/2016/5/11/chartex" xmlns:cx6="http://schemas.microsoft.com/office/drawing/2016/5/12/chartex" xmlns:cx7="http://schemas.microsoft.com/office/drawing/2016/5/13/chartex" xmlns:cx8="http://schemas.microsoft.com/office/drawing/2016/5/14/chartex" xmlns:mc="http://schemas.openxmlformats.org/markup-compatibility/2006" xmlns:aink="http://schemas.microsoft.com/office/drawing/2016/ink" xmlns:am3d="http://schemas.microsoft.com/office/drawing/2017/model3d" xmlns:o="urn:schemas-microsoft-com:office:office" xmlns:oel="http://schemas.microsoft.com/office/2019/extlst" xmlns:r="http://schemas.openxmlformats.org/officeDocument/2006/relationships" xmlns:m="http://schemas.openxmlformats.org/officeDocument/2006/math" xmlns:v="urn:schemas-microsoft-com:vml" xmlns:wp14="http://schemas.microsoft.com/office/word/2010/wordprocessingDrawing" xmlns:wp="http://schemas.openxmlformats.org/drawingml/2006/wordprocessingDrawing" xmlns:w10="urn:schemas-microsoft-com:office:word" xmlns:w="http://schemas.openxmlformats.org/wordprocessingml/2006/main" xmlns:w14="http://schemas.microsoft.com/office/word/2010/wordml" xmlns:w15="http://schemas.microsoft.com/office/word/2012/wordml" xmlns:w16cex="http://schemas.microsoft.com/office/word/2018/wordml/cex" xmlns:w16cid="http://schemas.microsoft.com/office/word/2016/wordml/cid" xmlns:w16="http://schemas.microsoft.com/office/word/2018/wordml" xmlns:w16du="http://schemas.microsoft.com/office/word/2023/wordml/word16du" xmlns:w16sdtdh="http://schemas.microsoft.com/office/word/2020/wordml/sdtdatahash" xmlns:w16sdtfl="http://schemas.microsoft.com/office/word/2024/wordml/sdtformatlock" xmlns:w16se="http://schemas.microsoft.com/office/word/2015/wordml/symex" xmlns:wpg="http://schemas.microsoft.com/office/word/2010/wordprocessingGroup" xmlns:wpi="http://schemas.microsoft.com/office/word/2010/wordprocessingInk" xmlns:wne="http://schemas.microsoft.com/office/word/2006/wordml" xmlns:wps="http://schemas.microsoft.com/office/word/2010/wordprocessingShape" mc:Ignorable="w14 w15 w16se w16cid w16 w16cex w16sdtdh w16sdtfl w16du wp14">
+  <w:endnote w:type="separator" w:id="-1">
+    <w:p>
+      <w:pPr>
+        <w:spacing w:after="0" w:line="240" w:lineRule="auto"/>
+      </w:pPr>
+      <w:r>
+        <w:separator/>
+      </w:r>
+    </w:p>
+  </w:endnote>
+  <w:endnote w:type="continuationSeparator" w:id="0">
+    <w:p>
+      <w:pPr>
+        <w:spacing w:after="0" w:line="240" w:lineRule="auto"/>
+      </w:pPr>
+      <w:r>
+        <w:continuationSeparator/>
+      </w:r>
+    </w:p>
+  </w:endnote>
+</w:endnotes>
+</file>
+
+<file path=word/footnotes.xml><?xml version="1.0" encoding="utf-8"?>
+<w:footnotes xmlns:wpc="http://schemas.microsoft.com/office/word/2010/wordprocessingCanvas" xmlns:cx="http://schemas.microsoft.com/office/drawing/2014/chartex" xmlns:cx1="http://schemas.microsoft.com/office/drawing/2015/9/8/chartex" xmlns:cx2="http://schemas.microsoft.com/office/drawing/2015/10/21/chartex" xmlns:cx3="http://schemas.microsoft.com/office/drawing/2016/5/9/chartex" xmlns:cx4="http://schemas.microsoft.com/office/drawing/2016/5/10/chartex" xmlns:cx5="http://schemas.microsoft.com/office/drawing/2016/5/11/chartex" xmlns:cx6="http://schemas.microsoft.com/office/drawing/2016/5/12/chartex" xmlns:cx7="http://schemas.microsoft.com/office/drawing/2016/5/13/chartex" xmlns:cx8="http://schemas.microsoft.com/office/drawing/2016/5/14/chartex" xmlns:mc="http://schemas.openxmlformats.org/markup-compatibility/2006" xmlns:aink="http://schemas.microsoft.com/office/drawing/2016/ink" xmlns:am3d="http://schemas.microsoft.com/office/drawing/2017/model3d" xmlns:o="urn:schemas-microsoft-com:office:office" xmlns:oel="http://schemas.microsoft.com/office/2019/extlst" xmlns:r="http://schemas.openxmlformats.org/officeDocument/2006/relationships" xmlns:m="http://schemas.openxmlformats.org/officeDocument/2006/math" xmlns:v="urn:schemas-microsoft-com:vml" xmlns:wp14="http://schemas.microsoft.com/office/word/2010/wordprocessingDrawing" xmlns:wp="http://schemas.openxmlformats.org/drawingml/2006/wordprocessingDrawing" xmlns:w10="urn:schemas-microsoft-com:office:word" xmlns:w="http://schemas.openxmlformats.org/wordprocessingml/2006/main" xmlns:w14="http://schemas.microsoft.com/office/word/2010/wordml" xmlns:w15="http://schemas.microsoft.com/office/word/2012/wordml" xmlns:w16cex="http://schemas.microsoft.com/office/word/2018/wordml/cex" xmlns:w16cid="http://schemas.microsoft.com/office/word/2016/wordml/cid" xmlns:w16="http://schemas.microsoft.com/office/word/2018/wordml" xmlns:w16du="http://schemas.microsoft.com/office/word/2023/wordml/word16du" xmlns:w16sdtdh="http://schemas.microsoft.com/office/word/2020/wordml/sdtdatahash" xmlns:w16sdtfl="http://schemas.microsoft.com/office/word/2024/wordml/sdtformatlock" xmlns:w16se="http://schemas.microsoft.com/office/word/2015/wordml/symex" xmlns:wpg="http://schemas.microsoft.com/office/word/2010/wordprocessingGroup" xmlns:wpi="http://schemas.microsoft.com/office/word/2010/wordprocessingInk" xmlns:wne="http://schemas.microsoft.com/office/word/2006/wordml" xmlns:wps="http://schemas.microsoft.com/office/word/2010/wordprocessingShape" mc:Ignorable="w14 w15 w16se w16cid w16 w16cex w16sdtdh w16sdtfl w16du wp14">
+  <w:footnote w:type="separator" w:id="-1">
+    <w:p>
+      <w:pPr>
+        <w:spacing w:after="0" w:line="240" w:lineRule="auto"/>
+      </w:pPr>
+      <w:r>
+        <w:separator/>
+      </w:r>
+    </w:p>
+  </w:footnote>
+  <w:footnote w:type="continuationSeparator" w:id="0">
+    <w:p>
+      <w:pPr>
+        <w:spacing w:after="0" w:line="240" w:lineRule="auto"/>
+      </w:pPr>
+      <w:r>
+        <w:continuationSeparator/>
+      </w:r>
+    </w:p>
+  </w:footnote>
+</w:footnotes>
+</file>
+
 <file path=word/numbering.xml><?xml version="1.0" encoding="utf-8"?>
 <w:numbering xmlns:wpc="http://schemas.microsoft.com/office/word/2010/wordprocessingCanvas" xmlns:cx="http://schemas.microsoft.com/office/drawing/2014/chartex" xmlns:cx1="http://schemas.microsoft.com/office/drawing/2015/9/8/chartex" xmlns:cx2="http://schemas.microsoft.com/office/drawing/2015/10/21/chartex" xmlns:cx3="http://schemas.microsoft.com/office/drawing/2016/5/9/chartex" xmlns:cx4="http://schemas.microsoft.com/office/drawing/2016/5/10/chartex" xmlns:cx5="http://schemas.microsoft.com/office/drawing/2016/5/11/chartex" xmlns:cx6="http://schemas.microsoft.com/office/drawing/2016/5/12/chartex" xmlns:cx7="http://schemas.microsoft.com/office/drawing/2016/5/13/chartex" xmlns:cx8="http://schemas.microsoft.com/office/drawing/2016/5/14/chartex" xmlns:mc="http://schemas.openxmlformats.org/markup-compatibility/2006" xmlns:aink="http://schemas.microsoft.com/office/drawing/2016/ink" xmlns:am3d="http://schemas.microsoft.com/office/drawing/2017/model3d" xmlns:o="urn:schemas-microsoft-com:office:office" xmlns:oel="http://schemas.microsoft.com/office/2019/extlst" xmlns:r="http://schemas.openxmlformats.org/officeDocument/2006/relationships" xmlns:m="http://schemas.openxmlformats.org/officeDocument/2006/math" xmlns:v="urn:schemas-microsoft-com:vml" xmlns:wp14="http://schemas.microsoft.com/office/word/2010/wordprocessingDrawing" xmlns:wp="http://schemas.openxmlformats.org/drawingml/2006/wordprocessingDrawing" xmlns:w10="urn:schemas-microsoft-com:office:word" xmlns:w="http://schemas.openxmlformats.org/wordprocessingml/2006/main" xmlns:w14="http://schemas.microsoft.com/office/word/2010/wordml" xmlns:w15="http://schemas.microsoft.com/office/word/2012/wordml" xmlns:w16cex="http://schemas.microsoft.com/office/word/2018/wordml/cex" xmlns:w16cid="http://schemas.microsoft.com/office/word/2016/wordml/cid" xmlns:w16="http://schemas.microsoft.com/office/word/2018/wordml" xmlns:w16du="http://schemas.microsoft.com/office/word/2023/wordml/word16du" xmlns:w16sdtdh="http://schemas.microsoft.com/office/word/2020/wordml/sdtdatahash" xmlns:w16sdtfl="http://schemas.microsoft.com/office/word/2024/wordml/sdtformatlock" xmlns:w16se="http://schemas.microsoft.com/office/word/2015/wordml/symex" xmlns:wpg="http://schemas.microsoft.com/office/word/2010/wordprocessingGroup" xmlns:wpi="http://schemas.microsoft.com/office/word/2010/wordprocessingInk" xmlns:wne="http://schemas.microsoft.com/office/word/2006/wordml" xmlns:wps="http://schemas.microsoft.com/office/word/2010/wordprocessingShape" mc:Ignorable="w14 w15 w16se w16cid w16 w16cex w16sdtdh w16sdtfl w16du wp14">
   <w:abstractNum w:abstractNumId="0" w15:restartNumberingAfterBreak="0">
@@ -2007,7 +2297,7 @@
         <w:rFonts w:ascii="Symbol" w:hAnsi="Symbol" w:hint="default"/>
       </w:rPr>
     </w:lvl>
-    <w:lvl w:ilvl="1" w:tplc="04090003" w:tentative="1">
+    <w:lvl w:ilvl="1" w:tplc="04090003">
       <w:start w:val="1"/>
       <w:numFmt w:val="bullet"/>
       <w:lvlText w:val="o"/>
@@ -2471,7 +2761,7 @@
         <w:rFonts w:ascii="Courier New" w:hAnsi="Courier New" w:cs="Courier New" w:hint="default"/>
       </w:rPr>
     </w:lvl>
-    <w:lvl w:ilvl="2" w:tplc="04090005" w:tentative="1">
+    <w:lvl w:ilvl="2" w:tplc="04090005">
       <w:start w:val="1"/>
       <w:numFmt w:val="bullet"/>
       <w:lvlText w:val=""/>
@@ -2483,7 +2773,7 @@
         <w:rFonts w:ascii="Wingdings" w:hAnsi="Wingdings" w:hint="default"/>
       </w:rPr>
     </w:lvl>
-    <w:lvl w:ilvl="3" w:tplc="04090001" w:tentative="1">
+    <w:lvl w:ilvl="3" w:tplc="04090001">
       <w:start w:val="1"/>
       <w:numFmt w:val="bullet"/>
       <w:lvlText w:val=""/>
@@ -3966,6 +4256,50 @@
       <w:u w:val="single"/>
     </w:rPr>
   </w:style>
+  <w:style w:type="paragraph" w:styleId="Header">
+    <w:name w:val="header"/>
+    <w:basedOn w:val="Normal"/>
+    <w:link w:val="HeaderChar"/>
+    <w:uiPriority w:val="99"/>
+    <w:unhideWhenUsed/>
+    <w:rsid w:val="003115EA"/>
+    <w:pPr>
+      <w:tabs>
+        <w:tab w:val="center" w:pos="4680"/>
+        <w:tab w:val="right" w:pos="9360"/>
+      </w:tabs>
+      <w:spacing w:after="0" w:line="240" w:lineRule="auto"/>
+    </w:pPr>
+  </w:style>
+  <w:style w:type="character" w:customStyle="1" w:styleId="HeaderChar">
+    <w:name w:val="Header Char"/>
+    <w:basedOn w:val="DefaultParagraphFont"/>
+    <w:link w:val="Header"/>
+    <w:uiPriority w:val="99"/>
+    <w:rsid w:val="003115EA"/>
+  </w:style>
+  <w:style w:type="paragraph" w:styleId="Footer">
+    <w:name w:val="footer"/>
+    <w:basedOn w:val="Normal"/>
+    <w:link w:val="FooterChar"/>
+    <w:uiPriority w:val="99"/>
+    <w:unhideWhenUsed/>
+    <w:rsid w:val="003115EA"/>
+    <w:pPr>
+      <w:tabs>
+        <w:tab w:val="center" w:pos="4680"/>
+        <w:tab w:val="right" w:pos="9360"/>
+      </w:tabs>
+      <w:spacing w:after="0" w:line="240" w:lineRule="auto"/>
+    </w:pPr>
+  </w:style>
+  <w:style w:type="character" w:customStyle="1" w:styleId="FooterChar">
+    <w:name w:val="Footer Char"/>
+    <w:basedOn w:val="DefaultParagraphFont"/>
+    <w:link w:val="Footer"/>
+    <w:uiPriority w:val="99"/>
+    <w:rsid w:val="003115EA"/>
+  </w:style>
 </w:styles>
 </file>
 

</xml_diff>

<commit_message>
added TN for model
</commit_message>
<xml_diff>
--- a/Annual Report Manuscript Outline.docx
+++ b/Annual Report Manuscript Outline.docx
@@ -905,7 +905,28 @@
         </w:numPr>
       </w:pPr>
       <w:r>
-        <w:t>Table 5. Scenario comparison scaling up nutrient retention numbers to address Maumee River Watershed goals</w:t>
+        <w:t xml:space="preserve">Table 5. Model results for </w:t>
+      </w:r>
+      <w:r>
+        <w:t>logistic regression</w:t>
+      </w:r>
+    </w:p>
+    <w:p>
+      <w:pPr>
+        <w:pStyle w:val="ListParagraph"/>
+        <w:numPr>
+          <w:ilvl w:val="0"/>
+          <w:numId w:val="5"/>
+        </w:numPr>
+      </w:pPr>
+      <w:r>
+        <w:t xml:space="preserve">Table </w:t>
+      </w:r>
+      <w:r>
+        <w:t>6</w:t>
+      </w:r>
+      <w:r>
+        <w:t>. Scenario comparison scaling up nutrient retention numbers to address Maumee River Watershed goals</w:t>
       </w:r>
     </w:p>
     <w:p/>
@@ -925,6 +946,7 @@
         </w:numPr>
       </w:pPr>
       <w:r>
+        <w:lastRenderedPageBreak/>
         <w:t>Table of individual project characteristics</w:t>
       </w:r>
     </w:p>
@@ -937,7 +959,6 @@
         </w:numPr>
       </w:pPr>
       <w:r>
-        <w:lastRenderedPageBreak/>
         <w:t>Nutrient budget methods across all projects</w:t>
       </w:r>
     </w:p>

</xml_diff>

<commit_message>
Adding draft figures in. Also finished map code
</commit_message>
<xml_diff>
--- a/Annual Report Manuscript Outline.docx
+++ b/Annual Report Manuscript Outline.docx
@@ -100,13 +100,29 @@
         </w:numPr>
       </w:pPr>
       <w:r>
-        <w:t>Talk about watershed. Talk about</w:t>
+        <w:t xml:space="preserve">Talk about </w:t>
+      </w:r>
+      <w:proofErr w:type="gramStart"/>
+      <w:r>
+        <w:t>watershed</w:t>
+      </w:r>
+      <w:proofErr w:type="gramEnd"/>
+      <w:r>
+        <w:t>. Talk about</w:t>
       </w:r>
       <w:r>
         <w:t xml:space="preserve"> Ohio/</w:t>
       </w:r>
       <w:r>
-        <w:t xml:space="preserve">Maumee. Talk about how ag it is. </w:t>
+        <w:t xml:space="preserve">Maumee. Talk about how </w:t>
+      </w:r>
+      <w:proofErr w:type="gramStart"/>
+      <w:r>
+        <w:t>ag</w:t>
+      </w:r>
+      <w:proofErr w:type="gramEnd"/>
+      <w:r>
+        <w:t xml:space="preserve"> it is. </w:t>
       </w:r>
     </w:p>
     <w:p>
@@ -184,8 +200,13 @@
         </w:numPr>
       </w:pPr>
       <w:r>
-        <w:t>Statistics stuff</w:t>
-      </w:r>
+        <w:t xml:space="preserve">Statistics </w:t>
+      </w:r>
+      <w:proofErr w:type="gramStart"/>
+      <w:r>
+        <w:t>stuff</w:t>
+      </w:r>
+      <w:proofErr w:type="gramEnd"/>
     </w:p>
     <w:p>
       <w:r>
@@ -438,7 +459,15 @@
         </w:numPr>
       </w:pPr>
       <w:r>
-        <w:t xml:space="preserve">What other variables matter? Specifically variables we don’t have data for on the monthly time scale. </w:t>
+        <w:t xml:space="preserve">What other variables matter? </w:t>
+      </w:r>
+      <w:proofErr w:type="gramStart"/>
+      <w:r>
+        <w:t>Specifically</w:t>
+      </w:r>
+      <w:proofErr w:type="gramEnd"/>
+      <w:r>
+        <w:t xml:space="preserve"> variables we don’t have data for on the monthly time scale. </w:t>
       </w:r>
     </w:p>
     <w:p>
@@ -511,12 +540,17 @@
         <w:t xml:space="preserve">Concentration </w:t>
       </w:r>
       <w:proofErr w:type="spellStart"/>
+      <w:proofErr w:type="gramStart"/>
       <w:r>
         <w:t>affects</w:t>
       </w:r>
       <w:proofErr w:type="spellEnd"/>
       <w:r>
-        <w:t xml:space="preserve"> on nutrient retention</w:t>
+        <w:t xml:space="preserve"> on</w:t>
+      </w:r>
+      <w:proofErr w:type="gramEnd"/>
+      <w:r>
+        <w:t xml:space="preserve"> nutrient retention</w:t>
       </w:r>
     </w:p>
     <w:p>
@@ -555,6 +589,66 @@
       </w:r>
     </w:p>
     <w:p>
+      <w:r>
+        <w:rPr>
+          <w:noProof/>
+        </w:rPr>
+        <w:drawing>
+          <wp:inline distT="0" distB="0" distL="0" distR="0" wp14:anchorId="7EB4BAEC" wp14:editId="7D7AF3D2">
+            <wp:extent cx="3105150" cy="2691765"/>
+            <wp:effectExtent l="0" t="0" r="0" b="0"/>
+            <wp:docPr id="952668208" name="Picture 8"/>
+            <wp:cNvGraphicFramePr>
+              <a:graphicFrameLocks xmlns:a="http://schemas.openxmlformats.org/drawingml/2006/main" noChangeAspect="1"/>
+            </wp:cNvGraphicFramePr>
+            <a:graphic xmlns:a="http://schemas.openxmlformats.org/drawingml/2006/main">
+              <a:graphicData uri="http://schemas.openxmlformats.org/drawingml/2006/picture">
+                <pic:pic xmlns:pic="http://schemas.openxmlformats.org/drawingml/2006/picture">
+                  <pic:nvPicPr>
+                    <pic:cNvPr id="0" name="Picture 5"/>
+                    <pic:cNvPicPr>
+                      <a:picLocks noChangeAspect="1" noChangeArrowheads="1"/>
+                    </pic:cNvPicPr>
+                  </pic:nvPicPr>
+                  <pic:blipFill rotWithShape="1">
+                    <a:blip r:embed="rId7">
+                      <a:extLst>
+                        <a:ext uri="{28A0092B-C50C-407E-A947-70E740481C1C}">
+                          <a14:useLocalDpi xmlns:a14="http://schemas.microsoft.com/office/drawing/2010/main" val="0"/>
+                        </a:ext>
+                      </a:extLst>
+                    </a:blip>
+                    <a:srcRect l="25175" r="27109"/>
+                    <a:stretch>
+                      <a:fillRect/>
+                    </a:stretch>
+                  </pic:blipFill>
+                  <pic:spPr bwMode="auto">
+                    <a:xfrm>
+                      <a:off x="0" y="0"/>
+                      <a:ext cx="3114570" cy="2699931"/>
+                    </a:xfrm>
+                    <a:prstGeom prst="rect">
+                      <a:avLst/>
+                    </a:prstGeom>
+                    <a:noFill/>
+                    <a:ln>
+                      <a:noFill/>
+                    </a:ln>
+                    <a:extLst>
+                      <a:ext uri="{53640926-AAD7-44D8-BBD7-CCE9431645EC}">
+                        <a14:shadowObscured xmlns:a14="http://schemas.microsoft.com/office/drawing/2010/main"/>
+                      </a:ext>
+                    </a:extLst>
+                  </pic:spPr>
+                </pic:pic>
+              </a:graphicData>
+            </a:graphic>
+          </wp:inline>
+        </w:drawing>
+      </w:r>
+    </w:p>
+    <w:p>
       <w:pPr>
         <w:pStyle w:val="ListParagraph"/>
         <w:numPr>
@@ -563,7 +657,13 @@
         </w:numPr>
       </w:pPr>
       <w:r>
-        <w:t>Fig 2. TP</w:t>
+        <w:t xml:space="preserve">Fig 2. </w:t>
+      </w:r>
+      <w:r>
+        <w:t xml:space="preserve">Monthly </w:t>
+      </w:r>
+      <w:r>
+        <w:t>TP</w:t>
       </w:r>
       <w:r>
         <w:t>/TN</w:t>
@@ -604,7 +704,7 @@
                     </pic:cNvPicPr>
                   </pic:nvPicPr>
                   <pic:blipFill>
-                    <a:blip r:embed="rId7">
+                    <a:blip r:embed="rId8">
                       <a:extLst>
                         <a:ext uri="{28A0092B-C50C-407E-A947-70E740481C1C}">
                           <a14:useLocalDpi xmlns:a14="http://schemas.microsoft.com/office/drawing/2010/main" val="0"/>
@@ -678,7 +778,7 @@
                     </pic:cNvPicPr>
                   </pic:nvPicPr>
                   <pic:blipFill>
-                    <a:blip r:embed="rId8">
+                    <a:blip r:embed="rId9">
                       <a:extLst>
                         <a:ext uri="{28A0092B-C50C-407E-A947-70E740481C1C}">
                           <a14:useLocalDpi xmlns:a14="http://schemas.microsoft.com/office/drawing/2010/main" val="0"/>
@@ -787,7 +887,15 @@
         <w:t xml:space="preserve"> predicted by low incoming concentrations</w:t>
       </w:r>
       <w:r>
-        <w:t xml:space="preserve"> (likely influence is shared by low concentrations an dilution </w:t>
+        <w:t xml:space="preserve"> (likely influence is shared by low concentrations </w:t>
+      </w:r>
+      <w:proofErr w:type="gramStart"/>
+      <w:r>
+        <w:t>an</w:t>
+      </w:r>
+      <w:proofErr w:type="gramEnd"/>
+      <w:r>
+        <w:t xml:space="preserve"> dilution </w:t>
       </w:r>
       <w:r>
         <w:t>during high flow periods which don’t necessarily correlate with high flows to individual wetlands</w:t>
@@ -831,7 +939,7 @@
                     </pic:cNvPicPr>
                   </pic:nvPicPr>
                   <pic:blipFill>
-                    <a:blip r:embed="rId9">
+                    <a:blip r:embed="rId10">
                       <a:extLst>
                         <a:ext uri="{28A0092B-C50C-407E-A947-70E740481C1C}">
                           <a14:useLocalDpi xmlns:a14="http://schemas.microsoft.com/office/drawing/2010/main" val="0"/>
@@ -878,6 +986,59 @@
         <w:t xml:space="preserve"> Change over time (or lack thereof)</w:t>
       </w:r>
     </w:p>
+    <w:p>
+      <w:r>
+        <w:rPr>
+          <w:noProof/>
+        </w:rPr>
+        <w:lastRenderedPageBreak/>
+        <w:drawing>
+          <wp:inline distT="0" distB="0" distL="0" distR="0" wp14:anchorId="69F01D51" wp14:editId="4FDB2478">
+            <wp:extent cx="4654550" cy="3914053"/>
+            <wp:effectExtent l="0" t="0" r="0" b="0"/>
+            <wp:docPr id="143571061" name="Picture 10"/>
+            <wp:cNvGraphicFramePr>
+              <a:graphicFrameLocks xmlns:a="http://schemas.openxmlformats.org/drawingml/2006/main" noChangeAspect="1"/>
+            </wp:cNvGraphicFramePr>
+            <a:graphic xmlns:a="http://schemas.openxmlformats.org/drawingml/2006/main">
+              <a:graphicData uri="http://schemas.openxmlformats.org/drawingml/2006/picture">
+                <pic:pic xmlns:pic="http://schemas.openxmlformats.org/drawingml/2006/picture">
+                  <pic:nvPicPr>
+                    <pic:cNvPr id="0" name="Picture 6"/>
+                    <pic:cNvPicPr>
+                      <a:picLocks noChangeAspect="1" noChangeArrowheads="1"/>
+                    </pic:cNvPicPr>
+                  </pic:nvPicPr>
+                  <pic:blipFill>
+                    <a:blip r:embed="rId11">
+                      <a:extLst>
+                        <a:ext uri="{28A0092B-C50C-407E-A947-70E740481C1C}">
+                          <a14:useLocalDpi xmlns:a14="http://schemas.microsoft.com/office/drawing/2010/main" val="0"/>
+                        </a:ext>
+                      </a:extLst>
+                    </a:blip>
+                    <a:srcRect/>
+                    <a:stretch>
+                      <a:fillRect/>
+                    </a:stretch>
+                  </pic:blipFill>
+                  <pic:spPr bwMode="auto">
+                    <a:xfrm>
+                      <a:off x="0" y="0"/>
+                      <a:ext cx="4664834" cy="3922701"/>
+                    </a:xfrm>
+                    <a:prstGeom prst="rect">
+                      <a:avLst/>
+                    </a:prstGeom>
+                    <a:noFill/>
+                  </pic:spPr>
+                </pic:pic>
+              </a:graphicData>
+            </a:graphic>
+          </wp:inline>
+        </w:drawing>
+      </w:r>
+    </w:p>
     <w:p/>
     <w:p>
       <w:r>
@@ -1111,6 +1272,7 @@
     <w:p/>
     <w:p>
       <w:r>
+        <w:lastRenderedPageBreak/>
         <w:t xml:space="preserve">Supplemental Material: </w:t>
       </w:r>
     </w:p>
@@ -2104,7 +2266,7 @@
       <w:r>
         <w:t>Daily solar radiation (MJ/m²/day) was sourced from the National Aeronautics and Space Administration (NASA) Langley Research Center's Prediction Of Worldwide Energy Resources (</w:t>
       </w:r>
-      <w:hyperlink r:id="rId10">
+      <w:hyperlink r:id="rId12">
         <w:r>
           <w:rPr>
             <w:rStyle w:val="Hyperlink"/>
@@ -2242,7 +2404,15 @@
         <w:t>Nutrient concentration</w:t>
       </w:r>
       <w:r>
-        <w:t xml:space="preserve"> at the inflow and outflow of each project</w:t>
+        <w:t xml:space="preserve"> </w:t>
+      </w:r>
+      <w:proofErr w:type="gramStart"/>
+      <w:r>
+        <w:t>at</w:t>
+      </w:r>
+      <w:proofErr w:type="gramEnd"/>
+      <w:r>
+        <w:t xml:space="preserve"> the inflow and outflow of each project</w:t>
       </w:r>
       <w:r>
         <w:t xml:space="preserve"> were sampled at least monthly for all Projects except </w:t>
@@ -2469,7 +2639,15 @@
     </w:p>
     <w:p>
       <w:r>
-        <w:t>Researchers observed net nutrient filtration by a vast majority of Projects, but there was a large range in the total and per-area mass of nutrients filtered both between Projects and across years. In the 23 Projects with sufficient data to measure nutrient filtration, researchers only observed net annual Total P release in two Projects and net annual Total N release in three Projects across all years monitored (Table 5). The filtration of P by H2Ohio wetlands ranged from –11 lbs./year to 1732 lbs./year, with a mean (± standard deviation) of 113 lbs./year (±280), and a median of 25</w:t>
+        <w:t xml:space="preserve">Researchers observed net nutrient filtration by a vast majority of Projects, but there was a large range in the total and per-area mass of nutrients filtered both between Projects and across years. In the 23 Projects with sufficient data to measure nutrient filtration, researchers only observed net annual Total P release in two Projects and net annual Total N release in three Projects across all </w:t>
+      </w:r>
+      <w:proofErr w:type="gramStart"/>
+      <w:r>
+        <w:t>years</w:t>
+      </w:r>
+      <w:proofErr w:type="gramEnd"/>
+      <w:r>
+        <w:t xml:space="preserve"> monitored (Table 5). The filtration of P by H2Ohio wetlands ranged from –11 lbs./year to 1732 lbs./year, with a mean (± standard deviation) of 113 lbs./year (±280), and a median of 25</w:t>
       </w:r>
     </w:p>
     <w:p>
@@ -2479,7 +2657,15 @@
     </w:p>
     <w:p>
       <w:r>
-        <w:t>On an annual basis, most Projects were net sinks for nutrients, even if they experienced nutrient release in some months. Of the 528 Project-months (unique combinations of project and month) with nutrient budgets, 60% (313 Project-months) indicated net filtration of P, 13% (72 Project-months) indicated net release of P, and 27% (143 Project-months) indicated no net release or filtration of P. Within that same dataset, 64% (336 Project-months) indicated net retention of N, 9% (49 Project-months) indicated net release of N, and 27% (143 Project-months) indicated no net release or filtration of N. For the vast majority of Projects, filtration outweighed release in terms of both total mass and number of months. Multiple factors may drive transient nutrient release events including soil conditions (particularly oxygen availability and redox status), as well as the timing and volume of connections to downstream systems (see Winter Dynamics, Soil Chemistry, and Hydrologic Management sections). Cumulative filtration in lbs. of both TP and TN, across all projects, occurred primarily during spring (March through May) and summer (June through August), with 38% of TP and 45% of</w:t>
+        <w:t xml:space="preserve">On an annual basis, most Projects were net sinks for nutrients, even if they experienced nutrient release in some months. Of the 528 Project-months (unique combinations of project and month) with nutrient budgets, 60% (313 Project-months) indicated net filtration of P, 13% (72 Project-months) indicated net release of P, and 27% (143 Project-months) indicated no net release or filtration of P. Within that same dataset, 64% (336 Project-months) indicated net retention of N, 9% (49 Project-months) indicated net release of N, and 27% (143 Project-months) indicated no net release or filtration of N. For </w:t>
+      </w:r>
+      <w:proofErr w:type="gramStart"/>
+      <w:r>
+        <w:t>the vast majority of</w:t>
+      </w:r>
+      <w:proofErr w:type="gramEnd"/>
+      <w:r>
+        <w:t xml:space="preserve"> Projects, filtration outweighed release in terms of both total mass and number of months. Multiple factors may drive transient nutrient release events including soil conditions (particularly oxygen availability and redox status), as well as the timing and volume of connections to downstream systems (see Winter Dynamics, Soil Chemistry, and Hydrologic Management sections). Cumulative filtration in lbs. of both TP and TN, across all projects, occurred primarily during spring (March through May) and summer (June through August), with 38% of TP and 45% of</w:t>
       </w:r>
     </w:p>
     <w:p>

</xml_diff>

<commit_message>
updates to code and manuscript
</commit_message>
<xml_diff>
--- a/Annual Report Manuscript Outline.docx
+++ b/Annual Report Manuscript Outline.docx
@@ -81,13 +81,8 @@
       <w:r>
         <w:t xml:space="preserve">Is a big model worth it? </w:t>
       </w:r>
-      <w:proofErr w:type="gramStart"/>
-      <w:r>
-        <w:t>Should</w:t>
-      </w:r>
-      <w:proofErr w:type="gramEnd"/>
-      <w:r>
-        <w:t xml:space="preserve"> we just do separate analyses? Should those analyses go in this paper? </w:t>
+      <w:r>
+        <w:t xml:space="preserve">Should we just do separate analyses? Should those analyses go in this paper? </w:t>
       </w:r>
     </w:p>
     <w:p>
@@ -99,15 +94,7 @@
         </w:numPr>
       </w:pPr>
       <w:r>
-        <w:t xml:space="preserve">Is this worth including? The data included is limited and different </w:t>
-      </w:r>
-      <w:proofErr w:type="gramStart"/>
-      <w:r>
-        <w:t>time</w:t>
-      </w:r>
-      <w:proofErr w:type="gramEnd"/>
-      <w:r>
-        <w:t xml:space="preserve"> and spatial scales make it kind of weird to put together.</w:t>
+        <w:t>Is this worth including? The data included is limited and different time and spatial scales make it kind of weird to put together.</w:t>
       </w:r>
     </w:p>
     <w:p>
@@ -172,15 +159,7 @@
         <w:t xml:space="preserve">If we do include: </w:t>
       </w:r>
       <w:r>
-        <w:t xml:space="preserve">Additional </w:t>
-      </w:r>
-      <w:proofErr w:type="gramStart"/>
-      <w:r>
-        <w:t>data</w:t>
-      </w:r>
-      <w:proofErr w:type="gramEnd"/>
-      <w:r>
-        <w:t xml:space="preserve"> we could include? </w:t>
+        <w:t xml:space="preserve">Additional data we could include? </w:t>
       </w:r>
     </w:p>
     <w:p>
@@ -213,6 +192,102 @@
         <w:t xml:space="preserve"> be added?</w:t>
       </w:r>
     </w:p>
+    <w:p>
+      <w:pPr>
+        <w:pStyle w:val="ListParagraph"/>
+        <w:numPr>
+          <w:ilvl w:val="1"/>
+          <w:numId w:val="10"/>
+        </w:numPr>
+      </w:pPr>
+      <w:r>
+        <w:t xml:space="preserve">Project qualifiers?? </w:t>
+      </w:r>
+      <w:r>
+        <w:t xml:space="preserve">Pump/behaving differently? Inundation scheme? </w:t>
+      </w:r>
+    </w:p>
+    <w:p>
+      <w:pPr>
+        <w:pStyle w:val="ListParagraph"/>
+        <w:numPr>
+          <w:ilvl w:val="2"/>
+          <w:numId w:val="10"/>
+        </w:numPr>
+      </w:pPr>
+      <w:r>
+        <w:t>Hydrology categories</w:t>
+      </w:r>
+    </w:p>
+    <w:p>
+      <w:pPr>
+        <w:pStyle w:val="ListParagraph"/>
+        <w:numPr>
+          <w:ilvl w:val="2"/>
+          <w:numId w:val="10"/>
+        </w:numPr>
+      </w:pPr>
+      <w:r>
+        <w:t>THINK ABOUT THIS??</w:t>
+      </w:r>
+    </w:p>
+    <w:p/>
+    <w:p>
+      <w:r>
+        <w:t xml:space="preserve">Target Journal: </w:t>
+      </w:r>
+    </w:p>
+    <w:p>
+      <w:pPr>
+        <w:pStyle w:val="ListParagraph"/>
+        <w:numPr>
+          <w:ilvl w:val="0"/>
+          <w:numId w:val="13"/>
+        </w:numPr>
+        <w:rPr>
+          <w:sz w:val="28"/>
+          <w:szCs w:val="28"/>
+        </w:rPr>
+      </w:pPr>
+      <w:r>
+        <w:rPr>
+          <w:sz w:val="28"/>
+          <w:szCs w:val="28"/>
+        </w:rPr>
+        <w:t>Ecological Applications</w:t>
+      </w:r>
+      <w:r>
+        <w:rPr>
+          <w:sz w:val="28"/>
+          <w:szCs w:val="28"/>
+        </w:rPr>
+        <w:t xml:space="preserve"> (TARGET JOURNAL)</w:t>
+      </w:r>
+    </w:p>
+    <w:p>
+      <w:pPr>
+        <w:pStyle w:val="ListParagraph"/>
+        <w:numPr>
+          <w:ilvl w:val="0"/>
+          <w:numId w:val="13"/>
+        </w:numPr>
+      </w:pPr>
+      <w:r>
+        <w:t>Ecology</w:t>
+      </w:r>
+    </w:p>
+    <w:p>
+      <w:pPr>
+        <w:pStyle w:val="ListParagraph"/>
+        <w:numPr>
+          <w:ilvl w:val="0"/>
+          <w:numId w:val="13"/>
+        </w:numPr>
+      </w:pPr>
+      <w:r>
+        <w:t>Journal of Environmental Management</w:t>
+      </w:r>
+    </w:p>
     <w:p/>
     <w:p>
       <w:r>
@@ -255,49 +330,6 @@
         <w:t>Wetlands can feasibly contribute to nutrient retention goals.</w:t>
       </w:r>
     </w:p>
-    <w:p/>
-    <w:p>
-      <w:r>
-        <w:t xml:space="preserve">Analyses we can do with data we already have that we have not done yet: </w:t>
-      </w:r>
-    </w:p>
-    <w:p>
-      <w:pPr>
-        <w:pStyle w:val="ListParagraph"/>
-        <w:numPr>
-          <w:ilvl w:val="0"/>
-          <w:numId w:val="1"/>
-        </w:numPr>
-      </w:pPr>
-      <w:r>
-        <w:t>Some sort of analysis of nutrient release</w:t>
-      </w:r>
-    </w:p>
-    <w:p>
-      <w:pPr>
-        <w:pStyle w:val="ListParagraph"/>
-        <w:numPr>
-          <w:ilvl w:val="0"/>
-          <w:numId w:val="1"/>
-        </w:numPr>
-      </w:pPr>
-      <w:r>
-        <w:t>More structured analysis of nutrient concentration as a driver of retention</w:t>
-      </w:r>
-    </w:p>
-    <w:p>
-      <w:pPr>
-        <w:pStyle w:val="ListParagraph"/>
-        <w:numPr>
-          <w:ilvl w:val="1"/>
-          <w:numId w:val="1"/>
-        </w:numPr>
-      </w:pPr>
-      <w:r>
-        <w:t xml:space="preserve">Maybe looking at power of concentration as a predictor at each site individually? </w:t>
-      </w:r>
-    </w:p>
-    <w:p/>
     <w:p>
       <w:r>
         <w:t xml:space="preserve">Methods: </w:t>
@@ -312,29 +344,13 @@
         </w:numPr>
       </w:pPr>
       <w:r>
-        <w:t xml:space="preserve">Talk about </w:t>
-      </w:r>
-      <w:proofErr w:type="gramStart"/>
-      <w:r>
-        <w:t>watershed</w:t>
-      </w:r>
-      <w:proofErr w:type="gramEnd"/>
-      <w:r>
-        <w:t>. Talk about</w:t>
+        <w:t>Talk about watershed. Talk about</w:t>
       </w:r>
       <w:r>
         <w:t xml:space="preserve"> Ohio/</w:t>
       </w:r>
       <w:r>
-        <w:t xml:space="preserve">Maumee. Talk about how </w:t>
-      </w:r>
-      <w:proofErr w:type="gramStart"/>
-      <w:r>
-        <w:t>ag</w:t>
-      </w:r>
-      <w:proofErr w:type="gramEnd"/>
-      <w:r>
-        <w:t xml:space="preserve"> it is. </w:t>
+        <w:t xml:space="preserve">Maumee. Talk about how ag it is. </w:t>
       </w:r>
     </w:p>
     <w:p>
@@ -412,16 +428,12 @@
         </w:numPr>
       </w:pPr>
       <w:r>
-        <w:t xml:space="preserve">Statistics </w:t>
-      </w:r>
-      <w:proofErr w:type="gramStart"/>
-      <w:r>
-        <w:t>stuff</w:t>
-      </w:r>
-      <w:proofErr w:type="gramEnd"/>
-    </w:p>
-    <w:p>
-      <w:r>
+        <w:t>Statistics stuff</w:t>
+      </w:r>
+    </w:p>
+    <w:p>
+      <w:r>
+        <w:lastRenderedPageBreak/>
         <w:t xml:space="preserve">Results: </w:t>
       </w:r>
     </w:p>
@@ -434,7 +446,6 @@
         </w:numPr>
       </w:pPr>
       <w:r>
-        <w:lastRenderedPageBreak/>
         <w:t>Summary stats on retention across wetlands</w:t>
       </w:r>
     </w:p>
@@ -660,7 +671,7 @@
         </w:numPr>
       </w:pPr>
       <w:r>
-        <w:t>Annual LME model of retention</w:t>
+        <w:t>Summary stats on nutrient release</w:t>
       </w:r>
     </w:p>
     <w:p>
@@ -672,15 +683,7 @@
         </w:numPr>
       </w:pPr>
       <w:r>
-        <w:t xml:space="preserve">What other variables matter? </w:t>
-      </w:r>
-      <w:proofErr w:type="gramStart"/>
-      <w:r>
-        <w:t>Specifically</w:t>
-      </w:r>
-      <w:proofErr w:type="gramEnd"/>
-      <w:r>
-        <w:t xml:space="preserve"> variables we don’t have data for on the monthly time scale. </w:t>
+        <w:t>Range, seasonality, etc.</w:t>
       </w:r>
     </w:p>
     <w:p>
@@ -692,7 +695,7 @@
         </w:numPr>
       </w:pPr>
       <w:r>
-        <w:t>Summary stats on nutrient release</w:t>
+        <w:t>Concentration summary stats</w:t>
       </w:r>
     </w:p>
     <w:p>
@@ -704,7 +707,16 @@
         </w:numPr>
       </w:pPr>
       <w:r>
-        <w:t>Range, seasonality, etc.</w:t>
+        <w:t xml:space="preserve">How different are </w:t>
+      </w:r>
+      <w:r>
+        <w:t>concentrations across projects</w:t>
+      </w:r>
+      <w:r>
+        <w:t>/seasons</w:t>
+      </w:r>
+      <w:r>
+        <w:t>?</w:t>
       </w:r>
     </w:p>
     <w:p>
@@ -716,53 +728,7 @@
         </w:numPr>
       </w:pPr>
       <w:r>
-        <w:t>Concentration summary stats</w:t>
-      </w:r>
-    </w:p>
-    <w:p>
-      <w:pPr>
-        <w:pStyle w:val="ListParagraph"/>
-        <w:numPr>
-          <w:ilvl w:val="1"/>
-          <w:numId w:val="6"/>
-        </w:numPr>
-      </w:pPr>
-      <w:r>
-        <w:t xml:space="preserve">How different are </w:t>
-      </w:r>
-      <w:r>
-        <w:t>concentrations across projects</w:t>
-      </w:r>
-      <w:r>
-        <w:t>/seasons</w:t>
-      </w:r>
-      <w:r>
-        <w:t>?</w:t>
-      </w:r>
-    </w:p>
-    <w:p>
-      <w:pPr>
-        <w:pStyle w:val="ListParagraph"/>
-        <w:numPr>
-          <w:ilvl w:val="0"/>
-          <w:numId w:val="6"/>
-        </w:numPr>
-      </w:pPr>
-      <w:r>
-        <w:t xml:space="preserve">Concentration </w:t>
-      </w:r>
-      <w:proofErr w:type="spellStart"/>
-      <w:proofErr w:type="gramStart"/>
-      <w:r>
-        <w:t>affects</w:t>
-      </w:r>
-      <w:proofErr w:type="spellEnd"/>
-      <w:r>
-        <w:t xml:space="preserve"> on</w:t>
-      </w:r>
-      <w:proofErr w:type="gramEnd"/>
-      <w:r>
-        <w:t xml:space="preserve"> nutrient retention</w:t>
+        <w:t>Concentration affects on nutrient retention</w:t>
       </w:r>
     </w:p>
     <w:p>
@@ -860,6 +826,17 @@
         </w:drawing>
       </w:r>
     </w:p>
+    <w:p/>
+    <w:p/>
+    <w:p/>
+    <w:p/>
+    <w:p/>
+    <w:p/>
+    <w:p/>
+    <w:p/>
+    <w:p/>
+    <w:p/>
+    <w:p/>
     <w:p>
       <w:pPr>
         <w:pStyle w:val="ListParagraph"/>
@@ -892,17 +869,49 @@
       <w:r>
         <w:t xml:space="preserve"> concentration</w:t>
       </w:r>
+      <w:r>
+        <w:t xml:space="preserve"> (keep dissolved in text/table)</w:t>
+      </w:r>
+      <w:r>
+        <w:t xml:space="preserve">. </w:t>
+      </w:r>
+      <w:r>
+        <w:t>ADD RELEASE + CONCENTRATION</w:t>
+      </w:r>
+    </w:p>
+    <w:p>
+      <w:pPr>
+        <w:pStyle w:val="ListParagraph"/>
+        <w:numPr>
+          <w:ilvl w:val="1"/>
+          <w:numId w:val="4"/>
+        </w:numPr>
+      </w:pPr>
+      <w:r>
+        <w:t>Also have dissolved nutrients and color/shape coded by project</w:t>
+      </w:r>
+    </w:p>
+    <w:p>
+      <w:pPr>
+        <w:pStyle w:val="ListParagraph"/>
+        <w:numPr>
+          <w:ilvl w:val="1"/>
+          <w:numId w:val="4"/>
+        </w:numPr>
+      </w:pPr>
+      <w:r>
+        <w:t>Maybe by hydrology? Different types?</w:t>
+      </w:r>
     </w:p>
     <w:p>
       <w:r>
         <w:rPr>
           <w:noProof/>
         </w:rPr>
-        <w:lastRenderedPageBreak/>
         <w:drawing>
-          <wp:inline distT="0" distB="0" distL="0" distR="0" wp14:anchorId="1CA78EBA" wp14:editId="571026E5">
-            <wp:extent cx="4433455" cy="3340850"/>
-            <wp:effectExtent l="0" t="0" r="5715" b="0"/>
+          <wp:inline distT="0" distB="0" distL="0" distR="0" wp14:anchorId="1CA78EBA" wp14:editId="26F7EF06">
+            <wp:extent cx="5539740" cy="4174496"/>
+            <wp:effectExtent l="0" t="0" r="3810" b="0"/>
             <wp:docPr id="273396264" name="Picture 4"/>
             <wp:cNvGraphicFramePr>
               <a:graphicFrameLocks xmlns:a="http://schemas.openxmlformats.org/drawingml/2006/main" noChangeAspect="1"/>
@@ -932,7 +941,7 @@
                   <pic:spPr bwMode="auto">
                     <a:xfrm>
                       <a:off x="0" y="0"/>
-                      <a:ext cx="4445762" cy="3350124"/>
+                      <a:ext cx="5564602" cy="4193231"/>
                     </a:xfrm>
                     <a:prstGeom prst="rect">
                       <a:avLst/>
@@ -972,6 +981,7 @@
         <w:rPr>
           <w:noProof/>
         </w:rPr>
+        <w:lastRenderedPageBreak/>
         <w:drawing>
           <wp:inline distT="0" distB="0" distL="0" distR="0" wp14:anchorId="6695B348" wp14:editId="0F5B481F">
             <wp:extent cx="4763366" cy="3589456"/>
@@ -1059,6 +1069,107 @@
       <w:pPr>
         <w:pStyle w:val="ListParagraph"/>
         <w:numPr>
+          <w:ilvl w:val="1"/>
+          <w:numId w:val="4"/>
+        </w:numPr>
+      </w:pPr>
+      <w:r>
+        <w:t xml:space="preserve">Heatmap?? Heatmap of t-values? Talk to Raissa and Ishfaq </w:t>
+      </w:r>
+    </w:p>
+    <w:p>
+      <w:pPr>
+        <w:pStyle w:val="ListParagraph"/>
+        <w:numPr>
+          <w:ilvl w:val="2"/>
+          <w:numId w:val="4"/>
+        </w:numPr>
+      </w:pPr>
+      <w:r>
+        <w:t>2 boxes per project (</w:t>
+      </w:r>
+      <w:r>
+        <w:t xml:space="preserve">1 </w:t>
+      </w:r>
+      <w:r>
+        <w:t>colored by concentration t value</w:t>
+      </w:r>
+      <w:r>
+        <w:t>, 1 by</w:t>
+      </w:r>
+      <w:r>
+        <w:t xml:space="preserve"> volume t value)</w:t>
+      </w:r>
+    </w:p>
+    <w:p>
+      <w:pPr>
+        <w:pStyle w:val="ListParagraph"/>
+        <w:numPr>
+          <w:ilvl w:val="2"/>
+          <w:numId w:val="4"/>
+        </w:numPr>
+      </w:pPr>
+      <w:r>
+        <w:t>Stack lines of boxes for tidiness??</w:t>
+      </w:r>
+    </w:p>
+    <w:p>
+      <w:r>
+        <w:rPr>
+          <w:noProof/>
+        </w:rPr>
+        <w:lastRenderedPageBreak/>
+        <w:drawing>
+          <wp:inline distT="0" distB="0" distL="0" distR="0" wp14:anchorId="35F640B7" wp14:editId="18A2E706">
+            <wp:extent cx="4448175" cy="3787146"/>
+            <wp:effectExtent l="0" t="0" r="0" b="3810"/>
+            <wp:docPr id="1975220848" name="Picture 16"/>
+            <wp:cNvGraphicFramePr>
+              <a:graphicFrameLocks xmlns:a="http://schemas.openxmlformats.org/drawingml/2006/main" noChangeAspect="1"/>
+            </wp:cNvGraphicFramePr>
+            <a:graphic xmlns:a="http://schemas.openxmlformats.org/drawingml/2006/main">
+              <a:graphicData uri="http://schemas.openxmlformats.org/drawingml/2006/picture">
+                <pic:pic xmlns:pic="http://schemas.openxmlformats.org/drawingml/2006/picture">
+                  <pic:nvPicPr>
+                    <pic:cNvPr id="0" name="Picture 9"/>
+                    <pic:cNvPicPr>
+                      <a:picLocks noChangeAspect="1" noChangeArrowheads="1"/>
+                    </pic:cNvPicPr>
+                  </pic:nvPicPr>
+                  <pic:blipFill>
+                    <a:blip r:embed="rId10">
+                      <a:extLst>
+                        <a:ext uri="{28A0092B-C50C-407E-A947-70E740481C1C}">
+                          <a14:useLocalDpi xmlns:a14="http://schemas.microsoft.com/office/drawing/2010/main" val="0"/>
+                        </a:ext>
+                      </a:extLst>
+                    </a:blip>
+                    <a:srcRect/>
+                    <a:stretch>
+                      <a:fillRect/>
+                    </a:stretch>
+                  </pic:blipFill>
+                  <pic:spPr bwMode="auto">
+                    <a:xfrm>
+                      <a:off x="0" y="0"/>
+                      <a:ext cx="4452124" cy="3790508"/>
+                    </a:xfrm>
+                    <a:prstGeom prst="rect">
+                      <a:avLst/>
+                    </a:prstGeom>
+                    <a:noFill/>
+                  </pic:spPr>
+                </pic:pic>
+              </a:graphicData>
+            </a:graphic>
+          </wp:inline>
+        </w:drawing>
+      </w:r>
+    </w:p>
+    <w:p>
+      <w:pPr>
+        <w:pStyle w:val="ListParagraph"/>
+        <w:numPr>
           <w:ilvl w:val="0"/>
           <w:numId w:val="4"/>
         </w:numPr>
@@ -1085,7 +1196,6 @@
         </w:numPr>
       </w:pPr>
       <w:r>
-        <w:lastRenderedPageBreak/>
         <w:t xml:space="preserve">Logistic regression; release is not predicted by season, or inflowing volume, but </w:t>
       </w:r>
       <w:r>
@@ -1100,15 +1210,7 @@
         <w:t xml:space="preserve"> predicted by low incoming concentrations</w:t>
       </w:r>
       <w:r>
-        <w:t xml:space="preserve"> (likely influence is shared by low concentrations </w:t>
-      </w:r>
-      <w:proofErr w:type="gramStart"/>
-      <w:r>
-        <w:t>an</w:t>
-      </w:r>
-      <w:proofErr w:type="gramEnd"/>
-      <w:r>
-        <w:t xml:space="preserve"> dilution </w:t>
+        <w:t xml:space="preserve"> (likely influence is shared by low concentrations an dilution </w:t>
       </w:r>
       <w:r>
         <w:t>during high flow periods which don’t necessarily correlate with high flows to individual wetlands</w:t>
@@ -1127,6 +1229,27 @@
       </w:r>
       <w:r>
         <w:t>)</w:t>
+      </w:r>
+    </w:p>
+    <w:p>
+      <w:pPr>
+        <w:pStyle w:val="ListParagraph"/>
+        <w:numPr>
+          <w:ilvl w:val="1"/>
+          <w:numId w:val="4"/>
+        </w:numPr>
+      </w:pPr>
+      <w:r>
+        <w:t xml:space="preserve">Add in DO? </w:t>
+      </w:r>
+      <w:r>
+        <w:t>Temperature</w:t>
+      </w:r>
+      <w:r>
+        <w:t xml:space="preserve"> instead of month</w:t>
+      </w:r>
+      <w:r>
+        <w:t xml:space="preserve">? </w:t>
       </w:r>
     </w:p>
     <w:p>
@@ -1152,7 +1275,7 @@
                     </pic:cNvPicPr>
                   </pic:nvPicPr>
                   <pic:blipFill>
-                    <a:blip r:embed="rId10">
+                    <a:blip r:embed="rId11">
                       <a:extLst>
                         <a:ext uri="{28A0092B-C50C-407E-A947-70E740481C1C}">
                           <a14:useLocalDpi xmlns:a14="http://schemas.microsoft.com/office/drawing/2010/main" val="0"/>
@@ -1204,6 +1327,7 @@
         <w:rPr>
           <w:noProof/>
         </w:rPr>
+        <w:lastRenderedPageBreak/>
         <w:drawing>
           <wp:inline distT="0" distB="0" distL="0" distR="0" wp14:anchorId="69F01D51" wp14:editId="4FDB2478">
             <wp:extent cx="4654550" cy="3914053"/>
@@ -1222,7 +1346,7 @@
                     </pic:cNvPicPr>
                   </pic:nvPicPr>
                   <pic:blipFill>
-                    <a:blip r:embed="rId11">
+                    <a:blip r:embed="rId12">
                       <a:extLst>
                         <a:ext uri="{28A0092B-C50C-407E-A947-70E740481C1C}">
                           <a14:useLocalDpi xmlns:a14="http://schemas.microsoft.com/office/drawing/2010/main" val="0"/>
@@ -1266,7 +1390,6 @@
         </w:numPr>
       </w:pPr>
       <w:r>
-        <w:lastRenderedPageBreak/>
         <w:t>Table 1. Project summary table</w:t>
       </w:r>
     </w:p>
@@ -1327,157 +1450,18 @@
         <w:t>4</w:t>
       </w:r>
       <w:r>
-        <w:t>. Model</w:t>
-      </w:r>
-      <w:r>
-        <w:t xml:space="preserve"> selection</w:t>
-      </w:r>
-      <w:r>
-        <w:t xml:space="preserve"> results</w:t>
-      </w:r>
-      <w:r>
-        <w:t xml:space="preserve"> (AIC?)</w:t>
-      </w:r>
-      <w:r>
-        <w:t xml:space="preserve"> for </w:t>
-      </w:r>
-      <w:r>
-        <w:t>annual</w:t>
-      </w:r>
-      <w:r>
-        <w:t xml:space="preserve"> </w:t>
-      </w:r>
-      <w:r>
-        <w:t xml:space="preserve">LME </w:t>
-      </w:r>
-      <w:r>
-        <w:t>of TP</w:t>
-      </w:r>
-      <w:r>
-        <w:t>/TN</w:t>
-      </w:r>
-      <w:r>
-        <w:t xml:space="preserve"> retention </w:t>
-      </w:r>
-      <w:r>
-        <w:t xml:space="preserve">predicted by: </w:t>
-      </w:r>
-    </w:p>
-    <w:p>
-      <w:pPr>
-        <w:pStyle w:val="ListParagraph"/>
-        <w:numPr>
-          <w:ilvl w:val="1"/>
-          <w:numId w:val="5"/>
-        </w:numPr>
-      </w:pPr>
-      <w:r>
-        <w:t>Inflow volume</w:t>
-      </w:r>
-    </w:p>
-    <w:p>
-      <w:pPr>
-        <w:pStyle w:val="ListParagraph"/>
-        <w:numPr>
-          <w:ilvl w:val="1"/>
-          <w:numId w:val="5"/>
-        </w:numPr>
-      </w:pPr>
-      <w:r>
-        <w:t>SPSC</w:t>
-      </w:r>
-      <w:r>
-        <w:t xml:space="preserve"> + other soil P metrics</w:t>
-      </w:r>
-    </w:p>
-    <w:p>
-      <w:pPr>
-        <w:pStyle w:val="ListParagraph"/>
-        <w:numPr>
-          <w:ilvl w:val="1"/>
-          <w:numId w:val="5"/>
-        </w:numPr>
-      </w:pPr>
-      <w:r>
-        <w:t>Veg biomass/community (where available)</w:t>
-      </w:r>
-    </w:p>
-    <w:p>
-      <w:pPr>
-        <w:pStyle w:val="ListParagraph"/>
-        <w:numPr>
-          <w:ilvl w:val="1"/>
-          <w:numId w:val="5"/>
-        </w:numPr>
-      </w:pPr>
-      <w:r>
-        <w:t xml:space="preserve">TP </w:t>
-      </w:r>
-      <w:r>
-        <w:t>(</w:t>
-      </w:r>
-      <w:r>
-        <w:t>flow weighted</w:t>
-      </w:r>
-      <w:r>
-        <w:t>?)</w:t>
-      </w:r>
-      <w:r>
-        <w:t xml:space="preserve"> mean concentration</w:t>
-      </w:r>
-    </w:p>
-    <w:p>
-      <w:pPr>
-        <w:pStyle w:val="ListParagraph"/>
-        <w:numPr>
-          <w:ilvl w:val="1"/>
-          <w:numId w:val="5"/>
-        </w:numPr>
-      </w:pPr>
-      <w:r>
-        <w:t>Location?</w:t>
-      </w:r>
-      <w:r>
-        <w:t xml:space="preserve"> HUC basin?</w:t>
-      </w:r>
-    </w:p>
-    <w:p>
-      <w:pPr>
-        <w:pStyle w:val="ListParagraph"/>
-        <w:numPr>
-          <w:ilvl w:val="1"/>
-          <w:numId w:val="5"/>
-        </w:numPr>
-      </w:pPr>
-      <w:r>
-        <w:t>Water source type</w:t>
-      </w:r>
-      <w:r>
-        <w:t xml:space="preserve"> (river, tile drain, etc</w:t>
-      </w:r>
-      <w:r>
-        <w:t>.</w:t>
-      </w:r>
-      <w:r>
-        <w:t>)</w:t>
-      </w:r>
-    </w:p>
-    <w:p>
-      <w:pPr>
-        <w:pStyle w:val="ListParagraph"/>
-        <w:numPr>
-          <w:ilvl w:val="1"/>
-          <w:numId w:val="5"/>
-        </w:numPr>
-      </w:pPr>
-      <w:r>
-        <w:t>Wetland traits?</w:t>
-      </w:r>
-      <w:r>
-        <w:t xml:space="preserve"> </w:t>
-      </w:r>
-      <w:r>
-        <w:t>(pool #? Things like that?)</w:t>
+        <w:t>. Scenario comparison scaling up nutrient retention numbers to address Maumee River Watershed goals</w:t>
+      </w:r>
+      <w:r>
+        <w:t xml:space="preserve"> (or alt make this Box 1.)</w:t>
+      </w:r>
+    </w:p>
+    <w:p/>
+    <w:p/>
+    <w:p/>
+    <w:p>
+      <w:r>
+        <w:t xml:space="preserve">Supplemental Material: </w:t>
       </w:r>
     </w:p>
     <w:p>
@@ -1489,21 +1473,7 @@
         </w:numPr>
       </w:pPr>
       <w:r>
-        <w:t xml:space="preserve">Table </w:t>
-      </w:r>
-      <w:r>
-        <w:t>5</w:t>
-      </w:r>
-      <w:r>
-        <w:t>. Scenario comparison scaling up nutrient retention numbers to address Maumee River Watershed goals</w:t>
-      </w:r>
-    </w:p>
-    <w:p/>
-    <w:p/>
-    <w:p/>
-    <w:p>
-      <w:r>
-        <w:t xml:space="preserve">Supplemental Material: </w:t>
+        <w:t>Table of individual project characteristics</w:t>
       </w:r>
     </w:p>
     <w:p>
@@ -1515,7 +1485,7 @@
         </w:numPr>
       </w:pPr>
       <w:r>
-        <w:t>Table of individual project characteristics</w:t>
+        <w:t>Nutrient budget methods across all projects</w:t>
       </w:r>
     </w:p>
     <w:p>
@@ -1527,18 +1497,6 @@
         </w:numPr>
       </w:pPr>
       <w:r>
-        <w:t>Nutrient budget methods across all projects</w:t>
-      </w:r>
-    </w:p>
-    <w:p>
-      <w:pPr>
-        <w:pStyle w:val="ListParagraph"/>
-        <w:numPr>
-          <w:ilvl w:val="0"/>
-          <w:numId w:val="5"/>
-        </w:numPr>
-      </w:pPr>
-      <w:r>
         <w:t>LOO figure</w:t>
       </w:r>
     </w:p>
@@ -1547,6 +1505,7 @@
         <w:rPr>
           <w:noProof/>
         </w:rPr>
+        <w:lastRenderedPageBreak/>
         <w:drawing>
           <wp:inline distT="0" distB="0" distL="0" distR="0" wp14:anchorId="58B6FF62" wp14:editId="49D589C1">
             <wp:extent cx="3543300" cy="2186722"/>
@@ -1565,7 +1524,7 @@
                     </pic:cNvPicPr>
                   </pic:nvPicPr>
                   <pic:blipFill>
-                    <a:blip r:embed="rId12">
+                    <a:blip r:embed="rId13">
                       <a:extLst>
                         <a:ext uri="{28A0092B-C50C-407E-A947-70E740481C1C}">
                           <a14:useLocalDpi xmlns:a14="http://schemas.microsoft.com/office/drawing/2010/main" val="0"/>
@@ -1663,15 +1622,7 @@
         <w:fldChar w:fldCharType="end"/>
       </w:r>
       <w:r>
-        <w:t xml:space="preserve">. Eutrophication of aquatic habitats has </w:t>
-      </w:r>
-      <w:proofErr w:type="spellStart"/>
-      <w:r>
-        <w:t>lead</w:t>
-      </w:r>
-      <w:proofErr w:type="spellEnd"/>
-      <w:r>
-        <w:t xml:space="preserve"> to a variety of water quality issues including harmful algal blooms </w:t>
+        <w:t xml:space="preserve">. Eutrophication of aquatic habitats has lead to a variety of water quality issues including harmful algal blooms </w:t>
       </w:r>
       <w:r>
         <w:fldChar w:fldCharType="begin"/>
@@ -1707,21 +1658,7 @@
         <w:rPr>
           <w:rFonts w:ascii="Aptos" w:hAnsi="Aptos"/>
         </w:rPr>
-        <w:t xml:space="preserve">(Carpenter et al. 1998, </w:t>
-      </w:r>
-      <w:proofErr w:type="spellStart"/>
-      <w:r>
-        <w:rPr>
-          <w:rFonts w:ascii="Aptos" w:hAnsi="Aptos"/>
-        </w:rPr>
-        <w:t>Vymazal</w:t>
-      </w:r>
-      <w:proofErr w:type="spellEnd"/>
-      <w:r>
-        <w:rPr>
-          <w:rFonts w:ascii="Aptos" w:hAnsi="Aptos"/>
-        </w:rPr>
-        <w:t xml:space="preserve"> 2007, Weisner et al. 2016)</w:t>
+        <w:t>(Carpenter et al. 1998, Vymazal 2007, Weisner et al. 2016)</w:t>
       </w:r>
       <w:r>
         <w:fldChar w:fldCharType="end"/>
@@ -1820,21 +1757,7 @@
         <w:rPr>
           <w:rFonts w:ascii="Aptos" w:hAnsi="Aptos"/>
         </w:rPr>
-        <w:t xml:space="preserve">(Mitsch et al. 2014, Aziz and Van </w:t>
-      </w:r>
-      <w:proofErr w:type="spellStart"/>
-      <w:r>
-        <w:rPr>
-          <w:rFonts w:ascii="Aptos" w:hAnsi="Aptos"/>
-        </w:rPr>
-        <w:t>Cappellen</w:t>
-      </w:r>
-      <w:proofErr w:type="spellEnd"/>
-      <w:r>
-        <w:rPr>
-          <w:rFonts w:ascii="Aptos" w:hAnsi="Aptos"/>
-        </w:rPr>
-        <w:t xml:space="preserve"> 2021)</w:t>
+        <w:t>(Mitsch et al. 2014, Aziz and Van Cappellen 2021)</w:t>
       </w:r>
       <w:r>
         <w:fldChar w:fldCharType="end"/>
@@ -3018,7 +2941,7 @@
       <w:r>
         <w:t>Daily solar radiation (MJ/m²/day) was sourced from the National Aeronautics and Space Administration (NASA) Langley Research Center's Prediction Of Worldwide Energy Resources (</w:t>
       </w:r>
-      <w:hyperlink r:id="rId13">
+      <w:hyperlink r:id="rId14">
         <w:r>
           <w:rPr>
             <w:rStyle w:val="Hyperlink"/>
@@ -3029,14 +2952,12 @@
       <w:r>
         <w:t xml:space="preserve">) database using the wetland project coordinates and the </w:t>
       </w:r>
-      <w:proofErr w:type="spellStart"/>
       <w:r>
         <w:rPr>
           <w:rFonts w:ascii="Courier New" w:hAnsi="Courier New" w:cs="Courier New"/>
         </w:rPr>
         <w:t>nasapower</w:t>
       </w:r>
-      <w:proofErr w:type="spellEnd"/>
       <w:r>
         <w:t xml:space="preserve"> R package</w:t>
       </w:r>
@@ -3081,7 +3002,6 @@
       <w:r>
         <w:t xml:space="preserve"> was computed following the Penman-Monteith FAO-56 equation, which combines a radiation term (</w:t>
       </w:r>
-      <w:proofErr w:type="spellStart"/>
       <w:r>
         <w:rPr>
           <w:i/>
@@ -3097,11 +3017,9 @@
         </w:rPr>
         <w:t>s</w:t>
       </w:r>
-      <w:proofErr w:type="spellEnd"/>
       <w:r>
         <w:t>) and an aerodynamic term (</w:t>
       </w:r>
-      <w:proofErr w:type="spellStart"/>
       <w:r>
         <w:rPr>
           <w:i/>
@@ -3117,7 +3035,6 @@
         </w:rPr>
         <w:t>a</w:t>
       </w:r>
-      <w:proofErr w:type="spellEnd"/>
       <w:r>
         <w:t>) to estimate the evaporative demand of the atmosphere over a hypothetical reference crop (Allen et al., 1998). Key intermediate variables (e.g., slope of the saturation vapor pressure curve, the psychrometric constant, mean saturation and actual vapor pressure) were calculated from the daily meteorological inputs and project-specific parameters (latitude, elevation). Soil heat flux density (</w:t>
       </w:r>
@@ -3240,15 +3157,7 @@
         <w:t>per</w:t>
       </w:r>
       <w:r>
-        <w:t xml:space="preserve"> </w:t>
-      </w:r>
-      <w:proofErr w:type="gramStart"/>
-      <w:r>
-        <w:t>projects</w:t>
-      </w:r>
-      <w:proofErr w:type="gramEnd"/>
-      <w:r>
-        <w:t xml:space="preserve">. </w:t>
+        <w:t xml:space="preserve"> projects. </w:t>
       </w:r>
       <w:r>
         <w:t xml:space="preserve">The </w:t>
@@ -3431,60 +3340,917 @@
       </w:r>
     </w:p>
     <w:p>
-      <w:r>
-        <w:t xml:space="preserve">Researchers observed net nutrient filtration by a vast majority of Projects, but there was a large range in the total and per-area mass of nutrients filtered both between Projects and across years. In the 23 Projects with sufficient data to measure nutrient filtration, researchers only observed net annual Total P release in two Projects and net annual Total N release in three Projects across all </w:t>
-      </w:r>
-      <w:proofErr w:type="gramStart"/>
-      <w:r>
-        <w:t>years</w:t>
-      </w:r>
-      <w:proofErr w:type="gramEnd"/>
-      <w:r>
-        <w:t xml:space="preserve"> monitored (Table 5). The filtration of P by H2Ohio wetlands ranged from –11 lbs./year to 1732 lbs./year, with a mean (± standard deviation) of 113 lbs./year (±280), and a median of 25</w:t>
+      <w:pPr>
+        <w:rPr>
+          <w:i/>
+          <w:iCs/>
+        </w:rPr>
+      </w:pPr>
+      <w:r>
+        <w:rPr>
+          <w:i/>
+          <w:iCs/>
+        </w:rPr>
+        <w:t>3.1. Nutrient Retention</w:t>
+      </w:r>
+    </w:p>
+    <w:p>
+      <w:pPr>
+        <w:ind w:firstLine="720"/>
+      </w:pPr>
+      <w:r>
+        <w:t>We</w:t>
+      </w:r>
+      <w:r>
+        <w:t xml:space="preserve"> observed net </w:t>
+      </w:r>
+      <w:r>
+        <w:t xml:space="preserve">annual </w:t>
+      </w:r>
+      <w:r>
+        <w:t>nutrient filtration</w:t>
+      </w:r>
+      <w:r>
+        <w:t xml:space="preserve"> in most wetlands</w:t>
       </w:r>
       <w:r>
         <w:t xml:space="preserve"> </w:t>
       </w:r>
       <w:r>
-        <w:t>lbs./year. The filtration of N by H2Ohio wetlands ranged from -549 lbs./year to 7345 lbs./year, with a mean (± standard deviation) of 1416 lbs./year (±1812) and a median of 711 lbs./year</w:t>
-      </w:r>
-    </w:p>
-    <w:p>
-      <w:r>
-        <w:t xml:space="preserve">On an annual basis, most Projects were net sinks for nutrients, even if they experienced nutrient release in some months. Of the 528 Project-months (unique combinations of project and month) with nutrient budgets, 60% (313 Project-months) indicated net filtration of P, 13% (72 Project-months) indicated net release of P, and 27% (143 Project-months) indicated no net release or filtration of P. Within that same dataset, 64% (336 Project-months) indicated net retention of N, 9% (49 Project-months) indicated net release of N, and 27% (143 Project-months) indicated no net release or filtration of N. For </w:t>
-      </w:r>
-      <w:proofErr w:type="gramStart"/>
-      <w:r>
-        <w:t>the vast majority of</w:t>
-      </w:r>
-      <w:proofErr w:type="gramEnd"/>
-      <w:r>
-        <w:t xml:space="preserve"> Projects, filtration outweighed release in terms of both total mass and number of months. </w:t>
-      </w:r>
-    </w:p>
-    <w:p>
-      <w:r>
-        <w:t xml:space="preserve"> Cumulative filtration in lbs. of both TP and TN, across all projects, occurred primarily during spring (March through May) and summer (June through August), with 38% of TP and 45% of</w:t>
+        <w:t xml:space="preserve">net annual TP release in two </w:t>
+      </w:r>
+      <w:r>
+        <w:t>wetlands</w:t>
+      </w:r>
+      <w:r>
+        <w:t xml:space="preserve"> and net annual TN release in three </w:t>
+      </w:r>
+      <w:r>
+        <w:t>wetlands</w:t>
+      </w:r>
+      <w:r>
+        <w:t xml:space="preserve"> across all years monitored (</w:t>
+      </w:r>
+      <w:r>
+        <w:rPr>
+          <w:highlight w:val="yellow"/>
+        </w:rPr>
+        <w:t xml:space="preserve">Table </w:t>
+      </w:r>
+      <w:r>
+        <w:rPr>
+          <w:highlight w:val="yellow"/>
+        </w:rPr>
+        <w:t>XX</w:t>
+      </w:r>
+      <w:r>
+        <w:t>).</w:t>
+      </w:r>
+      <w:r>
+        <w:t xml:space="preserve"> TP retention ranged </w:t>
+      </w:r>
+      <w:r>
+        <w:t>from –11 lbs./year to 1732 lbs./year, with a mean (± standard deviation) of 113 lbs./year (±280), and a median of 25</w:t>
       </w:r>
       <w:r>
         <w:t xml:space="preserve"> </w:t>
       </w:r>
       <w:r>
-        <w:t xml:space="preserve">TN filtered in the spring and 38% of TP and 36% of TN filtered in the summer. This pattern likely exists because the greatest nutrient loads are delivered during spring rain events. The same pattern is true for dissolved nutrients. Of the total annual filtration of dissolved nutrients, 34% of DRP is processed in </w:t>
+        <w:t xml:space="preserve">lbs./year. </w:t>
+      </w:r>
+      <w:r>
+        <w:t>TN retention</w:t>
+      </w:r>
+      <w:r>
+        <w:t xml:space="preserve"> ranged from -549 lbs./year to 7345 lbs./year, with a mean (± standard deviation) of 1416 lbs./year (±1812) and a median of 711 lbs./year</w:t>
+      </w:r>
+      <w:r>
+        <w:t xml:space="preserve">. </w:t>
+      </w:r>
+      <w:r>
+        <w:t xml:space="preserve">Of the 528 </w:t>
+      </w:r>
+      <w:r>
+        <w:t>wetland-months</w:t>
+      </w:r>
+      <w:r>
+        <w:t xml:space="preserve"> (unique combinations of </w:t>
+      </w:r>
+      <w:r>
+        <w:t>wetland</w:t>
+      </w:r>
+      <w:r>
+        <w:t xml:space="preserve"> and month), 60% (313 </w:t>
+      </w:r>
+      <w:r>
+        <w:t>wetland-months</w:t>
+      </w:r>
+      <w:r>
+        <w:t>) indicated net</w:t>
+      </w:r>
+      <w:r>
+        <w:t xml:space="preserve"> TP</w:t>
+      </w:r>
+      <w:r>
+        <w:t xml:space="preserve"> </w:t>
+      </w:r>
+      <w:r>
+        <w:t>retention</w:t>
+      </w:r>
+      <w:r>
+        <w:t xml:space="preserve">, 13% (72 </w:t>
+      </w:r>
+      <w:r>
+        <w:t>wetland-months</w:t>
+      </w:r>
+      <w:r>
+        <w:t xml:space="preserve">) indicated net </w:t>
+      </w:r>
+      <w:r>
+        <w:t xml:space="preserve">TP </w:t>
+      </w:r>
+      <w:r>
+        <w:t xml:space="preserve">release, and 27% (143 </w:t>
+      </w:r>
+      <w:r>
+        <w:t>wetland-months</w:t>
+      </w:r>
+      <w:r>
+        <w:t xml:space="preserve">) indicated no net release or </w:t>
+      </w:r>
+      <w:r>
+        <w:t>retention</w:t>
+      </w:r>
+      <w:r>
+        <w:t xml:space="preserve"> of P. Within that same dataset, 64% (336 </w:t>
+      </w:r>
+      <w:r>
+        <w:t>wetland-months</w:t>
+      </w:r>
+      <w:r>
+        <w:t xml:space="preserve">) indicated net retention of N, 9% (49 </w:t>
+      </w:r>
+      <w:r>
+        <w:t>wetland-months</w:t>
+      </w:r>
+      <w:r>
+        <w:t xml:space="preserve">) indicated net release of N, and 27% (143 </w:t>
+      </w:r>
+      <w:r>
+        <w:t>wetland-months</w:t>
+      </w:r>
+      <w:r>
+        <w:t xml:space="preserve">) indicated no net release or filtration of N. For the vast majority of </w:t>
+      </w:r>
+      <w:r>
+        <w:t>wetlands</w:t>
+      </w:r>
+      <w:r>
+        <w:t xml:space="preserve">, </w:t>
+      </w:r>
+      <w:r>
+        <w:t>retention</w:t>
+      </w:r>
+      <w:r>
+        <w:t xml:space="preserve"> outweighed release in terms of both total mass and number of months. </w:t>
+      </w:r>
+      <w:r>
+        <w:t>Retention of</w:t>
+      </w:r>
+      <w:r>
+        <w:t xml:space="preserve"> both TP and TN, across all </w:t>
+      </w:r>
+      <w:r>
+        <w:t>wetlands</w:t>
+      </w:r>
+      <w:r>
+        <w:t>, occurred primarily during spring (March through May) and summer (June through August), with 38% of TP and 45% of</w:t>
+      </w:r>
+      <w:r>
+        <w:t xml:space="preserve"> </w:t>
+      </w:r>
+      <w:r>
+        <w:t>TN filtered in the spring and 38% of TP and 36% of TN filtered in the summer</w:t>
+      </w:r>
+      <w:r>
+        <w:t xml:space="preserve"> (Figure XX)</w:t>
+      </w:r>
+      <w:r>
+        <w:t xml:space="preserve">. </w:t>
+      </w:r>
+      <w:r>
+        <w:t>Dissolved nutrients were similarly retained primarily during spring with</w:t>
+      </w:r>
+      <w:r>
+        <w:t xml:space="preserve"> 34% of DRP is processed in the spring and 39% in the summer, 44% of nitrite+nitrate is processed in the spring and 38% in the summer, and 18% of total ammonium nitrogen (NH4) is processed in the spring and 58% in the summer.</w:t>
+      </w:r>
+    </w:p>
+    <w:p>
+      <w:pPr>
+        <w:rPr>
+          <w:i/>
+          <w:iCs/>
+        </w:rPr>
+      </w:pPr>
+      <w:r>
+        <w:rPr>
+          <w:i/>
+          <w:iCs/>
+        </w:rPr>
+        <w:t>3.2</w:t>
+      </w:r>
+      <w:r>
+        <w:rPr>
+          <w:i/>
+          <w:iCs/>
+        </w:rPr>
+        <w:t xml:space="preserve"> Drivers of Nutrient Retention</w:t>
+      </w:r>
+      <w:r>
+        <w:rPr>
+          <w:i/>
+          <w:iCs/>
+        </w:rPr>
+        <w:t>: Volume</w:t>
+      </w:r>
+    </w:p>
+    <w:p>
+      <w:r>
+        <w:tab/>
+      </w:r>
+      <w:r>
+        <w:t>Nutrient retention</w:t>
+      </w:r>
+      <w:r>
+        <w:t xml:space="preserve"> and release</w:t>
+      </w:r>
+      <w:r>
+        <w:t xml:space="preserve"> across wetlands was significantly </w:t>
+      </w:r>
+      <w:r>
+        <w:t xml:space="preserve">related to inflow volume. </w:t>
+      </w:r>
+      <w:r>
+        <w:t xml:space="preserve">Across months and Projects, the </w:t>
+      </w:r>
+      <w:r>
+        <w:t xml:space="preserve">log-scale </w:t>
+      </w:r>
+      <w:r>
+        <w:t xml:space="preserve">total monthly mass of </w:t>
+      </w:r>
+      <w:r>
+        <w:t>both TP and TN</w:t>
+      </w:r>
+      <w:r>
+        <w:t xml:space="preserve"> removed and/or </w:t>
       </w:r>
       <w:r>
         <w:lastRenderedPageBreak/>
-        <w:t xml:space="preserve">the spring and 39% in the summer, 44% of </w:t>
-      </w:r>
-      <w:proofErr w:type="spellStart"/>
-      <w:r>
-        <w:t>nitrite+nitrate</w:t>
-      </w:r>
-      <w:proofErr w:type="spellEnd"/>
-      <w:r>
-        <w:t xml:space="preserve"> is processed in the spring and 38% in the summer, and 18% of total ammonium nitrogen (NH4) is processed in the spring and 58% in the summer.</w:t>
-      </w:r>
-    </w:p>
+        <w:t>released was strongly related to</w:t>
+      </w:r>
+      <w:r>
+        <w:t xml:space="preserve"> the log-scale</w:t>
+      </w:r>
+      <w:r>
+        <w:t xml:space="preserve"> monthly inflow volume (</w:t>
+      </w:r>
+      <w:r>
+        <w:t xml:space="preserve">TP: </w:t>
+      </w:r>
+      <w:r>
+        <w:t>R</w:t>
+      </w:r>
+      <w:r>
+        <w:rPr>
+          <w:vertAlign w:val="superscript"/>
+        </w:rPr>
+        <w:t>2</w:t>
+      </w:r>
+      <w:r>
+        <w:t xml:space="preserve"> = 0.83 for </w:t>
+      </w:r>
+      <w:r>
+        <w:t>retained</w:t>
+      </w:r>
+      <w:r>
+        <w:t>, R</w:t>
+      </w:r>
+      <w:r>
+        <w:rPr>
+          <w:vertAlign w:val="superscript"/>
+        </w:rPr>
+        <w:t>2</w:t>
+      </w:r>
+      <w:r>
+        <w:t xml:space="preserve"> = 0.59 for released</w:t>
+      </w:r>
+      <w:r>
+        <w:t xml:space="preserve">; </w:t>
+      </w:r>
+      <w:r>
+        <w:t xml:space="preserve">TN: </w:t>
+      </w:r>
+      <w:r>
+        <w:t>R</w:t>
+      </w:r>
+      <w:r>
+        <w:rPr>
+          <w:vertAlign w:val="superscript"/>
+        </w:rPr>
+        <w:t>2</w:t>
+      </w:r>
+      <w:r>
+        <w:t xml:space="preserve"> = 0.8 for retained, R</w:t>
+      </w:r>
+      <w:r>
+        <w:rPr>
+          <w:vertAlign w:val="superscript"/>
+        </w:rPr>
+        <w:t>2</w:t>
+      </w:r>
+      <w:r>
+        <w:t xml:space="preserve"> = 0.5</w:t>
+      </w:r>
+      <w:r>
+        <w:t>8</w:t>
+      </w:r>
+      <w:r>
+        <w:t xml:space="preserve"> for release</w:t>
+      </w:r>
+      <w:r>
+        <w:t xml:space="preserve">d; </w:t>
+      </w:r>
+      <w:r>
+        <w:rPr>
+          <w:highlight w:val="yellow"/>
+        </w:rPr>
+        <w:t>FIG XX</w:t>
+      </w:r>
+      <w:r>
+        <w:t xml:space="preserve">). </w:t>
+      </w:r>
+      <w:r>
+        <w:t>While there is a significant relationship between</w:t>
+      </w:r>
+      <w:r>
+        <w:t xml:space="preserve"> </w:t>
+      </w:r>
+      <w:r>
+        <w:t>retention and concentration for both TP and TN, the variability explained by that relationship is limited compared to volume (</w:t>
+      </w:r>
+      <w:r>
+        <w:t>TP: R</w:t>
+      </w:r>
+      <w:r>
+        <w:rPr>
+          <w:vertAlign w:val="superscript"/>
+        </w:rPr>
+        <w:t>2</w:t>
+      </w:r>
+      <w:r>
+        <w:t xml:space="preserve"> = 0.01</w:t>
+      </w:r>
+      <w:r>
+        <w:t xml:space="preserve">, </w:t>
+      </w:r>
+      <w:r>
+        <w:t>TN:</w:t>
+      </w:r>
+      <w:r>
+        <w:t xml:space="preserve"> </w:t>
+      </w:r>
+      <w:r>
+        <w:t>R</w:t>
+      </w:r>
+      <w:r>
+        <w:rPr>
+          <w:vertAlign w:val="superscript"/>
+        </w:rPr>
+        <w:t>2</w:t>
+      </w:r>
+      <w:r>
+        <w:t xml:space="preserve"> =</w:t>
+      </w:r>
+      <w:r>
+        <w:t xml:space="preserve"> 0.15</w:t>
+      </w:r>
+      <w:r>
+        <w:t xml:space="preserve">; </w:t>
+      </w:r>
+      <w:r>
+        <w:rPr>
+          <w:highlight w:val="yellow"/>
+        </w:rPr>
+        <w:t>FIG XX</w:t>
+      </w:r>
+      <w:r>
+        <w:t xml:space="preserve">). </w:t>
+      </w:r>
+      <w:r>
+        <w:t xml:space="preserve">We found similar relationships between inflow volume and retention of dissolved nutrients </w:t>
+      </w:r>
+      <w:r>
+        <w:t>DRP (R</w:t>
+      </w:r>
+      <w:r>
+        <w:rPr>
+          <w:vertAlign w:val="superscript"/>
+        </w:rPr>
+        <w:t>2</w:t>
+      </w:r>
+      <w:r>
+        <w:t xml:space="preserve"> = 0.76), NO</w:t>
+      </w:r>
+      <w:r>
+        <w:rPr>
+          <w:vertAlign w:val="subscript"/>
+        </w:rPr>
+        <w:t>x</w:t>
+      </w:r>
+      <w:r>
+        <w:t xml:space="preserve"> (R</w:t>
+      </w:r>
+      <w:r>
+        <w:rPr>
+          <w:vertAlign w:val="superscript"/>
+        </w:rPr>
+        <w:t xml:space="preserve">2 </w:t>
+      </w:r>
+      <w:r>
+        <w:t>= 0.70), and total ammonium nitrogen (NH</w:t>
+      </w:r>
+      <w:r>
+        <w:rPr>
+          <w:vertAlign w:val="subscript"/>
+        </w:rPr>
+        <w:t>4</w:t>
+      </w:r>
+      <w:r>
+        <w:t>, R</w:t>
+      </w:r>
+      <w:r>
+        <w:rPr>
+          <w:vertAlign w:val="superscript"/>
+        </w:rPr>
+        <w:t>2</w:t>
+      </w:r>
+      <w:r>
+        <w:t xml:space="preserve"> = 0.76)</w:t>
+      </w:r>
+      <w:r>
+        <w:t xml:space="preserve">, as well as between inflow volume and release of dissolved nutrients </w:t>
+      </w:r>
+      <w:r>
+        <w:t>for DRP (R</w:t>
+      </w:r>
+      <w:r>
+        <w:rPr>
+          <w:vertAlign w:val="superscript"/>
+        </w:rPr>
+        <w:t>2</w:t>
+      </w:r>
+      <w:r>
+        <w:t xml:space="preserve"> = 0.52), TN (R</w:t>
+      </w:r>
+      <w:r>
+        <w:rPr>
+          <w:vertAlign w:val="superscript"/>
+        </w:rPr>
+        <w:t>2</w:t>
+      </w:r>
+      <w:r>
+        <w:t xml:space="preserve"> = 0.48), NO</w:t>
+      </w:r>
+      <w:r>
+        <w:rPr>
+          <w:vertAlign w:val="subscript"/>
+        </w:rPr>
+        <w:t>x</w:t>
+      </w:r>
+      <w:r>
+        <w:t xml:space="preserve"> (R</w:t>
+      </w:r>
+      <w:r>
+        <w:rPr>
+          <w:vertAlign w:val="superscript"/>
+        </w:rPr>
+        <w:t xml:space="preserve">2 </w:t>
+      </w:r>
+      <w:r>
+        <w:t xml:space="preserve">= 0.45), and </w:t>
+      </w:r>
+      <w:r>
+        <w:t xml:space="preserve">ammonium nitrogen </w:t>
+      </w:r>
+      <w:r>
+        <w:t>(R</w:t>
+      </w:r>
+      <w:r>
+        <w:rPr>
+          <w:vertAlign w:val="superscript"/>
+        </w:rPr>
+        <w:t>2</w:t>
+      </w:r>
+      <w:r>
+        <w:t xml:space="preserve"> = 0.28). Similarly, weak relationships exist between concentration and filtration for DRP (R</w:t>
+      </w:r>
+      <w:r>
+        <w:rPr>
+          <w:vertAlign w:val="superscript"/>
+        </w:rPr>
+        <w:t>2</w:t>
+      </w:r>
+      <w:r>
+        <w:t xml:space="preserve"> = 0.03), NO</w:t>
+      </w:r>
+      <w:r>
+        <w:rPr>
+          <w:vertAlign w:val="subscript"/>
+        </w:rPr>
+        <w:t>x</w:t>
+      </w:r>
+      <w:r>
+        <w:t xml:space="preserve"> (R</w:t>
+      </w:r>
+      <w:r>
+        <w:rPr>
+          <w:vertAlign w:val="superscript"/>
+        </w:rPr>
+        <w:t xml:space="preserve">2 </w:t>
+      </w:r>
+      <w:r>
+        <w:t>= 0.03), and NH</w:t>
+      </w:r>
+      <w:r>
+        <w:rPr>
+          <w:vertAlign w:val="subscript"/>
+        </w:rPr>
+        <w:t>4</w:t>
+      </w:r>
+      <w:r>
+        <w:t xml:space="preserve"> (R</w:t>
+      </w:r>
+      <w:r>
+        <w:rPr>
+          <w:vertAlign w:val="superscript"/>
+        </w:rPr>
+        <w:t>2</w:t>
+      </w:r>
+      <w:r>
+        <w:t xml:space="preserve"> = 0.00).</w:t>
+      </w:r>
+    </w:p>
+    <w:p>
+      <w:r>
+        <w:tab/>
+      </w:r>
+      <w:r>
+        <w:t>It is notable that o</w:t>
+      </w:r>
+      <w:r>
+        <w:t xml:space="preserve">ur values for nutrient retention are calculated in part using both inflow volume and </w:t>
+      </w:r>
+      <w:r>
+        <w:t xml:space="preserve">inflowing </w:t>
+      </w:r>
+      <w:r>
+        <w:t>nutrient concentrations</w:t>
+      </w:r>
+      <w:r>
+        <w:t xml:space="preserve">, </w:t>
+      </w:r>
+      <w:r>
+        <w:t xml:space="preserve">however the function of the wetland </w:t>
+      </w:r>
+      <w:r>
+        <w:t>on nutrient retention is represented by the change from in</w:t>
+      </w:r>
+      <w:r>
+        <w:t xml:space="preserve">let to outlet which is not </w:t>
+      </w:r>
+      <w:r>
+        <w:t xml:space="preserve">included in the model. </w:t>
+      </w:r>
+      <w:r>
+        <w:t>T</w:t>
+      </w:r>
+      <w:r>
+        <w:t xml:space="preserve">o </w:t>
+      </w:r>
+      <w:r>
+        <w:t xml:space="preserve">ensure that the relationship between inflow volume and nutrient retention was robust </w:t>
+      </w:r>
+      <w:r>
+        <w:t xml:space="preserve">to </w:t>
+      </w:r>
+      <w:r>
+        <w:t>independent data</w:t>
+      </w:r>
+      <w:r>
+        <w:t xml:space="preserve"> we remade the model sequentially removing wetlands from the database to perform a </w:t>
+      </w:r>
+      <w:r>
+        <w:t xml:space="preserve">leave-one-out analysis. </w:t>
+      </w:r>
+      <w:r>
+        <w:t xml:space="preserve">We </w:t>
+      </w:r>
+      <w:r>
+        <w:t>remade the linear model between inflow volume and filtration of each nutrient</w:t>
+      </w:r>
+      <w:r>
+        <w:t xml:space="preserve"> </w:t>
+      </w:r>
+      <w:r>
+        <w:t xml:space="preserve">sequentially removing </w:t>
+      </w:r>
+      <w:r>
+        <w:t>one</w:t>
+      </w:r>
+      <w:r>
+        <w:t xml:space="preserve"> wetland</w:t>
+      </w:r>
+      <w:r>
+        <w:t xml:space="preserve"> at a time</w:t>
+      </w:r>
+      <w:r>
+        <w:t xml:space="preserve"> from the model</w:t>
+      </w:r>
+      <w:r>
+        <w:t xml:space="preserve">. The model fit was robust to the removal of wetlands </w:t>
+      </w:r>
+      <w:r>
+        <w:t xml:space="preserve">with mean RMSE </w:t>
+      </w:r>
+      <w:r>
+        <w:t xml:space="preserve">values </w:t>
+      </w:r>
+      <w:r>
+        <w:t xml:space="preserve">of </w:t>
+      </w:r>
+      <w:r>
+        <w:t xml:space="preserve">3.2lbs </w:t>
+      </w:r>
+      <w:r>
+        <w:t xml:space="preserve">for </w:t>
+      </w:r>
+      <w:r>
+        <w:t>TP</w:t>
+      </w:r>
+      <w:r>
+        <w:t xml:space="preserve">, 3.5lbs for TN, 4.2lbs for DRP, 7.5lbs for NOX, and 4.7lbs for NH3. </w:t>
+      </w:r>
+      <w:r>
+        <w:t xml:space="preserve">We then applied each new model to predict nutrient retention at the removed wetland and found </w:t>
+      </w:r>
+      <w:r>
+        <w:t>that mean RMSE when predicting wetlands that were not included in the model was similar to predictions when data was include</w:t>
+      </w:r>
+      <w:r>
+        <w:t>d</w:t>
+      </w:r>
+      <w:r>
+        <w:t xml:space="preserve"> (mean RMSE: 3.1lbs TP, 3.3lbs TN, 4.2lbs DRP, 9lbs NOX, 4.6lbs NH3). </w:t>
+      </w:r>
+      <w:r>
+        <w:t>Wetlands did however vary in their ability to be predicted when excluded from the model (</w:t>
+      </w:r>
+      <w:r>
+        <w:rPr>
+          <w:highlight w:val="yellow"/>
+        </w:rPr>
+        <w:t>Fig. SXX</w:t>
+      </w:r>
+      <w:r>
+        <w:t>).</w:t>
+      </w:r>
+    </w:p>
+    <w:p>
+      <w:pPr>
+        <w:rPr>
+          <w:i/>
+          <w:iCs/>
+        </w:rPr>
+      </w:pPr>
+      <w:r>
+        <w:rPr>
+          <w:i/>
+          <w:iCs/>
+        </w:rPr>
+        <w:t xml:space="preserve">3.3 </w:t>
+      </w:r>
+      <w:r>
+        <w:rPr>
+          <w:i/>
+          <w:iCs/>
+        </w:rPr>
+        <w:t>Drivers of Nutrient Retention: Concentration</w:t>
+      </w:r>
+    </w:p>
+    <w:p>
+      <w:pPr>
+        <w:ind w:firstLine="360"/>
+      </w:pPr>
+      <w:r>
+        <w:t xml:space="preserve">While we found that inflow volume to each wetland had a stronger correlation </w:t>
+      </w:r>
+      <w:r>
+        <w:t>with nutrient retention tha</w:t>
+      </w:r>
+      <w:r>
+        <w:t xml:space="preserve">n </w:t>
+      </w:r>
+      <w:r>
+        <w:t>concentration, we found that within</w:t>
+      </w:r>
+      <w:r>
+        <w:t xml:space="preserve"> individual</w:t>
+      </w:r>
+      <w:r>
+        <w:t xml:space="preserve"> wetlands concentration </w:t>
+      </w:r>
+      <w:r>
+        <w:t xml:space="preserve">often </w:t>
+      </w:r>
+      <w:r>
+        <w:t>was</w:t>
+      </w:r>
+      <w:r>
+        <w:t xml:space="preserve"> a similar or occasionally</w:t>
+      </w:r>
+      <w:r>
+        <w:t xml:space="preserve"> a</w:t>
+      </w:r>
+      <w:r>
+        <w:t xml:space="preserve"> more</w:t>
+      </w:r>
+      <w:r>
+        <w:t xml:space="preserve"> important </w:t>
+      </w:r>
+      <w:r>
+        <w:t>predictor of nutrient retention</w:t>
+      </w:r>
+      <w:r>
+        <w:t xml:space="preserve"> than inflowing volume</w:t>
+      </w:r>
+      <w:r>
+        <w:t xml:space="preserve">. </w:t>
+      </w:r>
+      <w:r>
+        <w:t>We made linear models</w:t>
+      </w:r>
+      <w:r>
+        <w:t xml:space="preserve"> predicting nutrient retention by </w:t>
+      </w:r>
+      <w:r>
+        <w:t>inflowing volume and concentration</w:t>
+      </w:r>
+      <w:r>
+        <w:t xml:space="preserve"> </w:t>
+      </w:r>
+      <w:r>
+        <w:t>for each</w:t>
+      </w:r>
+      <w:r>
+        <w:t xml:space="preserve"> individual wetland</w:t>
+      </w:r>
+      <w:r>
+        <w:t xml:space="preserve"> and </w:t>
+      </w:r>
+      <w:r>
+        <w:t>predictor</w:t>
+      </w:r>
+      <w:r>
+        <w:t xml:space="preserve"> </w:t>
+      </w:r>
+      <w:r>
+        <w:t>t-value</w:t>
+      </w:r>
+      <w:r>
+        <w:t xml:space="preserve">s indicate that </w:t>
+      </w:r>
+      <w:r>
+        <w:t>concentration is sometimes a more significant predictor and often a similarly important predictor</w:t>
+      </w:r>
+      <w:r>
+        <w:t xml:space="preserve"> to inflowing volume</w:t>
+      </w:r>
+      <w:r>
+        <w:t xml:space="preserve"> (</w:t>
+      </w:r>
+      <w:r>
+        <w:rPr>
+          <w:highlight w:val="yellow"/>
+        </w:rPr>
+        <w:t>Figure XX</w:t>
+      </w:r>
+      <w:r>
+        <w:t>).</w:t>
+      </w:r>
+      <w:r>
+        <w:t xml:space="preserve"> </w:t>
+      </w:r>
+      <w:r>
+        <w:t>Based on model t-values TP</w:t>
+      </w:r>
+      <w:r>
+        <w:t xml:space="preserve"> concentration </w:t>
+      </w:r>
+      <w:r>
+        <w:t xml:space="preserve">was a more significant predictor than inflowing volume at two wetlands, and </w:t>
+      </w:r>
+      <w:r>
+        <w:t>within the same magnitude</w:t>
+      </w:r>
+      <w:r>
+        <w:t xml:space="preserve"> </w:t>
+      </w:r>
+      <w:r>
+        <w:t>at 8 more wetlands</w:t>
+      </w:r>
+      <w:r>
+        <w:t xml:space="preserve">, </w:t>
+      </w:r>
+    </w:p>
+    <w:p>
+      <w:r>
+        <w:t xml:space="preserve"> </w:t>
+      </w:r>
+    </w:p>
+    <w:p>
+      <w:pPr>
+        <w:rPr>
+          <w:i/>
+          <w:iCs/>
+        </w:rPr>
+      </w:pPr>
+      <w:r>
+        <w:rPr>
+          <w:i/>
+          <w:iCs/>
+        </w:rPr>
+        <w:t>3.</w:t>
+      </w:r>
+      <w:r>
+        <w:rPr>
+          <w:i/>
+          <w:iCs/>
+        </w:rPr>
+        <w:t>4</w:t>
+      </w:r>
+      <w:r>
+        <w:rPr>
+          <w:i/>
+          <w:iCs/>
+        </w:rPr>
+        <w:t xml:space="preserve"> </w:t>
+      </w:r>
+      <w:r>
+        <w:rPr>
+          <w:i/>
+          <w:iCs/>
+        </w:rPr>
+        <w:t>Drivers of Nutrient Re</w:t>
+      </w:r>
+      <w:r>
+        <w:rPr>
+          <w:i/>
+          <w:iCs/>
+        </w:rPr>
+        <w:t>lease</w:t>
+      </w:r>
+    </w:p>
+    <w:p>
+      <w:r>
+        <w:tab/>
+      </w:r>
+      <w:r>
+        <w:t xml:space="preserve">To understand patterns of nutrient release we constructed a </w:t>
+      </w:r>
+      <w:r>
+        <w:t xml:space="preserve">logistic regression </w:t>
+      </w:r>
+      <w:r>
+        <w:t xml:space="preserve">BUT KENNY HASN’T </w:t>
+      </w:r>
+      <w:r>
+        <w:t xml:space="preserve">TRIED TO ADD DO AND TEMP TO THE MODEL. </w:t>
+      </w:r>
+      <w:r>
+        <w:t xml:space="preserve">That’s probably a good idea and would take a lot of interesting scenarios into account… </w:t>
+      </w:r>
+      <w:r>
+        <w:t>but also choosing WHERE to take that data from is tricky…</w:t>
+      </w:r>
+      <w:r>
+        <w:t xml:space="preserve"> SCALING THINGS UP TO WHOLE PROJECT ANALYSES IS AN ONGOING PROBLEM. </w:t>
+      </w:r>
+      <w:r>
+        <w:t xml:space="preserve"> </w:t>
+      </w:r>
+    </w:p>
+    <w:p/>
     <w:p/>
     <w:sectPr>
       <w:pgSz w:w="12240" w:h="15840"/>
@@ -4784,6 +5550,119 @@
       </w:rPr>
     </w:lvl>
     <w:lvl w:ilvl="1" w:tplc="04090003">
+      <w:start w:val="1"/>
+      <w:numFmt w:val="bullet"/>
+      <w:lvlText w:val="o"/>
+      <w:lvlJc w:val="left"/>
+      <w:pPr>
+        <w:ind w:left="1440" w:hanging="360"/>
+      </w:pPr>
+      <w:rPr>
+        <w:rFonts w:ascii="Courier New" w:hAnsi="Courier New" w:cs="Courier New" w:hint="default"/>
+      </w:rPr>
+    </w:lvl>
+    <w:lvl w:ilvl="2" w:tplc="04090005" w:tentative="1">
+      <w:start w:val="1"/>
+      <w:numFmt w:val="bullet"/>
+      <w:lvlText w:val=""/>
+      <w:lvlJc w:val="left"/>
+      <w:pPr>
+        <w:ind w:left="2160" w:hanging="360"/>
+      </w:pPr>
+      <w:rPr>
+        <w:rFonts w:ascii="Wingdings" w:hAnsi="Wingdings" w:hint="default"/>
+      </w:rPr>
+    </w:lvl>
+    <w:lvl w:ilvl="3" w:tplc="04090001" w:tentative="1">
+      <w:start w:val="1"/>
+      <w:numFmt w:val="bullet"/>
+      <w:lvlText w:val=""/>
+      <w:lvlJc w:val="left"/>
+      <w:pPr>
+        <w:ind w:left="2880" w:hanging="360"/>
+      </w:pPr>
+      <w:rPr>
+        <w:rFonts w:ascii="Symbol" w:hAnsi="Symbol" w:hint="default"/>
+      </w:rPr>
+    </w:lvl>
+    <w:lvl w:ilvl="4" w:tplc="04090003" w:tentative="1">
+      <w:start w:val="1"/>
+      <w:numFmt w:val="bullet"/>
+      <w:lvlText w:val="o"/>
+      <w:lvlJc w:val="left"/>
+      <w:pPr>
+        <w:ind w:left="3600" w:hanging="360"/>
+      </w:pPr>
+      <w:rPr>
+        <w:rFonts w:ascii="Courier New" w:hAnsi="Courier New" w:cs="Courier New" w:hint="default"/>
+      </w:rPr>
+    </w:lvl>
+    <w:lvl w:ilvl="5" w:tplc="04090005" w:tentative="1">
+      <w:start w:val="1"/>
+      <w:numFmt w:val="bullet"/>
+      <w:lvlText w:val=""/>
+      <w:lvlJc w:val="left"/>
+      <w:pPr>
+        <w:ind w:left="4320" w:hanging="360"/>
+      </w:pPr>
+      <w:rPr>
+        <w:rFonts w:ascii="Wingdings" w:hAnsi="Wingdings" w:hint="default"/>
+      </w:rPr>
+    </w:lvl>
+    <w:lvl w:ilvl="6" w:tplc="04090001" w:tentative="1">
+      <w:start w:val="1"/>
+      <w:numFmt w:val="bullet"/>
+      <w:lvlText w:val=""/>
+      <w:lvlJc w:val="left"/>
+      <w:pPr>
+        <w:ind w:left="5040" w:hanging="360"/>
+      </w:pPr>
+      <w:rPr>
+        <w:rFonts w:ascii="Symbol" w:hAnsi="Symbol" w:hint="default"/>
+      </w:rPr>
+    </w:lvl>
+    <w:lvl w:ilvl="7" w:tplc="04090003" w:tentative="1">
+      <w:start w:val="1"/>
+      <w:numFmt w:val="bullet"/>
+      <w:lvlText w:val="o"/>
+      <w:lvlJc w:val="left"/>
+      <w:pPr>
+        <w:ind w:left="5760" w:hanging="360"/>
+      </w:pPr>
+      <w:rPr>
+        <w:rFonts w:ascii="Courier New" w:hAnsi="Courier New" w:cs="Courier New" w:hint="default"/>
+      </w:rPr>
+    </w:lvl>
+    <w:lvl w:ilvl="8" w:tplc="04090005" w:tentative="1">
+      <w:start w:val="1"/>
+      <w:numFmt w:val="bullet"/>
+      <w:lvlText w:val=""/>
+      <w:lvlJc w:val="left"/>
+      <w:pPr>
+        <w:ind w:left="6480" w:hanging="360"/>
+      </w:pPr>
+      <w:rPr>
+        <w:rFonts w:ascii="Wingdings" w:hAnsi="Wingdings" w:hint="default"/>
+      </w:rPr>
+    </w:lvl>
+  </w:abstractNum>
+  <w:abstractNum w:abstractNumId="12" w15:restartNumberingAfterBreak="0">
+    <w:nsid w:val="7D561E69"/>
+    <w:multiLevelType w:val="hybridMultilevel"/>
+    <w:tmpl w:val="909C38D0"/>
+    <w:lvl w:ilvl="0" w:tplc="04090001">
+      <w:start w:val="1"/>
+      <w:numFmt w:val="bullet"/>
+      <w:lvlText w:val=""/>
+      <w:lvlJc w:val="left"/>
+      <w:pPr>
+        <w:ind w:left="720" w:hanging="360"/>
+      </w:pPr>
+      <w:rPr>
+        <w:rFonts w:ascii="Symbol" w:hAnsi="Symbol" w:hint="default"/>
+      </w:rPr>
+    </w:lvl>
+    <w:lvl w:ilvl="1" w:tplc="04090003" w:tentative="1">
       <w:start w:val="1"/>
       <w:numFmt w:val="bullet"/>
       <w:lvlText w:val="o"/>
@@ -4915,6 +5794,9 @@
   </w:num>
   <w:num w:numId="12" w16cid:durableId="1864246044">
     <w:abstractNumId w:val="3"/>
+  </w:num>
+  <w:num w:numId="13" w16cid:durableId="483745644">
+    <w:abstractNumId w:val="12"/>
   </w:num>
 </w:numbering>
 </file>

</xml_diff>

<commit_message>
Summary Stats for nutrient release
</commit_message>
<xml_diff>
--- a/Annual Report Manuscript Outline.docx
+++ b/Annual Report Manuscript Outline.docx
@@ -3571,7 +3571,7 @@
           <w:i/>
           <w:iCs/>
         </w:rPr>
-        <w:t>: Volume</w:t>
+        <w:t xml:space="preserve"> Across Wetlands</w:t>
       </w:r>
     </w:p>
     <w:p>
@@ -4045,179 +4045,256 @@
           <w:i/>
           <w:iCs/>
         </w:rPr>
-        <w:t>Drivers of Nutrient Retention: Concentration</w:t>
-      </w:r>
-    </w:p>
-    <w:p>
-      <w:pPr>
-        <w:ind w:firstLine="360"/>
-      </w:pPr>
-      <w:r>
-        <w:t xml:space="preserve">While we found that inflow volume to each wetland had a stronger correlation </w:t>
-      </w:r>
-      <w:r>
-        <w:t>with nutrient retention tha</w:t>
-      </w:r>
-      <w:r>
-        <w:t xml:space="preserve">n </w:t>
-      </w:r>
-      <w:r>
-        <w:t>concentration, we found that within</w:t>
-      </w:r>
-      <w:r>
-        <w:t xml:space="preserve"> individual</w:t>
-      </w:r>
-      <w:r>
-        <w:t xml:space="preserve"> wetlands concentration </w:t>
-      </w:r>
-      <w:r>
-        <w:t xml:space="preserve">often </w:t>
-      </w:r>
-      <w:r>
-        <w:t>was</w:t>
-      </w:r>
-      <w:r>
-        <w:t xml:space="preserve"> a similar or occasionally</w:t>
-      </w:r>
-      <w:r>
-        <w:t xml:space="preserve"> a</w:t>
-      </w:r>
-      <w:r>
-        <w:t xml:space="preserve"> more</w:t>
-      </w:r>
-      <w:r>
-        <w:t xml:space="preserve"> important </w:t>
-      </w:r>
-      <w:r>
-        <w:t>predictor of nutrient retention</w:t>
-      </w:r>
-      <w:r>
-        <w:t xml:space="preserve"> than inflowing volume</w:t>
-      </w:r>
-      <w:r>
-        <w:t xml:space="preserve">. </w:t>
-      </w:r>
-      <w:r>
-        <w:t>We made linear models</w:t>
-      </w:r>
-      <w:r>
-        <w:t xml:space="preserve"> predicting nutrient retention by </w:t>
-      </w:r>
-      <w:r>
-        <w:t>inflowing volume and concentration</w:t>
-      </w:r>
-      <w:r>
-        <w:t xml:space="preserve"> </w:t>
-      </w:r>
-      <w:r>
-        <w:t>for each</w:t>
-      </w:r>
-      <w:r>
-        <w:t xml:space="preserve"> individual wetland</w:t>
-      </w:r>
-      <w:r>
-        <w:t xml:space="preserve"> and </w:t>
-      </w:r>
-      <w:r>
-        <w:t>predictor</w:t>
-      </w:r>
-      <w:r>
-        <w:t xml:space="preserve"> </w:t>
-      </w:r>
-      <w:r>
-        <w:t>t-value</w:t>
-      </w:r>
-      <w:r>
-        <w:t xml:space="preserve">s indicate that </w:t>
-      </w:r>
-      <w:r>
-        <w:t>concentration is sometimes a more significant predictor and often a similarly important predictor</w:t>
-      </w:r>
-      <w:r>
-        <w:t xml:space="preserve"> to inflowing volume</w:t>
-      </w:r>
-      <w:r>
-        <w:t xml:space="preserve"> (</w:t>
-      </w:r>
-      <w:r>
-        <w:rPr>
-          <w:highlight w:val="yellow"/>
-        </w:rPr>
-        <w:t>Figure XX</w:t>
-      </w:r>
-      <w:r>
-        <w:t>).</w:t>
-      </w:r>
-      <w:r>
-        <w:t xml:space="preserve"> </w:t>
-      </w:r>
-      <w:r>
-        <w:t>Based on model t-values TP</w:t>
-      </w:r>
-      <w:r>
-        <w:t xml:space="preserve"> concentration </w:t>
-      </w:r>
-      <w:r>
-        <w:t xml:space="preserve">was a more significant predictor than inflowing volume at two wetlands, and </w:t>
-      </w:r>
-      <w:r>
-        <w:t>within the same magnitude</w:t>
-      </w:r>
-      <w:r>
-        <w:t xml:space="preserve"> </w:t>
-      </w:r>
-      <w:r>
-        <w:t>at 8 more wetlands</w:t>
-      </w:r>
-      <w:r>
-        <w:t xml:space="preserve">, </w:t>
-      </w:r>
-    </w:p>
-    <w:p>
-      <w:r>
-        <w:t xml:space="preserve"> </w:t>
-      </w:r>
-    </w:p>
-    <w:p>
-      <w:pPr>
+        <w:t>Drivers of Nutrient Retention</w:t>
+      </w:r>
+      <w:r>
         <w:rPr>
           <w:i/>
           <w:iCs/>
         </w:rPr>
-      </w:pPr>
-      <w:r>
+        <w:t xml:space="preserve"> Within Wetlands</w:t>
+      </w:r>
+    </w:p>
+    <w:p>
+      <w:pPr>
+        <w:ind w:firstLine="360"/>
+      </w:pPr>
+      <w:r>
+        <w:t xml:space="preserve">While we found that inflow volume to each wetland had a stronger correlation </w:t>
+      </w:r>
+      <w:r>
+        <w:t>with nutrient retention tha</w:t>
+      </w:r>
+      <w:r>
+        <w:t xml:space="preserve">n </w:t>
+      </w:r>
+      <w:r>
+        <w:t>concentration, we found that within</w:t>
+      </w:r>
+      <w:r>
+        <w:t xml:space="preserve"> individual</w:t>
+      </w:r>
+      <w:r>
+        <w:t xml:space="preserve"> wetlands concentration </w:t>
+      </w:r>
+      <w:r>
+        <w:t xml:space="preserve">often </w:t>
+      </w:r>
+      <w:r>
+        <w:t>was</w:t>
+      </w:r>
+      <w:r>
+        <w:t xml:space="preserve"> a similar or occasionally</w:t>
+      </w:r>
+      <w:r>
+        <w:t xml:space="preserve"> a</w:t>
+      </w:r>
+      <w:r>
+        <w:t xml:space="preserve"> more</w:t>
+      </w:r>
+      <w:r>
+        <w:t xml:space="preserve"> important </w:t>
+      </w:r>
+      <w:r>
+        <w:t>predictor of nutrient retention</w:t>
+      </w:r>
+      <w:r>
+        <w:t xml:space="preserve"> than inflowing volume</w:t>
+      </w:r>
+      <w:r>
+        <w:t xml:space="preserve">. </w:t>
+      </w:r>
+      <w:r>
+        <w:t>We made linear models</w:t>
+      </w:r>
+      <w:r>
+        <w:t xml:space="preserve"> predicting nutrient retention by </w:t>
+      </w:r>
+      <w:r>
+        <w:t>inflowing volume and concentration</w:t>
+      </w:r>
+      <w:r>
+        <w:t xml:space="preserve"> </w:t>
+      </w:r>
+      <w:r>
+        <w:t>for each</w:t>
+      </w:r>
+      <w:r>
+        <w:t xml:space="preserve"> individual wetland</w:t>
+      </w:r>
+      <w:r>
+        <w:t xml:space="preserve"> and </w:t>
+      </w:r>
+      <w:r>
+        <w:t>predictor</w:t>
+      </w:r>
+      <w:r>
+        <w:t xml:space="preserve"> </w:t>
+      </w:r>
+      <w:r>
+        <w:t>t-value</w:t>
+      </w:r>
+      <w:r>
+        <w:t xml:space="preserve">s indicate that </w:t>
+      </w:r>
+      <w:r>
+        <w:t>concentration is sometimes a more significant predictor and often a similarly important predictor</w:t>
+      </w:r>
+      <w:r>
+        <w:t xml:space="preserve"> to inflowing volume</w:t>
+      </w:r>
+      <w:r>
+        <w:t xml:space="preserve"> (</w:t>
+      </w:r>
+      <w:r>
+        <w:rPr>
+          <w:highlight w:val="yellow"/>
+        </w:rPr>
+        <w:t>Figure XX</w:t>
+      </w:r>
+      <w:r>
+        <w:t>).</w:t>
+      </w:r>
+      <w:r>
+        <w:t xml:space="preserve"> </w:t>
+      </w:r>
+      <w:r>
+        <w:t>Based on model t-values TP</w:t>
+      </w:r>
+      <w:r>
+        <w:t xml:space="preserve"> concentration </w:t>
+      </w:r>
+      <w:r>
+        <w:t xml:space="preserve">was a more significant predictor than inflowing volume at two wetlands, and </w:t>
+      </w:r>
+      <w:r>
+        <w:t>within the same magnitude</w:t>
+      </w:r>
+      <w:r>
+        <w:t xml:space="preserve"> </w:t>
+      </w:r>
+      <w:r>
+        <w:t>at 8 more wetlands</w:t>
+      </w:r>
+      <w:r>
+        <w:t xml:space="preserve">, </w:t>
+      </w:r>
+      <w:r>
+        <w:t>TN concentration</w:t>
+      </w:r>
+      <w:r>
+        <w:t xml:space="preserve"> was a more significant predictor than inflowing volume at 4 wetlands and within the same magnitude at </w:t>
+      </w:r>
+      <w:r>
+        <w:t xml:space="preserve">7 more wetlands, </w:t>
+      </w:r>
+      <w:r>
+        <w:t xml:space="preserve">DRP </w:t>
+      </w:r>
+      <w:r>
+        <w:t xml:space="preserve">concentration was a more significant predictor than inflowing volume at </w:t>
+      </w:r>
+      <w:r>
+        <w:t>3</w:t>
+      </w:r>
+      <w:r>
+        <w:t xml:space="preserve"> wetlands and within the same magnitude at </w:t>
+      </w:r>
+      <w:r>
+        <w:t>7</w:t>
+      </w:r>
+      <w:r>
+        <w:t xml:space="preserve"> more wetlands</w:t>
+      </w:r>
+      <w:r>
+        <w:t xml:space="preserve">, NoX </w:t>
+      </w:r>
+      <w:r>
+        <w:t xml:space="preserve">concentration was a more significant predictor than inflowing volume at </w:t>
+      </w:r>
+      <w:r>
+        <w:t>6</w:t>
+      </w:r>
+      <w:r>
+        <w:t xml:space="preserve"> wetlands and within the same magnitude at </w:t>
+      </w:r>
+      <w:r>
+        <w:t>4</w:t>
+      </w:r>
+      <w:r>
+        <w:t xml:space="preserve"> more wetlands</w:t>
+      </w:r>
+      <w:r>
+        <w:t xml:space="preserve">, and NH3 </w:t>
+      </w:r>
+      <w:r>
+        <w:t xml:space="preserve">concentration was a more significant predictor than inflowing volume at </w:t>
+      </w:r>
+      <w:r>
+        <w:t>3</w:t>
+      </w:r>
+      <w:r>
+        <w:t xml:space="preserve"> wetlands and within the same magnitude at </w:t>
+      </w:r>
+      <w:r>
+        <w:t xml:space="preserve">8 </w:t>
+      </w:r>
+      <w:r>
+        <w:t>more wetlands</w:t>
+      </w:r>
+      <w:r>
+        <w:t xml:space="preserve"> (</w:t>
+      </w:r>
+      <w:r>
+        <w:rPr>
+          <w:highlight w:val="yellow"/>
+        </w:rPr>
+        <w:t>Table SX</w:t>
+      </w:r>
+      <w:r>
+        <w:t>).</w:t>
+      </w:r>
+    </w:p>
+    <w:p>
+      <w:pPr>
         <w:rPr>
           <w:i/>
           <w:iCs/>
         </w:rPr>
-        <w:t>3.</w:t>
-      </w:r>
+      </w:pPr>
       <w:r>
         <w:rPr>
           <w:i/>
           <w:iCs/>
         </w:rPr>
-        <w:t>4</w:t>
+        <w:t>3.</w:t>
       </w:r>
       <w:r>
         <w:rPr>
           <w:i/>
           <w:iCs/>
         </w:rPr>
-        <w:t xml:space="preserve"> </w:t>
+        <w:t>4</w:t>
       </w:r>
       <w:r>
         <w:rPr>
           <w:i/>
           <w:iCs/>
         </w:rPr>
-        <w:t>Drivers of Nutrient Re</w:t>
+        <w:t xml:space="preserve"> </w:t>
       </w:r>
       <w:r>
         <w:rPr>
           <w:i/>
           <w:iCs/>
         </w:rPr>
+        <w:t>Drivers of Nutrient Re</w:t>
+      </w:r>
+      <w:r>
+        <w:rPr>
+          <w:i/>
+          <w:iCs/>
+        </w:rPr>
         <w:t>lease</w:t>
       </w:r>
     </w:p>
@@ -4226,32 +4303,248 @@
         <w:tab/>
       </w:r>
       <w:r>
-        <w:t xml:space="preserve">To understand patterns of nutrient release we constructed a </w:t>
+        <w:t xml:space="preserve">To understand patterns of nutrient release we </w:t>
+      </w:r>
+      <w:r>
+        <w:t>performed</w:t>
+      </w:r>
+      <w:r>
+        <w:t xml:space="preserve"> a </w:t>
       </w:r>
       <w:r>
         <w:t xml:space="preserve">logistic regression </w:t>
       </w:r>
       <w:r>
-        <w:t xml:space="preserve">BUT KENNY HASN’T </w:t>
-      </w:r>
-      <w:r>
-        <w:t xml:space="preserve">TRIED TO ADD DO AND TEMP TO THE MODEL. </w:t>
-      </w:r>
-      <w:r>
-        <w:t xml:space="preserve">That’s probably a good idea and would take a lot of interesting scenarios into account… </w:t>
-      </w:r>
-      <w:r>
-        <w:t>but also choosing WHERE to take that data from is tricky…</w:t>
-      </w:r>
-      <w:r>
-        <w:t xml:space="preserve"> SCALING THINGS UP TO WHOLE PROJECT ANALYSES IS AN ONGOING PROBLEM. </w:t>
+        <w:t xml:space="preserve">with month, </w:t>
+      </w:r>
+      <w:r>
+        <w:t xml:space="preserve">inflowing concentration, and inflowing volume as predictors of </w:t>
+      </w:r>
+      <w:r>
+        <w:t xml:space="preserve">whether </w:t>
+      </w:r>
+      <w:r>
+        <w:t>nutrient</w:t>
+      </w:r>
+      <w:r>
+        <w:t>s</w:t>
       </w:r>
       <w:r>
         <w:t xml:space="preserve"> </w:t>
       </w:r>
+      <w:r>
+        <w:t>were retained or released</w:t>
+      </w:r>
+      <w:r>
+        <w:t xml:space="preserve">. </w:t>
+      </w:r>
+      <w:r>
+        <w:t>For both TP and TN</w:t>
+      </w:r>
+      <w:r>
+        <w:t xml:space="preserve"> inflowing nutrient concentration was the only significant predictor of </w:t>
+      </w:r>
+      <w:r>
+        <w:t>nutrient release, with higher probability of release at lower nutrient concentrations</w:t>
+      </w:r>
+      <w:r>
+        <w:t xml:space="preserve"> (</w:t>
+      </w:r>
+      <w:r>
+        <w:rPr>
+          <w:highlight w:val="yellow"/>
+        </w:rPr>
+        <w:t>Fig</w:t>
+      </w:r>
+      <w:r>
+        <w:rPr>
+          <w:highlight w:val="yellow"/>
+        </w:rPr>
+        <w:t>ure XX</w:t>
+      </w:r>
+      <w:r>
+        <w:t>)</w:t>
+      </w:r>
+      <w:r>
+        <w:t xml:space="preserve">. </w:t>
+      </w:r>
+      <w:r>
+        <w:lastRenderedPageBreak/>
+        <w:t xml:space="preserve">Inflowing TP concentration during </w:t>
+      </w:r>
+      <w:r>
+        <w:t xml:space="preserve">months with net </w:t>
+      </w:r>
+      <w:r>
+        <w:t>releases</w:t>
+      </w:r>
+      <w:r>
+        <w:t xml:space="preserve"> of TP</w:t>
+      </w:r>
+      <w:r>
+        <w:t xml:space="preserve"> </w:t>
+      </w:r>
+      <w:r>
+        <w:t>(mean 0.16</w:t>
+      </w:r>
+      <w:r>
+        <w:t>±0.15</w:t>
+      </w:r>
+      <w:r>
+        <w:t xml:space="preserve"> mg/L) </w:t>
+      </w:r>
+      <w:r>
+        <w:t>were</w:t>
+      </w:r>
+      <w:r>
+        <w:t xml:space="preserve"> significantly</w:t>
+      </w:r>
+      <w:r>
+        <w:t xml:space="preserve"> </w:t>
+      </w:r>
+      <w:r>
+        <w:t>lower</w:t>
+      </w:r>
+      <w:r>
+        <w:t xml:space="preserve"> than </w:t>
+      </w:r>
+      <w:r>
+        <w:t xml:space="preserve">during </w:t>
+      </w:r>
+      <w:r>
+        <w:t xml:space="preserve">months with </w:t>
+      </w:r>
+      <w:r>
+        <w:t>net retention of TP (</w:t>
+      </w:r>
+      <w:r>
+        <w:t>mean 0.39</w:t>
+      </w:r>
+      <w:r>
+        <w:t>±0.</w:t>
+      </w:r>
+      <w:r>
+        <w:t>40</w:t>
+      </w:r>
+      <w:r>
+        <w:t xml:space="preserve"> </w:t>
+      </w:r>
+      <w:r>
+        <w:t xml:space="preserve"> mg/L; </w:t>
+      </w:r>
+      <w:r>
+        <w:t>Welch Two-Sample t-test, t = 7.4, p &lt; 0.01)</w:t>
+      </w:r>
+      <w:r>
+        <w:t xml:space="preserve">. </w:t>
+      </w:r>
+      <w:r>
+        <w:t>Inflowing T</w:t>
+      </w:r>
+      <w:r>
+        <w:t>N</w:t>
+      </w:r>
+      <w:r>
+        <w:t xml:space="preserve"> concentration during months with net releases of T</w:t>
+      </w:r>
+      <w:r>
+        <w:t>N</w:t>
+      </w:r>
+      <w:r>
+        <w:t xml:space="preserve"> (mean </w:t>
+      </w:r>
+      <w:r>
+        <w:t>2.11</w:t>
+      </w:r>
+      <w:r>
+        <w:t>±</w:t>
+      </w:r>
+      <w:r>
+        <w:t>1.66</w:t>
+      </w:r>
+      <w:r>
+        <w:t xml:space="preserve"> mg/L) were significantly lower than during months with net retention of T</w:t>
+      </w:r>
+      <w:r>
+        <w:t>N</w:t>
+      </w:r>
+      <w:r>
+        <w:t xml:space="preserve"> (mean </w:t>
+      </w:r>
+      <w:r>
+        <w:t>5.08</w:t>
+      </w:r>
+      <w:r>
+        <w:t>±</w:t>
+      </w:r>
+      <w:r>
+        <w:t>4.78</w:t>
+      </w:r>
+      <w:r>
+        <w:t xml:space="preserve">  mg/L; Welch Two-Sample t-test, t = 7.</w:t>
+      </w:r>
+      <w:r>
+        <w:t>9</w:t>
+      </w:r>
+      <w:r>
+        <w:t>, p &lt; 0.01).</w:t>
+      </w:r>
     </w:p>
     <w:p/>
-    <w:p/>
+    <w:p>
+      <w:pPr>
+        <w:rPr>
+          <w:i/>
+          <w:iCs/>
+        </w:rPr>
+      </w:pPr>
+      <w:r>
+        <w:rPr>
+          <w:i/>
+          <w:iCs/>
+        </w:rPr>
+        <w:t>3.</w:t>
+      </w:r>
+      <w:r>
+        <w:rPr>
+          <w:i/>
+          <w:iCs/>
+        </w:rPr>
+        <w:t>5</w:t>
+      </w:r>
+      <w:r>
+        <w:rPr>
+          <w:i/>
+          <w:iCs/>
+        </w:rPr>
+        <w:t xml:space="preserve"> </w:t>
+      </w:r>
+      <w:r>
+        <w:rPr>
+          <w:i/>
+          <w:iCs/>
+        </w:rPr>
+        <w:t xml:space="preserve">Nutrient Retention </w:t>
+      </w:r>
+      <w:r>
+        <w:rPr>
+          <w:i/>
+          <w:iCs/>
+        </w:rPr>
+        <w:t>over time</w:t>
+      </w:r>
+    </w:p>
+    <w:p>
+      <w:pPr>
+        <w:ind w:firstLine="720"/>
+      </w:pPr>
+      <w:r>
+        <w:t>We collected 3 or more years of data at 5 of the 24 t</w:t>
+      </w:r>
+      <w:r>
+        <w:t>otal wetlands.</w:t>
+      </w:r>
+    </w:p>
     <w:sectPr>
       <w:pgSz w:w="12240" w:h="15840"/>
       <w:pgMar w:top="1440" w:right="1440" w:bottom="1440" w:left="1440" w:header="720" w:footer="720" w:gutter="0"/>

</xml_diff>

<commit_message>
Finished release code and text
</commit_message>
<xml_diff>
--- a/Annual Report Manuscript Outline.docx
+++ b/Annual Report Manuscript Outline.docx
@@ -81,8 +81,13 @@
       <w:r>
         <w:t xml:space="preserve">Is a big model worth it? </w:t>
       </w:r>
-      <w:r>
-        <w:t xml:space="preserve">Should we just do separate analyses? Should those analyses go in this paper? </w:t>
+      <w:proofErr w:type="gramStart"/>
+      <w:r>
+        <w:t>Should</w:t>
+      </w:r>
+      <w:proofErr w:type="gramEnd"/>
+      <w:r>
+        <w:t xml:space="preserve"> we just do separate analyses? Should those analyses go in this paper? </w:t>
       </w:r>
     </w:p>
     <w:p>
@@ -94,7 +99,15 @@
         </w:numPr>
       </w:pPr>
       <w:r>
-        <w:t>Is this worth including? The data included is limited and different time and spatial scales make it kind of weird to put together.</w:t>
+        <w:t xml:space="preserve">Is this worth including? The data included is limited and different </w:t>
+      </w:r>
+      <w:proofErr w:type="gramStart"/>
+      <w:r>
+        <w:t>time</w:t>
+      </w:r>
+      <w:proofErr w:type="gramEnd"/>
+      <w:r>
+        <w:t xml:space="preserve"> and spatial scales make it kind of weird to put together.</w:t>
       </w:r>
     </w:p>
     <w:p>
@@ -159,7 +172,15 @@
         <w:t xml:space="preserve">If we do include: </w:t>
       </w:r>
       <w:r>
-        <w:t xml:space="preserve">Additional data we could include? </w:t>
+        <w:t xml:space="preserve">Additional </w:t>
+      </w:r>
+      <w:proofErr w:type="gramStart"/>
+      <w:r>
+        <w:t>data</w:t>
+      </w:r>
+      <w:proofErr w:type="gramEnd"/>
+      <w:r>
+        <w:t xml:space="preserve"> we could include? </w:t>
       </w:r>
     </w:p>
     <w:p>
@@ -344,13 +365,29 @@
         </w:numPr>
       </w:pPr>
       <w:r>
-        <w:t>Talk about watershed. Talk about</w:t>
+        <w:t xml:space="preserve">Talk about </w:t>
+      </w:r>
+      <w:proofErr w:type="gramStart"/>
+      <w:r>
+        <w:t>watershed</w:t>
+      </w:r>
+      <w:proofErr w:type="gramEnd"/>
+      <w:r>
+        <w:t>. Talk about</w:t>
       </w:r>
       <w:r>
         <w:t xml:space="preserve"> Ohio/</w:t>
       </w:r>
       <w:r>
-        <w:t xml:space="preserve">Maumee. Talk about how ag it is. </w:t>
+        <w:t xml:space="preserve">Maumee. Talk about how </w:t>
+      </w:r>
+      <w:proofErr w:type="gramStart"/>
+      <w:r>
+        <w:t>ag</w:t>
+      </w:r>
+      <w:proofErr w:type="gramEnd"/>
+      <w:r>
+        <w:t xml:space="preserve"> it is. </w:t>
       </w:r>
     </w:p>
     <w:p>
@@ -428,8 +465,13 @@
         </w:numPr>
       </w:pPr>
       <w:r>
-        <w:t>Statistics stuff</w:t>
-      </w:r>
+        <w:t xml:space="preserve">Statistics </w:t>
+      </w:r>
+      <w:proofErr w:type="gramStart"/>
+      <w:r>
+        <w:t>stuff</w:t>
+      </w:r>
+      <w:proofErr w:type="gramEnd"/>
     </w:p>
     <w:p>
       <w:r>
@@ -728,7 +770,20 @@
         </w:numPr>
       </w:pPr>
       <w:r>
-        <w:t>Concentration affects on nutrient retention</w:t>
+        <w:t xml:space="preserve">Concentration </w:t>
+      </w:r>
+      <w:proofErr w:type="spellStart"/>
+      <w:proofErr w:type="gramStart"/>
+      <w:r>
+        <w:t>affects</w:t>
+      </w:r>
+      <w:proofErr w:type="spellEnd"/>
+      <w:r>
+        <w:t xml:space="preserve"> on</w:t>
+      </w:r>
+      <w:proofErr w:type="gramEnd"/>
+      <w:r>
+        <w:t xml:space="preserve"> nutrient retention</w:t>
       </w:r>
     </w:p>
     <w:p>
@@ -1210,7 +1265,15 @@
         <w:t xml:space="preserve"> predicted by low incoming concentrations</w:t>
       </w:r>
       <w:r>
-        <w:t xml:space="preserve"> (likely influence is shared by low concentrations an dilution </w:t>
+        <w:t xml:space="preserve"> (likely influence is shared by low concentrations </w:t>
+      </w:r>
+      <w:proofErr w:type="gramStart"/>
+      <w:r>
+        <w:t>an</w:t>
+      </w:r>
+      <w:proofErr w:type="gramEnd"/>
+      <w:r>
+        <w:t xml:space="preserve"> dilution </w:t>
       </w:r>
       <w:r>
         <w:t>during high flow periods which don’t necessarily correlate with high flows to individual wetlands</w:t>
@@ -1258,10 +1321,10 @@
           <w:noProof/>
         </w:rPr>
         <w:drawing>
-          <wp:inline distT="0" distB="0" distL="0" distR="0" wp14:anchorId="7074163B" wp14:editId="65937695">
-            <wp:extent cx="4855152" cy="2163047"/>
-            <wp:effectExtent l="0" t="0" r="3175" b="8890"/>
-            <wp:docPr id="943382599" name="Picture 2"/>
+          <wp:inline distT="0" distB="0" distL="0" distR="0" wp14:anchorId="465A59A2" wp14:editId="63EC58E9">
+            <wp:extent cx="4275065" cy="2428875"/>
+            <wp:effectExtent l="0" t="0" r="0" b="0"/>
+            <wp:docPr id="1788969884" name="Picture 18"/>
             <wp:cNvGraphicFramePr>
               <a:graphicFrameLocks xmlns:a="http://schemas.openxmlformats.org/drawingml/2006/main" noChangeAspect="1"/>
             </wp:cNvGraphicFramePr>
@@ -1269,7 +1332,7 @@
               <a:graphicData uri="http://schemas.openxmlformats.org/drawingml/2006/picture">
                 <pic:pic xmlns:pic="http://schemas.openxmlformats.org/drawingml/2006/picture">
                   <pic:nvPicPr>
-                    <pic:cNvPr id="0" name="Picture 2"/>
+                    <pic:cNvPr id="0" name="Picture 10"/>
                     <pic:cNvPicPr>
                       <a:picLocks noChangeAspect="1" noChangeArrowheads="1"/>
                     </pic:cNvPicPr>
@@ -1290,7 +1353,7 @@
                   <pic:spPr bwMode="auto">
                     <a:xfrm>
                       <a:off x="0" y="0"/>
-                      <a:ext cx="4866726" cy="2168204"/>
+                      <a:ext cx="4277206" cy="2430091"/>
                     </a:xfrm>
                     <a:prstGeom prst="rect">
                       <a:avLst/>
@@ -1622,7 +1685,15 @@
         <w:fldChar w:fldCharType="end"/>
       </w:r>
       <w:r>
-        <w:t xml:space="preserve">. Eutrophication of aquatic habitats has lead to a variety of water quality issues including harmful algal blooms </w:t>
+        <w:t xml:space="preserve">. Eutrophication of aquatic habitats has </w:t>
+      </w:r>
+      <w:proofErr w:type="spellStart"/>
+      <w:r>
+        <w:t>lead</w:t>
+      </w:r>
+      <w:proofErr w:type="spellEnd"/>
+      <w:r>
+        <w:t xml:space="preserve"> to a variety of water quality issues including harmful algal blooms </w:t>
       </w:r>
       <w:r>
         <w:fldChar w:fldCharType="begin"/>
@@ -1658,7 +1729,21 @@
         <w:rPr>
           <w:rFonts w:ascii="Aptos" w:hAnsi="Aptos"/>
         </w:rPr>
-        <w:t>(Carpenter et al. 1998, Vymazal 2007, Weisner et al. 2016)</w:t>
+        <w:t xml:space="preserve">(Carpenter et al. 1998, </w:t>
+      </w:r>
+      <w:proofErr w:type="spellStart"/>
+      <w:r>
+        <w:rPr>
+          <w:rFonts w:ascii="Aptos" w:hAnsi="Aptos"/>
+        </w:rPr>
+        <w:t>Vymazal</w:t>
+      </w:r>
+      <w:proofErr w:type="spellEnd"/>
+      <w:r>
+        <w:rPr>
+          <w:rFonts w:ascii="Aptos" w:hAnsi="Aptos"/>
+        </w:rPr>
+        <w:t xml:space="preserve"> 2007, Weisner et al. 2016)</w:t>
       </w:r>
       <w:r>
         <w:fldChar w:fldCharType="end"/>
@@ -1757,7 +1842,21 @@
         <w:rPr>
           <w:rFonts w:ascii="Aptos" w:hAnsi="Aptos"/>
         </w:rPr>
-        <w:t>(Mitsch et al. 2014, Aziz and Van Cappellen 2021)</w:t>
+        <w:t xml:space="preserve">(Mitsch et al. 2014, Aziz and Van </w:t>
+      </w:r>
+      <w:proofErr w:type="spellStart"/>
+      <w:r>
+        <w:rPr>
+          <w:rFonts w:ascii="Aptos" w:hAnsi="Aptos"/>
+        </w:rPr>
+        <w:t>Cappellen</w:t>
+      </w:r>
+      <w:proofErr w:type="spellEnd"/>
+      <w:r>
+        <w:rPr>
+          <w:rFonts w:ascii="Aptos" w:hAnsi="Aptos"/>
+        </w:rPr>
+        <w:t xml:space="preserve"> 2021)</w:t>
       </w:r>
       <w:r>
         <w:fldChar w:fldCharType="end"/>
@@ -2952,12 +3051,14 @@
       <w:r>
         <w:t xml:space="preserve">) database using the wetland project coordinates and the </w:t>
       </w:r>
+      <w:proofErr w:type="spellStart"/>
       <w:r>
         <w:rPr>
           <w:rFonts w:ascii="Courier New" w:hAnsi="Courier New" w:cs="Courier New"/>
         </w:rPr>
         <w:t>nasapower</w:t>
       </w:r>
+      <w:proofErr w:type="spellEnd"/>
       <w:r>
         <w:t xml:space="preserve"> R package</w:t>
       </w:r>
@@ -3002,6 +3103,7 @@
       <w:r>
         <w:t xml:space="preserve"> was computed following the Penman-Monteith FAO-56 equation, which combines a radiation term (</w:t>
       </w:r>
+      <w:proofErr w:type="spellStart"/>
       <w:r>
         <w:rPr>
           <w:i/>
@@ -3017,9 +3119,11 @@
         </w:rPr>
         <w:t>s</w:t>
       </w:r>
+      <w:proofErr w:type="spellEnd"/>
       <w:r>
         <w:t>) and an aerodynamic term (</w:t>
       </w:r>
+      <w:proofErr w:type="spellStart"/>
       <w:r>
         <w:rPr>
           <w:i/>
@@ -3035,6 +3139,7 @@
         </w:rPr>
         <w:t>a</w:t>
       </w:r>
+      <w:proofErr w:type="spellEnd"/>
       <w:r>
         <w:t>) to estimate the evaporative demand of the atmosphere over a hypothetical reference crop (Allen et al., 1998). Key intermediate variables (e.g., slope of the saturation vapor pressure curve, the psychrometric constant, mean saturation and actual vapor pressure) were calculated from the daily meteorological inputs and project-specific parameters (latitude, elevation). Soil heat flux density (</w:t>
       </w:r>
@@ -3157,7 +3262,15 @@
         <w:t>per</w:t>
       </w:r>
       <w:r>
-        <w:t xml:space="preserve"> projects. </w:t>
+        <w:t xml:space="preserve"> </w:t>
+      </w:r>
+      <w:proofErr w:type="gramStart"/>
+      <w:r>
+        <w:t>projects</w:t>
+      </w:r>
+      <w:proofErr w:type="gramEnd"/>
+      <w:r>
+        <w:t xml:space="preserve">. </w:t>
       </w:r>
       <w:r>
         <w:t xml:space="preserve">The </w:t>
@@ -3371,8 +3484,13 @@
         <w:t>nutrient filtration</w:t>
       </w:r>
       <w:r>
-        <w:t xml:space="preserve"> in most wetlands</w:t>
-      </w:r>
+        <w:t xml:space="preserve"> in most </w:t>
+      </w:r>
+      <w:proofErr w:type="gramStart"/>
+      <w:r>
+        <w:t>wetlands</w:t>
+      </w:r>
+      <w:proofErr w:type="gramEnd"/>
       <w:r>
         <w:t xml:space="preserve"> </w:t>
       </w:r>
@@ -3500,7 +3618,15 @@
         <w:t>wetland-months</w:t>
       </w:r>
       <w:r>
-        <w:t xml:space="preserve">) indicated no net release or filtration of N. For the vast majority of </w:t>
+        <w:t xml:space="preserve">) indicated no net release or filtration of N. For </w:t>
+      </w:r>
+      <w:proofErr w:type="gramStart"/>
+      <w:r>
+        <w:t>the vast majority of</w:t>
+      </w:r>
+      <w:proofErr w:type="gramEnd"/>
+      <w:r>
+        <w:t xml:space="preserve"> </w:t>
       </w:r>
       <w:r>
         <w:t>wetlands</w:t>
@@ -3542,7 +3668,15 @@
         <w:t>Dissolved nutrients were similarly retained primarily during spring with</w:t>
       </w:r>
       <w:r>
-        <w:t xml:space="preserve"> 34% of DRP is processed in the spring and 39% in the summer, 44% of nitrite+nitrate is processed in the spring and 38% in the summer, and 18% of total ammonium nitrogen (NH4) is processed in the spring and 58% in the summer.</w:t>
+        <w:t xml:space="preserve"> 34% of DRP is processed in the spring and 39% in the summer, 44% of </w:t>
+      </w:r>
+      <w:proofErr w:type="spellStart"/>
+      <w:r>
+        <w:t>nitrite+nitrate</w:t>
+      </w:r>
+      <w:proofErr w:type="spellEnd"/>
+      <w:r>
+        <w:t xml:space="preserve"> is processed in the spring and 38% in the summer, and 18% of total ammonium nitrogen (NH4) is processed in the spring and 58% in the summer.</w:t>
       </w:r>
     </w:p>
     <w:p>
@@ -3585,7 +3719,15 @@
         <w:t xml:space="preserve"> and release</w:t>
       </w:r>
       <w:r>
-        <w:t xml:space="preserve"> across wetlands was significantly </w:t>
+        <w:t xml:space="preserve"> across wetlands </w:t>
+      </w:r>
+      <w:proofErr w:type="gramStart"/>
+      <w:r>
+        <w:t>was</w:t>
+      </w:r>
+      <w:proofErr w:type="gramEnd"/>
+      <w:r>
+        <w:t xml:space="preserve"> significantly </w:t>
       </w:r>
       <w:r>
         <w:t xml:space="preserve">related to inflow volume. </w:t>
@@ -4207,7 +4349,15 @@
         <w:t xml:space="preserve"> more wetlands</w:t>
       </w:r>
       <w:r>
-        <w:t xml:space="preserve">, NoX </w:t>
+        <w:t xml:space="preserve">, </w:t>
+      </w:r>
+      <w:proofErr w:type="spellStart"/>
+      <w:r>
+        <w:t>NoX</w:t>
+      </w:r>
+      <w:proofErr w:type="spellEnd"/>
+      <w:r>
+        <w:t xml:space="preserve"> </w:t>
       </w:r>
       <w:r>
         <w:t xml:space="preserve">concentration was a more significant predictor than inflowing volume at </w:t>
@@ -4336,109 +4486,195 @@
         <w:t>were retained or released</w:t>
       </w:r>
       <w:r>
+        <w:t>.</w:t>
+      </w:r>
+      <w:r>
+        <w:t xml:space="preserve"> </w:t>
+      </w:r>
+      <w:r>
+        <w:t>I</w:t>
+      </w:r>
+      <w:r>
+        <w:t>nf</w:t>
+      </w:r>
+      <w:r>
+        <w:t xml:space="preserve">lowing nutrient concentration was the only significant predictor of </w:t>
+      </w:r>
+      <w:r>
+        <w:t>nutrient release</w:t>
+      </w:r>
+      <w:r>
+        <w:t xml:space="preserve"> for both </w:t>
+      </w:r>
+      <w:r>
+        <w:t>TP (Logistic Regression; z = -3.74, p &lt; 0.01) and TN (Logistic Regression; z = -4.13, p &lt; 0.01)</w:t>
+      </w:r>
+      <w:r>
+        <w:t xml:space="preserve">, </w:t>
+      </w:r>
+      <w:r>
+        <w:lastRenderedPageBreak/>
+        <w:t>with higher probability of release at lower nutrient concentrations</w:t>
+      </w:r>
+      <w:r>
+        <w:t xml:space="preserve"> (</w:t>
+      </w:r>
+      <w:r>
+        <w:rPr>
+          <w:highlight w:val="yellow"/>
+        </w:rPr>
+        <w:t>Fig</w:t>
+      </w:r>
+      <w:r>
+        <w:rPr>
+          <w:highlight w:val="yellow"/>
+        </w:rPr>
+        <w:t>ure XX</w:t>
+      </w:r>
+      <w:r>
+        <w:t>)</w:t>
+      </w:r>
+      <w:r>
         <w:t xml:space="preserve">. </w:t>
       </w:r>
       <w:r>
-        <w:t>For both TP and TN</w:t>
-      </w:r>
-      <w:r>
-        <w:t xml:space="preserve"> inflowing nutrient concentration was the only significant predictor of </w:t>
-      </w:r>
-      <w:r>
-        <w:t>nutrient release, with higher probability of release at lower nutrient concentrations</w:t>
-      </w:r>
-      <w:r>
-        <w:t xml:space="preserve"> (</w:t>
-      </w:r>
-      <w:r>
-        <w:rPr>
-          <w:highlight w:val="yellow"/>
-        </w:rPr>
-        <w:t>Fig</w:t>
-      </w:r>
-      <w:r>
-        <w:rPr>
-          <w:highlight w:val="yellow"/>
-        </w:rPr>
-        <w:t>ure XX</w:t>
+        <w:t>Neither month (</w:t>
+      </w:r>
+      <w:r>
+        <w:t xml:space="preserve">TP: </w:t>
+      </w:r>
+      <w:r>
+        <w:t xml:space="preserve">z = </w:t>
+      </w:r>
+      <w:r>
+        <w:t>-1.0</w:t>
+      </w:r>
+      <w:r>
+        <w:t>, p = 0.3, TN: z =</w:t>
+      </w:r>
+      <w:r>
+        <w:t xml:space="preserve"> 0.37, p = 0.7</w:t>
+      </w:r>
+      <w:r>
+        <w:t xml:space="preserve">) </w:t>
+      </w:r>
+      <w:r>
+        <w:t>nor inflow volume</w:t>
+      </w:r>
+      <w:r>
+        <w:t xml:space="preserve"> </w:t>
+      </w:r>
+      <w:r>
+        <w:t>(TP: z = -</w:t>
+      </w:r>
+      <w:r>
+        <w:t>0.</w:t>
+      </w:r>
+      <w:r>
+        <w:t>16</w:t>
+      </w:r>
+      <w:r>
+        <w:t>, p = 0.</w:t>
+      </w:r>
+      <w:r>
+        <w:t>9</w:t>
+      </w:r>
+      <w:r>
+        <w:t xml:space="preserve">, TN: z = </w:t>
+      </w:r>
+      <w:r>
+        <w:t>-0.62</w:t>
+      </w:r>
+      <w:r>
+        <w:t>, p = 0.</w:t>
+      </w:r>
+      <w:r>
+        <w:t>5</w:t>
       </w:r>
       <w:r>
         <w:t>)</w:t>
       </w:r>
       <w:r>
+        <w:t xml:space="preserve"> were significant predictors of nutrient release.</w:t>
+      </w:r>
+      <w:r>
+        <w:t xml:space="preserve"> </w:t>
+      </w:r>
+      <w:r>
+        <w:t xml:space="preserve">Inflowing TP concentration during </w:t>
+      </w:r>
+      <w:r>
+        <w:t xml:space="preserve">months with net </w:t>
+      </w:r>
+      <w:r>
+        <w:t>releases</w:t>
+      </w:r>
+      <w:r>
+        <w:t xml:space="preserve"> of TP</w:t>
+      </w:r>
+      <w:r>
+        <w:t xml:space="preserve"> </w:t>
+      </w:r>
+      <w:r>
+        <w:t>(mean 0.16</w:t>
+      </w:r>
+      <w:r>
+        <w:t>±0.15</w:t>
+      </w:r>
+      <w:r>
+        <w:t xml:space="preserve"> mg/L) </w:t>
+      </w:r>
+      <w:r>
+        <w:t>were</w:t>
+      </w:r>
+      <w:r>
+        <w:t xml:space="preserve"> significantly</w:t>
+      </w:r>
+      <w:r>
+        <w:t xml:space="preserve"> </w:t>
+      </w:r>
+      <w:r>
+        <w:t>lower</w:t>
+      </w:r>
+      <w:r>
+        <w:t xml:space="preserve"> than </w:t>
+      </w:r>
+      <w:r>
+        <w:t xml:space="preserve">during </w:t>
+      </w:r>
+      <w:r>
+        <w:t xml:space="preserve">months with </w:t>
+      </w:r>
+      <w:r>
+        <w:t>net retention of TP (</w:t>
+      </w:r>
+      <w:r>
+        <w:t>mean 0.39</w:t>
+      </w:r>
+      <w:r>
+        <w:t>±0.</w:t>
+      </w:r>
+      <w:proofErr w:type="gramStart"/>
+      <w:r>
+        <w:t>40</w:t>
+      </w:r>
+      <w:r>
+        <w:t xml:space="preserve"> </w:t>
+      </w:r>
+      <w:r>
+        <w:t xml:space="preserve"> mg</w:t>
+      </w:r>
+      <w:proofErr w:type="gramEnd"/>
+      <w:r>
+        <w:t xml:space="preserve">/L; </w:t>
+      </w:r>
+      <w:r>
+        <w:t>Welch Two-Sample t-test, t = 7.4, p &lt; 0.01)</w:t>
+      </w:r>
+      <w:r>
         <w:t xml:space="preserve">. </w:t>
       </w:r>
       <w:r>
-        <w:lastRenderedPageBreak/>
-        <w:t xml:space="preserve">Inflowing TP concentration during </w:t>
-      </w:r>
-      <w:r>
-        <w:t xml:space="preserve">months with net </w:t>
-      </w:r>
-      <w:r>
-        <w:t>releases</w:t>
-      </w:r>
-      <w:r>
-        <w:t xml:space="preserve"> of TP</w:t>
-      </w:r>
-      <w:r>
-        <w:t xml:space="preserve"> </w:t>
-      </w:r>
-      <w:r>
-        <w:t>(mean 0.16</w:t>
-      </w:r>
-      <w:r>
-        <w:t>±0.15</w:t>
-      </w:r>
-      <w:r>
-        <w:t xml:space="preserve"> mg/L) </w:t>
-      </w:r>
-      <w:r>
-        <w:t>were</w:t>
-      </w:r>
-      <w:r>
-        <w:t xml:space="preserve"> significantly</w:t>
-      </w:r>
-      <w:r>
-        <w:t xml:space="preserve"> </w:t>
-      </w:r>
-      <w:r>
-        <w:t>lower</w:t>
-      </w:r>
-      <w:r>
-        <w:t xml:space="preserve"> than </w:t>
-      </w:r>
-      <w:r>
-        <w:t xml:space="preserve">during </w:t>
-      </w:r>
-      <w:r>
-        <w:t xml:space="preserve">months with </w:t>
-      </w:r>
-      <w:r>
-        <w:t>net retention of TP (</w:t>
-      </w:r>
-      <w:r>
-        <w:t>mean 0.39</w:t>
-      </w:r>
-      <w:r>
-        <w:t>±0.</w:t>
-      </w:r>
-      <w:r>
-        <w:t>40</w:t>
-      </w:r>
-      <w:r>
-        <w:t xml:space="preserve"> </w:t>
-      </w:r>
-      <w:r>
-        <w:t xml:space="preserve"> mg/L; </w:t>
-      </w:r>
-      <w:r>
-        <w:t>Welch Two-Sample t-test, t = 7.4, p &lt; 0.01)</w:t>
-      </w:r>
-      <w:r>
-        <w:t xml:space="preserve">. </w:t>
-      </w:r>
-      <w:r>
         <w:t>Inflowing T</w:t>
       </w:r>
       <w:r>
@@ -4478,10 +4714,18 @@
         <w:t>±</w:t>
       </w:r>
       <w:r>
-        <w:t>4.78</w:t>
-      </w:r>
-      <w:r>
-        <w:t xml:space="preserve">  mg/L; Welch Two-Sample t-test, t = 7.</w:t>
+        <w:t>4.</w:t>
+      </w:r>
+      <w:proofErr w:type="gramStart"/>
+      <w:r>
+        <w:t>78</w:t>
+      </w:r>
+      <w:r>
+        <w:t xml:space="preserve">  mg</w:t>
+      </w:r>
+      <w:proofErr w:type="gramEnd"/>
+      <w:r>
+        <w:t>/L; Welch Two-Sample t-test, t = 7.</w:t>
       </w:r>
       <w:r>
         <w:t>9</w:t>
@@ -4490,7 +4734,6 @@
         <w:t>, p &lt; 0.01).</w:t>
       </w:r>
     </w:p>
-    <w:p/>
     <w:p>
       <w:pPr>
         <w:rPr>

</xml_diff>